<commit_message>
updated conclusion and formatting
</commit_message>
<xml_diff>
--- a/reports/HC_Parcel_Sales_Prediction.docx
+++ b/reports/HC_Parcel_Sales_Prediction.docx
@@ -2,43 +2,917 @@
 <file path=word/document.xml><?xml version="1.0" encoding="utf-8"?>
 <w:document xmlns:wpc="http://schemas.microsoft.com/office/word/2010/wordprocessingCanvas" xmlns:cx="http://schemas.microsoft.com/office/drawing/2014/chartex" xmlns:cx1="http://schemas.microsoft.com/office/drawing/2015/9/8/chartex" xmlns:cx2="http://schemas.microsoft.com/office/drawing/2015/10/21/chartex" xmlns:cx3="http://schemas.microsoft.com/office/drawing/2016/5/9/chartex" xmlns:cx4="http://schemas.microsoft.com/office/drawing/2016/5/10/chartex" xmlns:cx5="http://schemas.microsoft.com/office/drawing/2016/5/11/chartex" xmlns:cx6="http://schemas.microsoft.com/office/drawing/2016/5/12/chartex" xmlns:cx7="http://schemas.microsoft.com/office/drawing/2016/5/13/chartex" xmlns:cx8="http://schemas.microsoft.com/office/drawing/2016/5/14/chartex" xmlns:mc="http://schemas.openxmlformats.org/markup-compatibility/2006" xmlns:aink="http://schemas.microsoft.com/office/drawing/2016/ink" xmlns:am3d="http://schemas.microsoft.com/office/drawing/2017/model3d" xmlns:o="urn:schemas-microsoft-com:office:office" xmlns:oel="http://schemas.microsoft.com/office/2019/extlst" xmlns:r="http://schemas.openxmlformats.org/officeDocument/2006/relationships" xmlns:m="http://schemas.openxmlformats.org/officeDocument/2006/math" xmlns:v="urn:schemas-microsoft-com:vml" xmlns:wp14="http://schemas.microsoft.com/office/word/2010/wordprocessingDrawing" xmlns:wp="http://schemas.openxmlformats.org/drawingml/2006/wordprocessingDrawing" xmlns:w10="urn:schemas-microsoft-com:office:word" xmlns:w="http://schemas.openxmlformats.org/wordprocessingml/2006/main" xmlns:w14="http://schemas.microsoft.com/office/word/2010/wordml" xmlns:w15="http://schemas.microsoft.com/office/word/2012/wordml" xmlns:w16cex="http://schemas.microsoft.com/office/word/2018/wordml/cex" xmlns:w16cid="http://schemas.microsoft.com/office/word/2016/wordml/cid" xmlns:w16="http://schemas.microsoft.com/office/word/2018/wordml" xmlns:w16du="http://schemas.microsoft.com/office/word/2023/wordml/word16du" xmlns:w16sdtdh="http://schemas.microsoft.com/office/word/2020/wordml/sdtdatahash" xmlns:w16sdtfl="http://schemas.microsoft.com/office/word/2024/wordml/sdtformatlock" xmlns:w16se="http://schemas.microsoft.com/office/word/2015/wordml/symex" xmlns:wpg="http://schemas.microsoft.com/office/word/2010/wordprocessingGroup" xmlns:wpi="http://schemas.microsoft.com/office/word/2010/wordprocessingInk" xmlns:wne="http://schemas.microsoft.com/office/word/2006/wordml" xmlns:wps="http://schemas.microsoft.com/office/word/2010/wordprocessingShape" mc:Ignorable="w14 w15 w16se w16cid w16 w16cex w16sdtdh w16sdtfl w16du wp14">
   <w:body>
+    <w:sdt>
+      <w:sdtPr>
+        <w:id w:val="780149546"/>
+        <w:docPartObj>
+          <w:docPartGallery w:val="Cover Pages"/>
+          <w:docPartUnique/>
+        </w:docPartObj>
+      </w:sdtPr>
+      <w:sdtContent>
+        <w:p/>
+        <w:p>
+          <w:pPr>
+            <w:rPr>
+              <w:rFonts w:asciiTheme="majorHAnsi" w:eastAsiaTheme="majorEastAsia" w:hAnsiTheme="majorHAnsi" w:cstheme="majorBidi"/>
+              <w:spacing w:val="-10"/>
+              <w:kern w:val="28"/>
+              <w:sz w:val="56"/>
+              <w:szCs w:val="56"/>
+            </w:rPr>
+          </w:pPr>
+          <w:r>
+            <w:rPr>
+              <w:noProof/>
+              <w:lang w:eastAsia="zh-CN"/>
+            </w:rPr>
+            <mc:AlternateContent>
+              <mc:Choice Requires="wps">
+                <w:drawing>
+                  <wp:anchor distT="0" distB="0" distL="114300" distR="114300" simplePos="0" relativeHeight="251662336" behindDoc="0" locked="0" layoutInCell="1" allowOverlap="1" wp14:anchorId="6F01A8CA" wp14:editId="2DB545A5">
+                    <wp:simplePos x="0" y="0"/>
+                    <mc:AlternateContent>
+                      <mc:Choice Requires="wp14">
+                        <wp:positionH relativeFrom="page">
+                          <wp14:pctPosHOffset>15000</wp14:pctPosHOffset>
+                        </wp:positionH>
+                      </mc:Choice>
+                      <mc:Fallback>
+                        <wp:positionH relativeFrom="page">
+                          <wp:posOffset>1165860</wp:posOffset>
+                        </wp:positionH>
+                      </mc:Fallback>
+                    </mc:AlternateContent>
+                    <mc:AlternateContent>
+                      <mc:Choice Requires="wp14">
+                        <wp:positionV relativeFrom="page">
+                          <wp14:pctPosVOffset>9100</wp14:pctPosVOffset>
+                        </wp:positionV>
+                      </mc:Choice>
+                      <mc:Fallback>
+                        <wp:positionV relativeFrom="page">
+                          <wp:posOffset>915035</wp:posOffset>
+                        </wp:positionV>
+                      </mc:Fallback>
+                    </mc:AlternateContent>
+                    <wp:extent cx="3660775" cy="3651250"/>
+                    <wp:effectExtent l="0" t="0" r="10160" b="7620"/>
+                    <wp:wrapSquare wrapText="bothSides"/>
+                    <wp:docPr id="111" name="Text Box 91"/>
+                    <wp:cNvGraphicFramePr/>
+                    <a:graphic xmlns:a="http://schemas.openxmlformats.org/drawingml/2006/main">
+                      <a:graphicData uri="http://schemas.microsoft.com/office/word/2010/wordprocessingShape">
+                        <wps:wsp>
+                          <wps:cNvSpPr txBox="1"/>
+                          <wps:spPr>
+                            <a:xfrm>
+                              <a:off x="0" y="0"/>
+                              <a:ext cx="3660775" cy="3651250"/>
+                            </a:xfrm>
+                            <a:prstGeom prst="rect">
+                              <a:avLst/>
+                            </a:prstGeom>
+                            <a:noFill/>
+                            <a:ln w="6350">
+                              <a:noFill/>
+                            </a:ln>
+                            <a:effectLst/>
+                          </wps:spPr>
+                          <wps:style>
+                            <a:lnRef idx="0">
+                              <a:schemeClr val="accent1"/>
+                            </a:lnRef>
+                            <a:fillRef idx="0">
+                              <a:schemeClr val="accent1"/>
+                            </a:fillRef>
+                            <a:effectRef idx="0">
+                              <a:schemeClr val="accent1"/>
+                            </a:effectRef>
+                            <a:fontRef idx="minor">
+                              <a:schemeClr val="dk1"/>
+                            </a:fontRef>
+                          </wps:style>
+                          <wps:txbx>
+                            <w:txbxContent>
+                              <w:sdt>
+                                <w:sdtPr>
+                                  <w:rPr>
+                                    <w:caps/>
+                                    <w:color w:val="0A1D30" w:themeColor="text2" w:themeShade="BF"/>
+                                    <w:sz w:val="40"/>
+                                    <w:szCs w:val="40"/>
+                                  </w:rPr>
+                                  <w:alias w:val="Publish Date"/>
+                                  <w:tag w:val=""/>
+                                  <w:id w:val="400952559"/>
+                                  <w:dataBinding w:prefixMappings="xmlns:ns0='http://schemas.microsoft.com/office/2006/coverPageProps' " w:xpath="/ns0:CoverPageProperties[1]/ns0:PublishDate[1]" w:storeItemID="{55AF091B-3C7A-41E3-B477-F2FDAA23CFDA}"/>
+                                  <w:date w:fullDate="2025-07-02T00:00:00Z">
+                                    <w:dateFormat w:val="MMMM d, yyyy"/>
+                                    <w:lid w:val="en-US"/>
+                                    <w:storeMappedDataAs w:val="dateTime"/>
+                                    <w:calendar w:val="gregorian"/>
+                                  </w:date>
+                                </w:sdtPr>
+                                <w:sdtContent>
+                                  <w:p>
+                                    <w:pPr>
+                                      <w:pStyle w:val="NoSpacing"/>
+                                      <w:jc w:val="right"/>
+                                      <w:rPr>
+                                        <w:caps/>
+                                        <w:color w:val="0A1D30" w:themeColor="text2" w:themeShade="BF"/>
+                                        <w:sz w:val="40"/>
+                                        <w:szCs w:val="40"/>
+                                      </w:rPr>
+                                    </w:pPr>
+                                    <w:r>
+                                      <w:rPr>
+                                        <w:caps/>
+                                        <w:color w:val="0A1D30" w:themeColor="text2" w:themeShade="BF"/>
+                                        <w:sz w:val="40"/>
+                                        <w:szCs w:val="40"/>
+                                      </w:rPr>
+                                      <w:t>July 2, 2025</w:t>
+                                    </w:r>
+                                  </w:p>
+                                </w:sdtContent>
+                              </w:sdt>
+                            </w:txbxContent>
+                          </wps:txbx>
+                          <wps:bodyPr rot="0" spcFirstLastPara="0" vertOverflow="overflow" horzOverflow="overflow" vert="horz" wrap="square" lIns="0" tIns="0" rIns="0" bIns="0" numCol="1" spcCol="0" rtlCol="0" fromWordArt="0" anchor="b" anchorCtr="0" forceAA="0" compatLnSpc="1">
+                            <a:prstTxWarp prst="textNoShape">
+                              <a:avLst/>
+                            </a:prstTxWarp>
+                            <a:spAutoFit/>
+                          </wps:bodyPr>
+                        </wps:wsp>
+                      </a:graphicData>
+                    </a:graphic>
+                    <wp14:sizeRelH relativeFrom="page">
+                      <wp14:pctWidth>73400</wp14:pctWidth>
+                    </wp14:sizeRelH>
+                    <wp14:sizeRelV relativeFrom="page">
+                      <wp14:pctHeight>36300</wp14:pctHeight>
+                    </wp14:sizeRelV>
+                  </wp:anchor>
+                </w:drawing>
+              </mc:Choice>
+              <mc:Fallback>
+                <w:pict>
+                  <v:shapetype w14:anchorId="6F01A8CA" id="_x0000_t202" coordsize="21600,21600" o:spt="202" path="m,l,21600r21600,l21600,xe">
+                    <v:stroke joinstyle="miter"/>
+                    <v:path gradientshapeok="t" o:connecttype="rect"/>
+                  </v:shapetype>
+                  <v:shape id="Text Box 91" o:spid="_x0000_s1026" type="#_x0000_t202" style="position:absolute;margin-left:0;margin-top:0;width:288.25pt;height:287.5pt;z-index:251662336;visibility:visible;mso-wrap-style:square;mso-width-percent:734;mso-height-percent:363;mso-left-percent:150;mso-top-percent:91;mso-wrap-distance-left:9pt;mso-wrap-distance-top:0;mso-wrap-distance-right:9pt;mso-wrap-distance-bottom:0;mso-position-horizontal-relative:page;mso-position-vertical-relative:page;mso-width-percent:734;mso-height-percent:363;mso-left-percent:150;mso-top-percent:91;mso-width-relative:page;mso-height-relative:page;v-text-anchor:bottom" o:gfxdata="UEsDBBQABgAIAAAAIQC2gziS/gAAAOEBAAATAAAAW0NvbnRlbnRfVHlwZXNdLnhtbJSRQU7DMBBF&#13;&#10;90jcwfIWJU67QAgl6YK0S0CoHGBkTxKLZGx5TGhvj5O2G0SRWNoz/78nu9wcxkFMGNg6quQqL6RA&#13;&#10;0s5Y6ir5vt9lD1JwBDIwOMJKHpHlpr69KfdHjyxSmriSfYz+USnWPY7AufNIadK6MEJMx9ApD/oD&#13;&#10;OlTrorhX2lFEilmcO2RdNtjC5xDF9pCuTyYBB5bi6bQ4syoJ3g9WQ0ymaiLzg5KdCXlKLjvcW893&#13;&#10;SUOqXwnz5DrgnHtJTxOsQfEKIT7DmDSUCaxw7Rqn8787ZsmRM9e2VmPeBN4uqYvTtW7jvijg9N/y&#13;&#10;JsXecLq0q+WD6m8AAAD//wMAUEsDBBQABgAIAAAAIQA4/SH/1gAAAJQBAAALAAAAX3JlbHMvLnJl&#13;&#10;bHOkkMFqwzAMhu+DvYPRfXGawxijTi+j0GvpHsDYimMaW0Yy2fr2M4PBMnrbUb/Q94l/f/hMi1qR&#13;&#10;JVI2sOt6UJgd+ZiDgffL8ekFlFSbvV0oo4EbChzGx4f9GRdb25HMsYhqlCwG5lrLq9biZkxWOiqY&#13;&#10;22YiTra2kYMu1l1tQD30/bPm3wwYN0x18gb45AdQl1tp5j/sFB2T0FQ7R0nTNEV3j6o9feQzro1i&#13;&#10;OWA14Fm+Q8a1a8+Bvu/d/dMb2JY5uiPbhG/ktn4cqGU/er3pcvwCAAD//wMAUEsDBBQABgAIAAAA&#13;&#10;IQA+jbuQXwIAAC4FAAAOAAAAZHJzL2Uyb0RvYy54bWysVN9P2zAQfp+0/8Hy+0gLokxRU9SBmCYh&#13;&#10;QCsTz65j02i2zzu7Tbq/fmcnaRnbC9NenIvv93ffeX7ZWcN2CkMDruLTkwlnykmoG/dc8W+PNx8+&#13;&#10;chaicLUw4FTF9yrwy8X7d/PWl+oUNmBqhYyCuFC2vuKbGH1ZFEFulBXhBLxypNSAVkT6xeeiRtFS&#13;&#10;dGuK08lkVrSAtUeQKgS6ve6VfJHja61kvNc6qMhMxam2mE/M5zqdxWIuymcUftPIoQzxD1VY0ThK&#13;&#10;egh1LaJgW2z+CGUbiRBAxxMJtgCtG6lyD9TNdPKqm9VGeJV7IXCCP8AU/l9Yebdb+QdksfsEHQ0w&#13;&#10;AdL6UAa6TP10Gm36UqWM9ATh/gCb6iKTdHk2m00uLs45k6Q7m51PT88zsMXR3WOInxVYloSKI80l&#13;&#10;wyV2tyFSSjIdTVI2BzeNMXk2xrG24rMzCvmbhjyMSzcqT3kIcyw9S3FvVLIx7qvSrKlzB+ki80td&#13;&#10;GWQ7QcwQUioXc/M5LlknK01FvMVxsD9W9Rbnvo8xM7h4cLaNA8zdvyq7/j6WrHt7AvJF30mM3bob&#13;&#10;RrqGek+TRuiXIHh509A0bkWIDwKJ9TRc2uR4T4c2QKjDIHG2Afz5t/tkT2QkLWctbVHFw4+tQMWZ&#13;&#10;+eKIpmnlRgFHYT0KbmuvgOCf0hvhZRbJAaMZRY1gn2jBlykLqYSTlKvi61G8iv0u0wMh1XKZjWix&#13;&#10;vIi3buVlCp2mkbj12D0J9AMBI3H3Dsb9EuUrHva2mSh+uY3ExkzSBGiP4gA0LWXm7vCApK1/+Z+t&#13;&#10;js/c4hcAAAD//wMAUEsDBBQABgAIAAAAIQDOWP604QAAAAoBAAAPAAAAZHJzL2Rvd25yZXYueG1s&#13;&#10;TI9BT8MwDIXvSPyHyEhcEEs3yGBd0wkxTRrjxEAgbmlj2orGqZpsK/9+Hhe4PNl68vP7ssXgWrHH&#13;&#10;PjSeNIxHCQik0tuGKg1vr6vrexAhGrKm9YQafjDAIj8/y0xq/YFecL+NleAQCqnRUMfYpVKGskZn&#13;&#10;wsh3SOx9+d6ZyGtfSdubA4e7Vk6SZCqdaYg/1KbDxxrL7+3OabjdvOPVsrhZfaqN+liPJ7P189NM&#13;&#10;68uLYTlneZiDiDjEvws4MXB/yLlY4Xdkg2g1ME38VfbU3VSBKE6DSkDmmfyPkB8BAAD//wMAUEsB&#13;&#10;Ai0AFAAGAAgAAAAhALaDOJL+AAAA4QEAABMAAAAAAAAAAAAAAAAAAAAAAFtDb250ZW50X1R5cGVz&#13;&#10;XS54bWxQSwECLQAUAAYACAAAACEAOP0h/9YAAACUAQAACwAAAAAAAAAAAAAAAAAvAQAAX3JlbHMv&#13;&#10;LnJlbHNQSwECLQAUAAYACAAAACEAPo27kF8CAAAuBQAADgAAAAAAAAAAAAAAAAAuAgAAZHJzL2Uy&#13;&#10;b0RvYy54bWxQSwECLQAUAAYACAAAACEAzlj+tOEAAAAKAQAADwAAAAAAAAAAAAAAAAC5BAAAZHJz&#13;&#10;L2Rvd25yZXYueG1sUEsFBgAAAAAEAAQA8wAAAMcFAAAAAA==&#13;&#10;" filled="f" stroked="f" strokeweight=".5pt">
+                    <v:textbox style="mso-fit-shape-to-text:t" inset="0,0,0,0">
+                      <w:txbxContent>
+                        <w:sdt>
+                          <w:sdtPr>
+                            <w:rPr>
+                              <w:caps/>
+                              <w:color w:val="0A1D30" w:themeColor="text2" w:themeShade="BF"/>
+                              <w:sz w:val="40"/>
+                              <w:szCs w:val="40"/>
+                            </w:rPr>
+                            <w:alias w:val="Publish Date"/>
+                            <w:tag w:val=""/>
+                            <w:id w:val="400952559"/>
+                            <w:dataBinding w:prefixMappings="xmlns:ns0='http://schemas.microsoft.com/office/2006/coverPageProps' " w:xpath="/ns0:CoverPageProperties[1]/ns0:PublishDate[1]" w:storeItemID="{55AF091B-3C7A-41E3-B477-F2FDAA23CFDA}"/>
+                            <w:date w:fullDate="2025-07-02T00:00:00Z">
+                              <w:dateFormat w:val="MMMM d, yyyy"/>
+                              <w:lid w:val="en-US"/>
+                              <w:storeMappedDataAs w:val="dateTime"/>
+                              <w:calendar w:val="gregorian"/>
+                            </w:date>
+                          </w:sdtPr>
+                          <w:sdtContent>
+                            <w:p>
+                              <w:pPr>
+                                <w:pStyle w:val="NoSpacing"/>
+                                <w:jc w:val="right"/>
+                                <w:rPr>
+                                  <w:caps/>
+                                  <w:color w:val="0A1D30" w:themeColor="text2" w:themeShade="BF"/>
+                                  <w:sz w:val="40"/>
+                                  <w:szCs w:val="40"/>
+                                </w:rPr>
+                              </w:pPr>
+                              <w:r>
+                                <w:rPr>
+                                  <w:caps/>
+                                  <w:color w:val="0A1D30" w:themeColor="text2" w:themeShade="BF"/>
+                                  <w:sz w:val="40"/>
+                                  <w:szCs w:val="40"/>
+                                </w:rPr>
+                                <w:t>July 2, 2025</w:t>
+                              </w:r>
+                            </w:p>
+                          </w:sdtContent>
+                        </w:sdt>
+                      </w:txbxContent>
+                    </v:textbox>
+                    <w10:wrap type="square" anchorx="page" anchory="page"/>
+                  </v:shape>
+                </w:pict>
+              </mc:Fallback>
+            </mc:AlternateContent>
+          </w:r>
+          <w:r>
+            <w:rPr>
+              <w:noProof/>
+              <w:lang w:eastAsia="zh-CN"/>
+            </w:rPr>
+            <mc:AlternateContent>
+              <mc:Choice Requires="wps">
+                <w:drawing>
+                  <wp:anchor distT="0" distB="0" distL="114300" distR="114300" simplePos="0" relativeHeight="251661312" behindDoc="0" locked="0" layoutInCell="1" allowOverlap="1" wp14:anchorId="1E3D92F3" wp14:editId="1AE2AC2C">
+                    <wp:simplePos x="0" y="0"/>
+                    <mc:AlternateContent>
+                      <mc:Choice Requires="wp14">
+                        <wp:positionH relativeFrom="page">
+                          <wp14:pctPosHOffset>15000</wp14:pctPosHOffset>
+                        </wp:positionH>
+                      </mc:Choice>
+                      <mc:Fallback>
+                        <wp:positionH relativeFrom="page">
+                          <wp:posOffset>1165860</wp:posOffset>
+                        </wp:positionH>
+                      </mc:Fallback>
+                    </mc:AlternateContent>
+                    <mc:AlternateContent>
+                      <mc:Choice Requires="wp14">
+                        <wp:positionV relativeFrom="page">
+                          <wp14:pctPosVOffset>83700</wp14:pctPosVOffset>
+                        </wp:positionV>
+                      </mc:Choice>
+                      <mc:Fallback>
+                        <wp:positionV relativeFrom="page">
+                          <wp:posOffset>8418830</wp:posOffset>
+                        </wp:positionV>
+                      </mc:Fallback>
+                    </mc:AlternateContent>
+                    <wp:extent cx="5753100" cy="652780"/>
+                    <wp:effectExtent l="0" t="0" r="0" b="8255"/>
+                    <wp:wrapSquare wrapText="bothSides"/>
+                    <wp:docPr id="112" name="Text Box 93"/>
+                    <wp:cNvGraphicFramePr/>
+                    <a:graphic xmlns:a="http://schemas.openxmlformats.org/drawingml/2006/main">
+                      <a:graphicData uri="http://schemas.microsoft.com/office/word/2010/wordprocessingShape">
+                        <wps:wsp>
+                          <wps:cNvSpPr txBox="1"/>
+                          <wps:spPr>
+                            <a:xfrm>
+                              <a:off x="0" y="0"/>
+                              <a:ext cx="5753100" cy="652780"/>
+                            </a:xfrm>
+                            <a:prstGeom prst="rect">
+                              <a:avLst/>
+                            </a:prstGeom>
+                            <a:noFill/>
+                            <a:ln w="6350">
+                              <a:noFill/>
+                            </a:ln>
+                            <a:effectLst/>
+                          </wps:spPr>
+                          <wps:style>
+                            <a:lnRef idx="0">
+                              <a:schemeClr val="accent1"/>
+                            </a:lnRef>
+                            <a:fillRef idx="0">
+                              <a:schemeClr val="accent1"/>
+                            </a:fillRef>
+                            <a:effectRef idx="0">
+                              <a:schemeClr val="accent1"/>
+                            </a:effectRef>
+                            <a:fontRef idx="minor">
+                              <a:schemeClr val="dk1"/>
+                            </a:fontRef>
+                          </wps:style>
+                          <wps:txbx>
+                            <w:txbxContent>
+                              <w:sdt>
+                                <w:sdtPr>
+                                  <w:rPr>
+                                    <w:caps/>
+                                    <w:color w:val="262626" w:themeColor="text1" w:themeTint="D9"/>
+                                    <w:sz w:val="28"/>
+                                    <w:szCs w:val="28"/>
+                                  </w:rPr>
+                                  <w:alias w:val="Author"/>
+                                  <w:tag w:val=""/>
+                                  <w:id w:val="1901796142"/>
+                                  <w:dataBinding w:prefixMappings="xmlns:ns0='http://purl.org/dc/elements/1.1/' xmlns:ns1='http://schemas.openxmlformats.org/package/2006/metadata/core-properties' " w:xpath="/ns1:coreProperties[1]/ns0:creator[1]" w:storeItemID="{6C3C8BC8-F283-45AE-878A-BAB7291924A1}"/>
+                                  <w:text/>
+                                </w:sdtPr>
+                                <w:sdtContent>
+                                  <w:p>
+                                    <w:pPr>
+                                      <w:pStyle w:val="NoSpacing"/>
+                                      <w:jc w:val="right"/>
+                                      <w:rPr>
+                                        <w:caps/>
+                                        <w:color w:val="262626" w:themeColor="text1" w:themeTint="D9"/>
+                                        <w:sz w:val="28"/>
+                                        <w:szCs w:val="28"/>
+                                      </w:rPr>
+                                    </w:pPr>
+                                    <w:r>
+                                      <w:rPr>
+                                        <w:caps/>
+                                        <w:color w:val="262626" w:themeColor="text1" w:themeTint="D9"/>
+                                        <w:sz w:val="28"/>
+                                        <w:szCs w:val="28"/>
+                                      </w:rPr>
+                                      <w:t>Fethe, Bo J</w:t>
+                                    </w:r>
+                                  </w:p>
+                                </w:sdtContent>
+                              </w:sdt>
+                              <w:p>
+                                <w:pPr>
+                                  <w:pStyle w:val="NoSpacing"/>
+                                  <w:jc w:val="right"/>
+                                  <w:rPr>
+                                    <w:caps/>
+                                    <w:color w:val="262626" w:themeColor="text1" w:themeTint="D9"/>
+                                    <w:sz w:val="20"/>
+                                    <w:szCs w:val="20"/>
+                                  </w:rPr>
+                                </w:pPr>
+                                <w:sdt>
+                                  <w:sdtPr>
+                                    <w:rPr>
+                                      <w:caps/>
+                                      <w:color w:val="262626" w:themeColor="text1" w:themeTint="D9"/>
+                                      <w:sz w:val="20"/>
+                                      <w:szCs w:val="20"/>
+                                    </w:rPr>
+                                    <w:alias w:val="Company"/>
+                                    <w:tag w:val=""/>
+                                    <w:id w:val="-661235724"/>
+                                    <w:dataBinding w:prefixMappings="xmlns:ns0='http://schemas.openxmlformats.org/officeDocument/2006/extended-properties' " w:xpath="/ns0:Properties[1]/ns0:Company[1]" w:storeItemID="{6668398D-A668-4E3E-A5EB-62B293D839F1}"/>
+                                    <w:text/>
+                                  </w:sdtPr>
+                                  <w:sdtContent>
+                                    <w:r>
+                                      <w:rPr>
+                                        <w:caps/>
+                                        <w:color w:val="262626" w:themeColor="text1" w:themeTint="D9"/>
+                                        <w:sz w:val="20"/>
+                                        <w:szCs w:val="20"/>
+                                      </w:rPr>
+                                      <w:t>Georgia Institute of Technology</w:t>
+                                    </w:r>
+                                  </w:sdtContent>
+                                </w:sdt>
+                              </w:p>
+                              <w:p>
+                                <w:pPr>
+                                  <w:pStyle w:val="NoSpacing"/>
+                                  <w:jc w:val="right"/>
+                                  <w:rPr>
+                                    <w:caps/>
+                                    <w:color w:val="262626" w:themeColor="text1" w:themeTint="D9"/>
+                                    <w:sz w:val="20"/>
+                                    <w:szCs w:val="20"/>
+                                  </w:rPr>
+                                </w:pPr>
+                                <w:sdt>
+                                  <w:sdtPr>
+                                    <w:rPr>
+                                      <w:color w:val="262626" w:themeColor="text1" w:themeTint="D9"/>
+                                      <w:sz w:val="20"/>
+                                      <w:szCs w:val="20"/>
+                                    </w:rPr>
+                                    <w:alias w:val="Address"/>
+                                    <w:tag w:val=""/>
+                                    <w:id w:val="171227497"/>
+                                    <w:dataBinding w:prefixMappings="xmlns:ns0='http://schemas.microsoft.com/office/2006/coverPageProps' " w:xpath="/ns0:CoverPageProperties[1]/ns0:CompanyAddress[1]" w:storeItemID="{55AF091B-3C7A-41E3-B477-F2FDAA23CFDA}"/>
+                                    <w:text/>
+                                  </w:sdtPr>
+                                  <w:sdtContent>
+                                    <w:r>
+                                      <w:rPr>
+                                        <w:color w:val="262626" w:themeColor="text1" w:themeTint="D9"/>
+                                        <w:sz w:val="20"/>
+                                        <w:szCs w:val="20"/>
+                                      </w:rPr>
+                                      <w:t>bfethe3@gatech.edu</w:t>
+                                    </w:r>
+                                  </w:sdtContent>
+                                </w:sdt>
+                                <w:r>
+                                  <w:rPr>
+                                    <w:color w:val="262626" w:themeColor="text1" w:themeTint="D9"/>
+                                    <w:sz w:val="20"/>
+                                    <w:szCs w:val="20"/>
+                                  </w:rPr>
+                                  <w:t xml:space="preserve"> </w:t>
+                                </w:r>
+                              </w:p>
+                            </w:txbxContent>
+                          </wps:txbx>
+                          <wps:bodyPr rot="0" spcFirstLastPara="0" vertOverflow="overflow" horzOverflow="overflow" vert="horz" wrap="square" lIns="0" tIns="0" rIns="0" bIns="0" numCol="1" spcCol="0" rtlCol="0" fromWordArt="0" anchor="b" anchorCtr="0" forceAA="0" compatLnSpc="1">
+                            <a:prstTxWarp prst="textNoShape">
+                              <a:avLst/>
+                            </a:prstTxWarp>
+                            <a:noAutofit/>
+                          </wps:bodyPr>
+                        </wps:wsp>
+                      </a:graphicData>
+                    </a:graphic>
+                    <wp14:sizeRelH relativeFrom="page">
+                      <wp14:pctWidth>73400</wp14:pctWidth>
+                    </wp14:sizeRelH>
+                    <wp14:sizeRelV relativeFrom="page">
+                      <wp14:pctHeight>8000</wp14:pctHeight>
+                    </wp14:sizeRelV>
+                  </wp:anchor>
+                </w:drawing>
+              </mc:Choice>
+              <mc:Fallback>
+                <w:pict>
+                  <v:shape w14:anchorId="1E3D92F3" id="Text Box 93" o:spid="_x0000_s1027" type="#_x0000_t202" style="position:absolute;margin-left:0;margin-top:0;width:453pt;height:51.4pt;z-index:251661312;visibility:visible;mso-wrap-style:square;mso-width-percent:734;mso-height-percent:80;mso-left-percent:150;mso-top-percent:837;mso-wrap-distance-left:9pt;mso-wrap-distance-top:0;mso-wrap-distance-right:9pt;mso-wrap-distance-bottom:0;mso-position-horizontal-relative:page;mso-position-vertical-relative:page;mso-width-percent:734;mso-height-percent:80;mso-left-percent:150;mso-top-percent:837;mso-width-relative:page;mso-height-relative:page;v-text-anchor:bottom" o:gfxdata="UEsDBBQABgAIAAAAIQC2gziS/gAAAOEBAAATAAAAW0NvbnRlbnRfVHlwZXNdLnhtbJSRQU7DMBBF&#13;&#10;90jcwfIWJU67QAgl6YK0S0CoHGBkTxKLZGx5TGhvj5O2G0SRWNoz/78nu9wcxkFMGNg6quQqL6RA&#13;&#10;0s5Y6ir5vt9lD1JwBDIwOMJKHpHlpr69KfdHjyxSmriSfYz+USnWPY7AufNIadK6MEJMx9ApD/oD&#13;&#10;OlTrorhX2lFEilmcO2RdNtjC5xDF9pCuTyYBB5bi6bQ4syoJ3g9WQ0ymaiLzg5KdCXlKLjvcW893&#13;&#10;SUOqXwnz5DrgnHtJTxOsQfEKIT7DmDSUCaxw7Rqn8787ZsmRM9e2VmPeBN4uqYvTtW7jvijg9N/y&#13;&#10;JsXecLq0q+WD6m8AAAD//wMAUEsDBBQABgAIAAAAIQA4/SH/1gAAAJQBAAALAAAAX3JlbHMvLnJl&#13;&#10;bHOkkMFqwzAMhu+DvYPRfXGawxijTi+j0GvpHsDYimMaW0Yy2fr2M4PBMnrbUb/Q94l/f/hMi1qR&#13;&#10;JVI2sOt6UJgd+ZiDgffL8ekFlFSbvV0oo4EbChzGx4f9GRdb25HMsYhqlCwG5lrLq9biZkxWOiqY&#13;&#10;22YiTra2kYMu1l1tQD30/bPm3wwYN0x18gb45AdQl1tp5j/sFB2T0FQ7R0nTNEV3j6o9feQzro1i&#13;&#10;OWA14Fm+Q8a1a8+Bvu/d/dMb2JY5uiPbhG/ktn4cqGU/er3pcvwCAAD//wMAUEsDBBQABgAIAAAA&#13;&#10;IQDNi8iNYQIAADQFAAAOAAAAZHJzL2Uyb0RvYy54bWysVE1v2zAMvQ/YfxB0X+ykSFsEdYqsRYcB&#13;&#10;QVusHXpWZCk2JosapcTOfv0o2U6KbpcOu8i0+Pj1SOrqumsM2yv0NdiCTyc5Z8pKKGu7Lfj357tP&#13;&#10;l5z5IGwpDFhV8IPy/Hr58cNV6xZqBhWYUiEjJ9YvWlfwKgS3yDIvK9UIPwGnLCk1YCMC/eI2K1G0&#13;&#10;5L0x2SzPz7MWsHQIUnlPt7e9ki+Tf62VDA9aexWYKTjlFtKJ6dzEM1teicUWhatqOaQh/iGLRtSW&#13;&#10;gh5d3Yog2A7rP1w1tUTwoMNEQpOB1rVUqQaqZpq/qeapEk6lWogc7440+f/nVt7vn9wjstB9ho4a&#13;&#10;GAlpnV94uoz1dBqb+KVMGemJwsORNtUFJulyfjE/m+akkqQ7n88uLhOv2cnaoQ9fFDQsCgVHakti&#13;&#10;S+zXPlBEgo6QGMzCXW1Mao2xrCWnZ/M8GRw1ZGFsxKrU5MHNKfMkhYNREWPsN6VZXaYC4kUaL3Vj&#13;&#10;kO0FDYaQUtmQak9+CR1RmpJ4j+GAP2X1HuO+jjEy2HA0bmoLmKp/k3b5Y0xZ93gi8lXdUQzdpqPC&#13;&#10;XzV2A+WB+o3Qr4J38q6mpqyFD48Cafapj7TP4YEObYDIh0HirAL89bf7iKeRJC1nLe1Swf3PnUDF&#13;&#10;mflqaVjj4o0CjsJmFOyuuQHqwpReCieTSAYYzChqhOaF1nwVo5BKWEmxCr4ZxZvQbzQ9E1KtVglE&#13;&#10;6+VEWNsnJ6Pr2JQ4Ys/di0A3zGGgCb6HccvE4s049thoaWG1C6DrNKuR157FgW9azTTCwzMSd//1&#13;&#10;f0KdHrvlbwAAAP//AwBQSwMEFAAGAAgAAAAhAGyG/mDaAAAACgEAAA8AAABkcnMvZG93bnJldi54&#13;&#10;bWxMT8tOwzAQvCPxD9YicaM2FVQljVNVLYQzhQ/YxtskaryOYrcJfD0LF7iMNJrdeeTryXfqQkNs&#13;&#10;A1u4nxlQxFVwLdcWPt5f7pagYkJ22AUmC58UYV1cX+WYuTDyG132qVZiwjFDC01KfaZ1rBryGGeh&#13;&#10;JxbtGAaPSehQazfgKOa+03NjFtpjy5LQYE/bhqrT/uwl5Gv3Wj4cN4+O8fTcbEs/mlBae3sz7VYC&#13;&#10;mxWoRFP6+4CfDdIfCil2CGd2UXUWZE36RdGezELoQY7MfAm6yPX/CcU3AAAA//8DAFBLAQItABQA&#13;&#10;BgAIAAAAIQC2gziS/gAAAOEBAAATAAAAAAAAAAAAAAAAAAAAAABbQ29udGVudF9UeXBlc10ueG1s&#13;&#10;UEsBAi0AFAAGAAgAAAAhADj9If/WAAAAlAEAAAsAAAAAAAAAAAAAAAAALwEAAF9yZWxzLy5yZWxz&#13;&#10;UEsBAi0AFAAGAAgAAAAhAM2LyI1hAgAANAUAAA4AAAAAAAAAAAAAAAAALgIAAGRycy9lMm9Eb2Mu&#13;&#10;eG1sUEsBAi0AFAAGAAgAAAAhAGyG/mDaAAAACgEAAA8AAAAAAAAAAAAAAAAAuwQAAGRycy9kb3du&#13;&#10;cmV2LnhtbFBLBQYAAAAABAAEAPMAAADCBQAAAAA=&#13;&#10;" filled="f" stroked="f" strokeweight=".5pt">
+                    <v:textbox inset="0,0,0,0">
+                      <w:txbxContent>
+                        <w:sdt>
+                          <w:sdtPr>
+                            <w:rPr>
+                              <w:caps/>
+                              <w:color w:val="262626" w:themeColor="text1" w:themeTint="D9"/>
+                              <w:sz w:val="28"/>
+                              <w:szCs w:val="28"/>
+                            </w:rPr>
+                            <w:alias w:val="Author"/>
+                            <w:tag w:val=""/>
+                            <w:id w:val="1901796142"/>
+                            <w:dataBinding w:prefixMappings="xmlns:ns0='http://purl.org/dc/elements/1.1/' xmlns:ns1='http://schemas.openxmlformats.org/package/2006/metadata/core-properties' " w:xpath="/ns1:coreProperties[1]/ns0:creator[1]" w:storeItemID="{6C3C8BC8-F283-45AE-878A-BAB7291924A1}"/>
+                            <w:text/>
+                          </w:sdtPr>
+                          <w:sdtContent>
+                            <w:p>
+                              <w:pPr>
+                                <w:pStyle w:val="NoSpacing"/>
+                                <w:jc w:val="right"/>
+                                <w:rPr>
+                                  <w:caps/>
+                                  <w:color w:val="262626" w:themeColor="text1" w:themeTint="D9"/>
+                                  <w:sz w:val="28"/>
+                                  <w:szCs w:val="28"/>
+                                </w:rPr>
+                              </w:pPr>
+                              <w:r>
+                                <w:rPr>
+                                  <w:caps/>
+                                  <w:color w:val="262626" w:themeColor="text1" w:themeTint="D9"/>
+                                  <w:sz w:val="28"/>
+                                  <w:szCs w:val="28"/>
+                                </w:rPr>
+                                <w:t>Fethe, Bo J</w:t>
+                              </w:r>
+                            </w:p>
+                          </w:sdtContent>
+                        </w:sdt>
+                        <w:p>
+                          <w:pPr>
+                            <w:pStyle w:val="NoSpacing"/>
+                            <w:jc w:val="right"/>
+                            <w:rPr>
+                              <w:caps/>
+                              <w:color w:val="262626" w:themeColor="text1" w:themeTint="D9"/>
+                              <w:sz w:val="20"/>
+                              <w:szCs w:val="20"/>
+                            </w:rPr>
+                          </w:pPr>
+                          <w:sdt>
+                            <w:sdtPr>
+                              <w:rPr>
+                                <w:caps/>
+                                <w:color w:val="262626" w:themeColor="text1" w:themeTint="D9"/>
+                                <w:sz w:val="20"/>
+                                <w:szCs w:val="20"/>
+                              </w:rPr>
+                              <w:alias w:val="Company"/>
+                              <w:tag w:val=""/>
+                              <w:id w:val="-661235724"/>
+                              <w:dataBinding w:prefixMappings="xmlns:ns0='http://schemas.openxmlformats.org/officeDocument/2006/extended-properties' " w:xpath="/ns0:Properties[1]/ns0:Company[1]" w:storeItemID="{6668398D-A668-4E3E-A5EB-62B293D839F1}"/>
+                              <w:text/>
+                            </w:sdtPr>
+                            <w:sdtContent>
+                              <w:r>
+                                <w:rPr>
+                                  <w:caps/>
+                                  <w:color w:val="262626" w:themeColor="text1" w:themeTint="D9"/>
+                                  <w:sz w:val="20"/>
+                                  <w:szCs w:val="20"/>
+                                </w:rPr>
+                                <w:t>Georgia Institute of Technology</w:t>
+                              </w:r>
+                            </w:sdtContent>
+                          </w:sdt>
+                        </w:p>
+                        <w:p>
+                          <w:pPr>
+                            <w:pStyle w:val="NoSpacing"/>
+                            <w:jc w:val="right"/>
+                            <w:rPr>
+                              <w:caps/>
+                              <w:color w:val="262626" w:themeColor="text1" w:themeTint="D9"/>
+                              <w:sz w:val="20"/>
+                              <w:szCs w:val="20"/>
+                            </w:rPr>
+                          </w:pPr>
+                          <w:sdt>
+                            <w:sdtPr>
+                              <w:rPr>
+                                <w:color w:val="262626" w:themeColor="text1" w:themeTint="D9"/>
+                                <w:sz w:val="20"/>
+                                <w:szCs w:val="20"/>
+                              </w:rPr>
+                              <w:alias w:val="Address"/>
+                              <w:tag w:val=""/>
+                              <w:id w:val="171227497"/>
+                              <w:dataBinding w:prefixMappings="xmlns:ns0='http://schemas.microsoft.com/office/2006/coverPageProps' " w:xpath="/ns0:CoverPageProperties[1]/ns0:CompanyAddress[1]" w:storeItemID="{55AF091B-3C7A-41E3-B477-F2FDAA23CFDA}"/>
+                              <w:text/>
+                            </w:sdtPr>
+                            <w:sdtContent>
+                              <w:r>
+                                <w:rPr>
+                                  <w:color w:val="262626" w:themeColor="text1" w:themeTint="D9"/>
+                                  <w:sz w:val="20"/>
+                                  <w:szCs w:val="20"/>
+                                </w:rPr>
+                                <w:t>bfethe3@gatech.edu</w:t>
+                              </w:r>
+                            </w:sdtContent>
+                          </w:sdt>
+                          <w:r>
+                            <w:rPr>
+                              <w:color w:val="262626" w:themeColor="text1" w:themeTint="D9"/>
+                              <w:sz w:val="20"/>
+                              <w:szCs w:val="20"/>
+                            </w:rPr>
+                            <w:t xml:space="preserve"> </w:t>
+                          </w:r>
+                        </w:p>
+                      </w:txbxContent>
+                    </v:textbox>
+                    <w10:wrap type="square" anchorx="page" anchory="page"/>
+                  </v:shape>
+                </w:pict>
+              </mc:Fallback>
+            </mc:AlternateContent>
+          </w:r>
+          <w:r>
+            <w:rPr>
+              <w:noProof/>
+              <w:lang w:eastAsia="zh-CN"/>
+            </w:rPr>
+            <mc:AlternateContent>
+              <mc:Choice Requires="wps">
+                <w:drawing>
+                  <wp:anchor distT="0" distB="0" distL="114300" distR="114300" simplePos="0" relativeHeight="251660288" behindDoc="0" locked="0" layoutInCell="1" allowOverlap="1" wp14:anchorId="6AA423ED" wp14:editId="36032340">
+                    <wp:simplePos x="0" y="0"/>
+                    <mc:AlternateContent>
+                      <mc:Choice Requires="wp14">
+                        <wp:positionH relativeFrom="page">
+                          <wp14:pctPosHOffset>15000</wp14:pctPosHOffset>
+                        </wp:positionH>
+                      </mc:Choice>
+                      <mc:Fallback>
+                        <wp:positionH relativeFrom="page">
+                          <wp:posOffset>1165860</wp:posOffset>
+                        </wp:positionH>
+                      </mc:Fallback>
+                    </mc:AlternateContent>
+                    <mc:AlternateContent>
+                      <mc:Choice Requires="wp14">
+                        <wp:positionV relativeFrom="page">
+                          <wp14:pctPosVOffset>45500</wp14:pctPosVOffset>
+                        </wp:positionV>
+                      </mc:Choice>
+                      <mc:Fallback>
+                        <wp:positionV relativeFrom="page">
+                          <wp:posOffset>4576445</wp:posOffset>
+                        </wp:positionV>
+                      </mc:Fallback>
+                    </mc:AlternateContent>
+                    <wp:extent cx="5753100" cy="525780"/>
+                    <wp:effectExtent l="0" t="0" r="10160" b="6350"/>
+                    <wp:wrapSquare wrapText="bothSides"/>
+                    <wp:docPr id="113" name="Text Box 95"/>
+                    <wp:cNvGraphicFramePr/>
+                    <a:graphic xmlns:a="http://schemas.openxmlformats.org/drawingml/2006/main">
+                      <a:graphicData uri="http://schemas.microsoft.com/office/word/2010/wordprocessingShape">
+                        <wps:wsp>
+                          <wps:cNvSpPr txBox="1"/>
+                          <wps:spPr>
+                            <a:xfrm>
+                              <a:off x="0" y="0"/>
+                              <a:ext cx="5753100" cy="525780"/>
+                            </a:xfrm>
+                            <a:prstGeom prst="rect">
+                              <a:avLst/>
+                            </a:prstGeom>
+                            <a:noFill/>
+                            <a:ln w="6350">
+                              <a:noFill/>
+                            </a:ln>
+                            <a:effectLst/>
+                          </wps:spPr>
+                          <wps:style>
+                            <a:lnRef idx="0">
+                              <a:schemeClr val="accent1"/>
+                            </a:lnRef>
+                            <a:fillRef idx="0">
+                              <a:schemeClr val="accent1"/>
+                            </a:fillRef>
+                            <a:effectRef idx="0">
+                              <a:schemeClr val="accent1"/>
+                            </a:effectRef>
+                            <a:fontRef idx="minor">
+                              <a:schemeClr val="dk1"/>
+                            </a:fontRef>
+                          </wps:style>
+                          <wps:txbx>
+                            <w:txbxContent>
+                              <w:p>
+                                <w:pPr>
+                                  <w:pStyle w:val="NoSpacing"/>
+                                  <w:jc w:val="right"/>
+                                  <w:rPr>
+                                    <w:caps/>
+                                    <w:color w:val="0A1D30" w:themeColor="text2" w:themeShade="BF"/>
+                                    <w:sz w:val="52"/>
+                                    <w:szCs w:val="52"/>
+                                  </w:rPr>
+                                </w:pPr>
+                                <w:sdt>
+                                  <w:sdtPr>
+                                    <w:rPr>
+                                      <w:caps/>
+                                      <w:color w:val="0A1D30" w:themeColor="text2" w:themeShade="BF"/>
+                                      <w:sz w:val="52"/>
+                                      <w:szCs w:val="52"/>
+                                    </w:rPr>
+                                    <w:alias w:val="Title"/>
+                                    <w:tag w:val=""/>
+                                    <w:id w:val="-1315561441"/>
+                                    <w:dataBinding w:prefixMappings="xmlns:ns0='http://purl.org/dc/elements/1.1/' xmlns:ns1='http://schemas.openxmlformats.org/package/2006/metadata/core-properties' " w:xpath="/ns1:coreProperties[1]/ns0:title[1]" w:storeItemID="{6C3C8BC8-F283-45AE-878A-BAB7291924A1}"/>
+                                    <w:text w:multiLine="1"/>
+                                  </w:sdtPr>
+                                  <w:sdtContent>
+                                    <w:r>
+                                      <w:rPr>
+                                        <w:caps/>
+                                        <w:color w:val="0A1D30" w:themeColor="text2" w:themeShade="BF"/>
+                                        <w:sz w:val="52"/>
+                                        <w:szCs w:val="52"/>
+                                      </w:rPr>
+                                      <w:t>Hillsborough County Parcel Sales Prediction</w:t>
+                                    </w:r>
+                                  </w:sdtContent>
+                                </w:sdt>
+                              </w:p>
+                            </w:txbxContent>
+                          </wps:txbx>
+                          <wps:bodyPr rot="0" spcFirstLastPara="0" vertOverflow="overflow" horzOverflow="overflow" vert="horz" wrap="square" lIns="0" tIns="0" rIns="0" bIns="0" numCol="1" spcCol="0" rtlCol="0" fromWordArt="0" anchor="b" anchorCtr="0" forceAA="0" compatLnSpc="1">
+                            <a:prstTxWarp prst="textNoShape">
+                              <a:avLst/>
+                            </a:prstTxWarp>
+                            <a:noAutofit/>
+                          </wps:bodyPr>
+                        </wps:wsp>
+                      </a:graphicData>
+                    </a:graphic>
+                    <wp14:sizeRelH relativeFrom="page">
+                      <wp14:pctWidth>73400</wp14:pctWidth>
+                    </wp14:sizeRelH>
+                    <wp14:sizeRelV relativeFrom="page">
+                      <wp14:pctHeight>36300</wp14:pctHeight>
+                    </wp14:sizeRelV>
+                  </wp:anchor>
+                </w:drawing>
+              </mc:Choice>
+              <mc:Fallback>
+                <w:pict>
+                  <v:shape w14:anchorId="6AA423ED" id="Text Box 95" o:spid="_x0000_s1028" type="#_x0000_t202" style="position:absolute;margin-left:0;margin-top:0;width:453pt;height:41.4pt;z-index:251660288;visibility:visible;mso-wrap-style:square;mso-width-percent:734;mso-height-percent:363;mso-left-percent:150;mso-top-percent:455;mso-wrap-distance-left:9pt;mso-wrap-distance-top:0;mso-wrap-distance-right:9pt;mso-wrap-distance-bottom:0;mso-position-horizontal-relative:page;mso-position-vertical-relative:page;mso-width-percent:734;mso-height-percent:363;mso-left-percent:150;mso-top-percent:455;mso-width-relative:page;mso-height-relative:page;v-text-anchor:bottom" o:gfxdata="UEsDBBQABgAIAAAAIQC2gziS/gAAAOEBAAATAAAAW0NvbnRlbnRfVHlwZXNdLnhtbJSRQU7DMBBF&#13;&#10;90jcwfIWJU67QAgl6YK0S0CoHGBkTxKLZGx5TGhvj5O2G0SRWNoz/78nu9wcxkFMGNg6quQqL6RA&#13;&#10;0s5Y6ir5vt9lD1JwBDIwOMJKHpHlpr69KfdHjyxSmriSfYz+USnWPY7AufNIadK6MEJMx9ApD/oD&#13;&#10;OlTrorhX2lFEilmcO2RdNtjC5xDF9pCuTyYBB5bi6bQ4syoJ3g9WQ0ymaiLzg5KdCXlKLjvcW893&#13;&#10;SUOqXwnz5DrgnHtJTxOsQfEKIT7DmDSUCaxw7Rqn8787ZsmRM9e2VmPeBN4uqYvTtW7jvijg9N/y&#13;&#10;JsXecLq0q+WD6m8AAAD//wMAUEsDBBQABgAIAAAAIQA4/SH/1gAAAJQBAAALAAAAX3JlbHMvLnJl&#13;&#10;bHOkkMFqwzAMhu+DvYPRfXGawxijTi+j0GvpHsDYimMaW0Yy2fr2M4PBMnrbUb/Q94l/f/hMi1qR&#13;&#10;JVI2sOt6UJgd+ZiDgffL8ekFlFSbvV0oo4EbChzGx4f9GRdb25HMsYhqlCwG5lrLq9biZkxWOiqY&#13;&#10;22YiTra2kYMu1l1tQD30/bPm3wwYN0x18gb45AdQl1tp5j/sFB2T0FQ7R0nTNEV3j6o9feQzro1i&#13;&#10;OWA14Fm+Q8a1a8+Bvu/d/dMb2JY5uiPbhG/ktn4cqGU/er3pcvwCAAD//wMAUEsDBBQABgAIAAAA&#13;&#10;IQBFAE6hYwIAADQFAAAOAAAAZHJzL2Uyb0RvYy54bWysVN9v2jAQfp+0/8Hy+whQ0VaIUDEqpklV&#13;&#10;W41OfTaODdEcn3c2JOyv39lJoGJ76bQX5+L77td3d57dNZVhB4W+BJvz0WDImbISitJuc/79ZfXp&#13;&#10;ljMfhC2EAatyflSe380/fpjVbqrGsANTKGTkxPpp7XK+C8FNs8zLnaqEH4BTlpQasBKBfnGbFShq&#13;&#10;8l6ZbDwcXmc1YOEQpPKebu9bJZ8n/1orGZ609iowk3PKLaQT07mJZzafiekWhduVsktD/EMWlSgt&#13;&#10;BT25uhdBsD2Wf7iqSongQYeBhCoDrUupUg1UzWh4Uc16J5xKtRA53p1o8v/PrXw8rN0zstB8hoYa&#13;&#10;GAmpnZ96uoz1NBqr+KVMGemJwuOJNtUEJulycjO5Gg1JJUk3GU9ubhOv2dnaoQ9fFFQsCjlHakti&#13;&#10;SxwefKCIBO0hMZiFVWlMao2xrM759dVkmAxOGrIwNmJVanLn5px5ksLRqIgx9pvSrCxSAfEijZda&#13;&#10;GmQHQYMhpFQ2pNqTX0JHlKYk3mPY4c9Zvce4raOPDDacjKvSAqbqL9IufvQp6xZPRL6pO4qh2TRU&#13;&#10;eM7HfWM3UByp3wjtKngnVyU15UH48CyQZp/6SPscnujQBoh86CTOdoC//nYf8TSSpOWspl3Kuf+5&#13;&#10;F6g4M18tDWtcvF7AXtj0gt1XS6AujOilcDKJZIDB9KJGqF5pzRcxCqmElRQr55teXIZ2o+mZkGqx&#13;&#10;SCBaLyfCg107GV3HpsQRe2leBbpuDgNN8CP0WyamF+PYYqOlhcU+gC7TrEZeWxY7vmk10wh3z0jc&#13;&#10;/bf/CXV+7Oa/AQAA//8DAFBLAwQUAAYACAAAACEAJtsF4t0AAAAJAQAADwAAAGRycy9kb3ducmV2&#13;&#10;LnhtbEyPsU7DQBBEeyT+4bRIdORMCmMcn6OIiAIXSIQUlBvfYht8e5bv4hi+noWGNCONRjs7r1jP&#13;&#10;rlcTjaHzbOB2kYAirr3tuDGwf328yUCFiGyx90wGvijAury8KDC3/sQvNO1io6SEQ44G2hiHXOtQ&#13;&#10;t+QwLPxALNm7Hx1GsWOj7YgnKXe9XiZJqh12LB9aHOihpfpzd3QG3thVVTVt5v7uGX2XPn3s6Xtr&#13;&#10;zPXVvF2JbFagIs3x/wJ+GWQ/lDLs4I9sg+oNCE38U8nuk1TswUC2zECXhT4nKH8AAAD//wMAUEsB&#13;&#10;Ai0AFAAGAAgAAAAhALaDOJL+AAAA4QEAABMAAAAAAAAAAAAAAAAAAAAAAFtDb250ZW50X1R5cGVz&#13;&#10;XS54bWxQSwECLQAUAAYACAAAACEAOP0h/9YAAACUAQAACwAAAAAAAAAAAAAAAAAvAQAAX3JlbHMv&#13;&#10;LnJlbHNQSwECLQAUAAYACAAAACEARQBOoWMCAAA0BQAADgAAAAAAAAAAAAAAAAAuAgAAZHJzL2Uy&#13;&#10;b0RvYy54bWxQSwECLQAUAAYACAAAACEAJtsF4t0AAAAJAQAADwAAAAAAAAAAAAAAAAC9BAAAZHJz&#13;&#10;L2Rvd25yZXYueG1sUEsFBgAAAAAEAAQA8wAAAMcFAAAAAA==&#13;&#10;" filled="f" stroked="f" strokeweight=".5pt">
+                    <v:textbox inset="0,0,0,0">
+                      <w:txbxContent>
+                        <w:p>
+                          <w:pPr>
+                            <w:pStyle w:val="NoSpacing"/>
+                            <w:jc w:val="right"/>
+                            <w:rPr>
+                              <w:caps/>
+                              <w:color w:val="0A1D30" w:themeColor="text2" w:themeShade="BF"/>
+                              <w:sz w:val="52"/>
+                              <w:szCs w:val="52"/>
+                            </w:rPr>
+                          </w:pPr>
+                          <w:sdt>
+                            <w:sdtPr>
+                              <w:rPr>
+                                <w:caps/>
+                                <w:color w:val="0A1D30" w:themeColor="text2" w:themeShade="BF"/>
+                                <w:sz w:val="52"/>
+                                <w:szCs w:val="52"/>
+                              </w:rPr>
+                              <w:alias w:val="Title"/>
+                              <w:tag w:val=""/>
+                              <w:id w:val="-1315561441"/>
+                              <w:dataBinding w:prefixMappings="xmlns:ns0='http://purl.org/dc/elements/1.1/' xmlns:ns1='http://schemas.openxmlformats.org/package/2006/metadata/core-properties' " w:xpath="/ns1:coreProperties[1]/ns0:title[1]" w:storeItemID="{6C3C8BC8-F283-45AE-878A-BAB7291924A1}"/>
+                              <w:text w:multiLine="1"/>
+                            </w:sdtPr>
+                            <w:sdtContent>
+                              <w:r>
+                                <w:rPr>
+                                  <w:caps/>
+                                  <w:color w:val="0A1D30" w:themeColor="text2" w:themeShade="BF"/>
+                                  <w:sz w:val="52"/>
+                                  <w:szCs w:val="52"/>
+                                </w:rPr>
+                                <w:t>Hillsborough County Parcel Sales Prediction</w:t>
+                              </w:r>
+                            </w:sdtContent>
+                          </w:sdt>
+                        </w:p>
+                      </w:txbxContent>
+                    </v:textbox>
+                    <w10:wrap type="square" anchorx="page" anchory="page"/>
+                  </v:shape>
+                </w:pict>
+              </mc:Fallback>
+            </mc:AlternateContent>
+          </w:r>
+          <w:r>
+            <w:rPr>
+              <w:noProof/>
+              <w:lang w:eastAsia="zh-CN"/>
+            </w:rPr>
+            <mc:AlternateContent>
+              <mc:Choice Requires="wpg">
+                <w:drawing>
+                  <wp:anchor distT="0" distB="0" distL="114300" distR="114300" simplePos="0" relativeHeight="251659264" behindDoc="0" locked="0" layoutInCell="1" allowOverlap="1" wp14:anchorId="316C1429" wp14:editId="7C2D6A4F">
+                    <wp:simplePos x="0" y="0"/>
+                    <mc:AlternateContent>
+                      <mc:Choice Requires="wp14">
+                        <wp:positionH relativeFrom="page">
+                          <wp14:pctPosHOffset>4500</wp14:pctPosHOffset>
+                        </wp:positionH>
+                      </mc:Choice>
+                      <mc:Fallback>
+                        <wp:positionH relativeFrom="page">
+                          <wp:posOffset>349250</wp:posOffset>
+                        </wp:positionH>
+                      </mc:Fallback>
+                    </mc:AlternateContent>
+                    <wp:positionV relativeFrom="page">
+                      <wp:align>center</wp:align>
+                    </wp:positionV>
+                    <wp:extent cx="228600" cy="9144000"/>
+                    <wp:effectExtent l="0" t="0" r="3175" b="635"/>
+                    <wp:wrapNone/>
+                    <wp:docPr id="114" name="Group 98"/>
+                    <wp:cNvGraphicFramePr/>
+                    <a:graphic xmlns:a="http://schemas.openxmlformats.org/drawingml/2006/main">
+                      <a:graphicData uri="http://schemas.microsoft.com/office/word/2010/wordprocessingGroup">
+                        <wpg:wgp>
+                          <wpg:cNvGrpSpPr/>
+                          <wpg:grpSpPr>
+                            <a:xfrm>
+                              <a:off x="0" y="0"/>
+                              <a:ext cx="228600" cy="9144000"/>
+                              <a:chOff x="0" y="0"/>
+                              <a:chExt cx="228600" cy="9144000"/>
+                            </a:xfrm>
+                            <a:solidFill>
+                              <a:srgbClr val="3B43D7"/>
+                            </a:solidFill>
+                          </wpg:grpSpPr>
+                          <wps:wsp>
+                            <wps:cNvPr id="115" name="Rectangle 115"/>
+                            <wps:cNvSpPr/>
+                            <wps:spPr>
+                              <a:xfrm>
+                                <a:off x="0" y="0"/>
+                                <a:ext cx="228600" cy="8782050"/>
+                              </a:xfrm>
+                              <a:prstGeom prst="rect">
+                                <a:avLst/>
+                              </a:prstGeom>
+                              <a:grpFill/>
+                              <a:ln>
+                                <a:noFill/>
+                              </a:ln>
+                            </wps:spPr>
+                            <wps:style>
+                              <a:lnRef idx="2">
+                                <a:schemeClr val="accent1">
+                                  <a:shade val="50000"/>
+                                </a:schemeClr>
+                              </a:lnRef>
+                              <a:fillRef idx="1">
+                                <a:schemeClr val="accent1"/>
+                              </a:fillRef>
+                              <a:effectRef idx="0">
+                                <a:schemeClr val="accent1"/>
+                              </a:effectRef>
+                              <a:fontRef idx="minor">
+                                <a:schemeClr val="lt1"/>
+                              </a:fontRef>
+                            </wps:style>
+                            <wps:bodyPr rot="0" spcFirstLastPara="0" vertOverflow="overflow" horzOverflow="overflow" vert="horz" wrap="square" lIns="91440" tIns="45720" rIns="91440" bIns="45720" numCol="1" spcCol="0" rtlCol="0" fromWordArt="0" anchor="ctr" anchorCtr="0" forceAA="0" compatLnSpc="1">
+                              <a:prstTxWarp prst="textNoShape">
+                                <a:avLst/>
+                              </a:prstTxWarp>
+                              <a:noAutofit/>
+                            </wps:bodyPr>
+                          </wps:wsp>
+                          <wps:wsp>
+                            <wps:cNvPr id="116" name="Rectangle 116"/>
+                            <wps:cNvSpPr>
+                              <a:spLocks noChangeAspect="1"/>
+                            </wps:cNvSpPr>
+                            <wps:spPr>
+                              <a:xfrm>
+                                <a:off x="0" y="8915400"/>
+                                <a:ext cx="228600" cy="228600"/>
+                              </a:xfrm>
+                              <a:prstGeom prst="rect">
+                                <a:avLst/>
+                              </a:prstGeom>
+                              <a:grpFill/>
+                              <a:ln>
+                                <a:noFill/>
+                              </a:ln>
+                            </wps:spPr>
+                            <wps:style>
+                              <a:lnRef idx="2">
+                                <a:schemeClr val="accent1">
+                                  <a:shade val="50000"/>
+                                </a:schemeClr>
+                              </a:lnRef>
+                              <a:fillRef idx="1">
+                                <a:schemeClr val="accent1"/>
+                              </a:fillRef>
+                              <a:effectRef idx="0">
+                                <a:schemeClr val="accent1"/>
+                              </a:effectRef>
+                              <a:fontRef idx="minor">
+                                <a:schemeClr val="lt1"/>
+                              </a:fontRef>
+                            </wps:style>
+                            <wps:bodyPr rot="0" spcFirstLastPara="0" vertOverflow="overflow" horzOverflow="overflow" vert="horz" wrap="square" lIns="91440" tIns="45720" rIns="91440" bIns="45720" numCol="1" spcCol="0" rtlCol="0" fromWordArt="0" anchor="ctr" anchorCtr="0" forceAA="0" compatLnSpc="1">
+                              <a:prstTxWarp prst="textNoShape">
+                                <a:avLst/>
+                              </a:prstTxWarp>
+                              <a:noAutofit/>
+                            </wps:bodyPr>
+                          </wps:wsp>
+                        </wpg:wgp>
+                      </a:graphicData>
+                    </a:graphic>
+                    <wp14:sizeRelH relativeFrom="page">
+                      <wp14:pctWidth>2900</wp14:pctWidth>
+                    </wp14:sizeRelH>
+                    <wp14:sizeRelV relativeFrom="page">
+                      <wp14:pctHeight>90900</wp14:pctHeight>
+                    </wp14:sizeRelV>
+                  </wp:anchor>
+                </w:drawing>
+              </mc:Choice>
+              <mc:Fallback>
+                <w:pict>
+                  <v:group w14:anchorId="00F67AC3" id="Group 98" o:spid="_x0000_s1026" style="position:absolute;margin-left:0;margin-top:0;width:18pt;height:10in;z-index:251659264;mso-width-percent:29;mso-height-percent:909;mso-left-percent:45;mso-position-horizontal-relative:page;mso-position-vertical:center;mso-position-vertical-relative:page;mso-width-percent:29;mso-height-percent:909;mso-left-percent:45" coordsize="2286,91440" o:gfxdata="UEsDBBQABgAIAAAAIQC2gziS/gAAAOEBAAATAAAAW0NvbnRlbnRfVHlwZXNdLnhtbJSRQU7DMBBF&#13;&#10;90jcwfIWJU67QAgl6YK0S0CoHGBkTxKLZGx5TGhvj5O2G0SRWNoz/78nu9wcxkFMGNg6quQqL6RA&#13;&#10;0s5Y6ir5vt9lD1JwBDIwOMJKHpHlpr69KfdHjyxSmriSfYz+USnWPY7AufNIadK6MEJMx9ApD/oD&#13;&#10;OlTrorhX2lFEilmcO2RdNtjC5xDF9pCuTyYBB5bi6bQ4syoJ3g9WQ0ymaiLzg5KdCXlKLjvcW893&#13;&#10;SUOqXwnz5DrgnHtJTxOsQfEKIT7DmDSUCaxw7Rqn8787ZsmRM9e2VmPeBN4uqYvTtW7jvijg9N/y&#13;&#10;JsXecLq0q+WD6m8AAAD//wMAUEsDBBQABgAIAAAAIQA4/SH/1gAAAJQBAAALAAAAX3JlbHMvLnJl&#13;&#10;bHOkkMFqwzAMhu+DvYPRfXGawxijTi+j0GvpHsDYimMaW0Yy2fr2M4PBMnrbUb/Q94l/f/hMi1qR&#13;&#10;JVI2sOt6UJgd+ZiDgffL8ekFlFSbvV0oo4EbChzGx4f9GRdb25HMsYhqlCwG5lrLq9biZkxWOiqY&#13;&#10;22YiTra2kYMu1l1tQD30/bPm3wwYN0x18gb45AdQl1tp5j/sFB2T0FQ7R0nTNEV3j6o9feQzro1i&#13;&#10;OWA14Fm+Q8a1a8+Bvu/d/dMb2JY5uiPbhG/ktn4cqGU/er3pcvwCAAD//wMAUEsDBBQABgAIAAAA&#13;&#10;IQAKKH9/NAMAAKMKAAAOAAAAZHJzL2Uyb0RvYy54bWzsVltv2jAUfp+0/2D5fQ0woBQ1VIyu1STU&#13;&#10;Vm2nPhvHIdEc27MNgf36neNcYBTx0EmTJvUl8eVcv3POl1xebQpJ1sK6XKuYds86lAjFdZKrZUy/&#13;&#10;P998GlHiPFMJk1qJmG6Fo1eTjx8uSzMWPZ1pmQhLwIhy49LENPPejKPI8UwUzJ1pIxRcptoWzMPW&#13;&#10;LqPEshKsFzLqdTrDqNQ2MVZz4RycXleXdBLsp6ng/j5NnfBExhRi8+Fpw3OBz2hyycZLy0yW8zoM&#13;&#10;9oYoCpYrcNqaumaekZXNX5kqcm6106k/47qIdJrmXIQcIJtu5yCbW6tXJuSyHJdL08IE0B7g9Gaz&#13;&#10;/G59a82TebCARGmWgEXYYS6b1Bb4hijJJkC2bSETG084HPZ6o2EHgOVwddHt9zuwCZjyDIB/pcaz&#13;&#10;r6cVo51bp2We3ORSYgzOLhczacmaQSE/f+l/vj5HPyC+Jxb9kUBpoKXcDjX3d6g9ZcyIUAw3BtQe&#13;&#10;LMkT6PjugBLFCmjtR2g2ppZSEDwMcAbJFlw3doDzW5AdnY96nUFAdg8gY52/FboguIipBf+hB9l6&#13;&#10;7nwFTiOCTqGyiGaojlR4onR9AEbxBPBrYgwrv5UC5aR6FCmki/UOHsJ4irYejHOhfLe6ylgiqjIN&#13;&#10;oBmamFuNULNgEC2nEFBruzaAo//adpVPLY+qIkx3q9w5FVil3GoEz1r5VrnIlbbHDEjIqvZcyTcg&#13;&#10;VdAgSgudbKEZrK64xRl+k0M95sz5B2aBTGA6gCD9PTxSqcuY6npFSabtr2PnKA/dCreUlEBOMXU/&#13;&#10;V8wKSuQ3BX0cJg3YLGz6g/Me+LD7N4v9G7UqZhrGpgtUbHhYoryXzTK1ungBHp2iV7hiioPvmHJv&#13;&#10;m83MV6QJTMzFdBrEgMEM83P1ZDgaR1Sx3543L8yauik9EMWdbmaHjQ96s5JFTaWnK6/TPDTuDtca&#13;&#10;b5hjpKd/MtDDYwM9PBhoDNmZueY/HFF6lsHgi6kzMIIIBbYMRgs8gdNfhX5y+EcX3QGQJ2pCax/h&#13;&#10;yJpoq2ZsmLkZ73cGCN+nUJRT9PHOAP83A4QPPPwJhY9I/deGv1r7+zB6u3/LyW8AAAD//wMAUEsD&#13;&#10;BBQABgAIAAAAIQDDjdlg3AAAAAoBAAAPAAAAZHJzL2Rvd25yZXYueG1sTE/LTsMwELwj8Q/WVuJG&#13;&#10;7T5UlTROhUD0hqApB7g58ZJE2Osodtvw9yxc6GWk0czOzuTb0TtxwiF2gTTMpgoEUh1sR42Gt8PT&#13;&#10;7RpETIascYFQwzdG2BbXV7nJbDjTHk9lagSHUMyMhjalPpMy1i16E6ehR2LtMwzeJKZDI+1gzhzu&#13;&#10;nZwrtZLedMQfWtPjQ4v1V3n0Gkge7M6XL/59ke7K+cdr5Z53ldY3k/Fxw3C/AZFwTP8X8LuB+0PB&#13;&#10;xapwJBuF08Br0h+ytlgxq9izXCoFssjl5YTiBwAA//8DAFBLAQItABQABgAIAAAAIQC2gziS/gAA&#13;&#10;AOEBAAATAAAAAAAAAAAAAAAAAAAAAABbQ29udGVudF9UeXBlc10ueG1sUEsBAi0AFAAGAAgAAAAh&#13;&#10;ADj9If/WAAAAlAEAAAsAAAAAAAAAAAAAAAAALwEAAF9yZWxzLy5yZWxzUEsBAi0AFAAGAAgAAAAh&#13;&#10;AAoof380AwAAowoAAA4AAAAAAAAAAAAAAAAALgIAAGRycy9lMm9Eb2MueG1sUEsBAi0AFAAGAAgA&#13;&#10;AAAhAMON2WDcAAAACgEAAA8AAAAAAAAAAAAAAAAAjgUAAGRycy9kb3ducmV2LnhtbFBLBQYAAAAA&#13;&#10;BAAEAPMAAACXBgAAAAA=&#13;&#10;">
+                    <v:rect id="Rectangle 115" o:spid="_x0000_s1027" style="position:absolute;width:2286;height:87820;visibility:visible;mso-wrap-style:square;v-text-anchor:middle" o:gfxdata="UEsDBBQABgAIAAAAIQDb4fbL7gAAAIUBAAATAAAAW0NvbnRlbnRfVHlwZXNdLnhtbHyQz07DMAyH&#13;&#10;70i8Q+QralM4IITa7kDhCAiNB7ASt43WOlEcyvb2pNu4IODoPz9/n1xv9vOkForiPDdwXVagiI23&#13;&#10;jocG3rdPxR0oScgWJ8/UwIEENu3lRb09BBKV0ywNjCmFe63FjDSjlD4Q50nv44wpl3HQAc0OB9I3&#13;&#10;VXWrjedEnIq03oC27qjHjympx31un0wiTQLq4bS4shrAECZnMGVTvbD9QSnOhDInjzsyuiBXWQP0&#13;&#10;r4R18jfgnHvJr4nOknrFmJ5xzhraRtHWf3Kkpfz/yGo5S+H73hkquyhdjr3R8m2lj09svwAAAP//&#13;&#10;AwBQSwMEFAAGAAgAAAAhAFr0LFu/AAAAFQEAAAsAAABfcmVscy8ucmVsc2zPwWrDMAwG4Ptg72B0&#13;&#10;X5TuUMaI01uh19I+gLGVxCy2jGSy9e1nemrHjpL4P0nD4SetZiPRyNnCruvBUPYcYp4tXC/Htw8w&#13;&#10;Wl0ObuVMFm6kcBhfX4Yzra62kC6xqGlKVgtLreUTUf1CyWnHhXKbTCzJ1VbKjMX5LzcTvvf9HuXR&#13;&#10;gPHJNKdgQU5hB+ZyK23zHztFL6w81c5zQp6m6P9TMfB3PtPWFCczVQtB9N4U2rp2HOA44NMz4y8A&#13;&#10;AAD//wMAUEsDBBQABgAIAAAAIQD7A7IrxwAAAOEAAAAPAAAAZHJzL2Rvd25yZXYueG1sRI/BagIx&#13;&#10;EIbvgu8QRuhNswotshqlVaQtHkq37X2ajLtLN5Mlibvr2xuh4GWY4ef/hm+9HWwjOvKhdqxgPstA&#13;&#10;EGtnai4VfH8dpksQISIbbByTggsF2G7GozXmxvX8SV0RS5EgHHJUUMXY5lIGXZHFMHMtccpOzluM&#13;&#10;6fSlNB77BLeNXGTZk7RYc/pQYUu7ivRfcbYKftzppbf6l9+7y0d9fj16rZdHpR4mw36VxvMKRKQh&#13;&#10;3hv/iDeTHOaPcDNKG8jNFQAA//8DAFBLAQItABQABgAIAAAAIQDb4fbL7gAAAIUBAAATAAAAAAAA&#13;&#10;AAAAAAAAAAAAAABbQ29udGVudF9UeXBlc10ueG1sUEsBAi0AFAAGAAgAAAAhAFr0LFu/AAAAFQEA&#13;&#10;AAsAAAAAAAAAAAAAAAAAHwEAAF9yZWxzLy5yZWxzUEsBAi0AFAAGAAgAAAAhAPsDsivHAAAA4QAA&#13;&#10;AA8AAAAAAAAAAAAAAAAABwIAAGRycy9kb3ducmV2LnhtbFBLBQYAAAAAAwADALcAAAD7AgAAAAA=&#13;&#10;" filled="f" stroked="f" strokeweight="1pt"/>
+                    <v:rect id="Rectangle 116" o:spid="_x0000_s1028" style="position:absolute;top:89154;width:2286;height:2286;visibility:visible;mso-wrap-style:square;v-text-anchor:middle" o:gfxdata="UEsDBBQABgAIAAAAIQDb4fbL7gAAAIUBAAATAAAAW0NvbnRlbnRfVHlwZXNdLnhtbHyQz07DMAyH&#13;&#10;70i8Q+QralM4IITa7kDhCAiNB7ASt43WOlEcyvb2pNu4IODoPz9/n1xv9vOkForiPDdwXVagiI23&#13;&#10;jocG3rdPxR0oScgWJ8/UwIEENu3lRb09BBKV0ywNjCmFe63FjDSjlD4Q50nv44wpl3HQAc0OB9I3&#13;&#10;VXWrjedEnIq03oC27qjHjympx31un0wiTQLq4bS4shrAECZnMGVTvbD9QSnOhDInjzsyuiBXWQP0&#13;&#10;r4R18jfgnHvJr4nOknrFmJ5xzhraRtHWf3Kkpfz/yGo5S+H73hkquyhdjr3R8m2lj09svwAAAP//&#13;&#10;AwBQSwMEFAAGAAgAAAAhAFr0LFu/AAAAFQEAAAsAAABfcmVscy8ucmVsc2zPwWrDMAwG4Ptg72B0&#13;&#10;X5TuUMaI01uh19I+gLGVxCy2jGSy9e1nemrHjpL4P0nD4SetZiPRyNnCruvBUPYcYp4tXC/Htw8w&#13;&#10;Wl0ObuVMFm6kcBhfX4Yzra62kC6xqGlKVgtLreUTUf1CyWnHhXKbTCzJ1VbKjMX5LzcTvvf9HuXR&#13;&#10;gPHJNKdgQU5hB+ZyK23zHztFL6w81c5zQp6m6P9TMfB3PtPWFCczVQtB9N4U2rp2HOA44NMz4y8A&#13;&#10;AAD//wMAUEsDBBQABgAIAAAAIQAL0SxcyAAAAOEAAAAPAAAAZHJzL2Rvd25yZXYueG1sRI/LasMw&#13;&#10;EEX3hf6DmEB3jZwuQnAihySltCWL0jz2E2n8INbISIrt/H1VKHQzzHC5Zzir9Whb0ZMPjWMFs2kG&#13;&#10;glg703Cl4HR8e16ACBHZYOuYFNwpwLp4fFhhbtzA39QfYiUShEOOCuoYu1zKoGuyGKauI05Z6bzF&#13;&#10;mE5fSeNxSHDbypcsm0uLDacPNXa0q0lfDzer4OzK7WD1hT/7+1dze997rRd7pZ4m4+syjc0SRKQx&#13;&#10;/jf+EB8mOczm8GuUNpDFDwAAAP//AwBQSwECLQAUAAYACAAAACEA2+H2y+4AAACFAQAAEwAAAAAA&#13;&#10;AAAAAAAAAAAAAAAAW0NvbnRlbnRfVHlwZXNdLnhtbFBLAQItABQABgAIAAAAIQBa9CxbvwAAABUB&#13;&#10;AAALAAAAAAAAAAAAAAAAAB8BAABfcmVscy8ucmVsc1BLAQItABQABgAIAAAAIQAL0SxcyAAAAOEA&#13;&#10;AAAPAAAAAAAAAAAAAAAAAAcCAABkcnMvZG93bnJldi54bWxQSwUGAAAAAAMAAwC3AAAA/AIAAAAA&#13;&#10;" filled="f" stroked="f" strokeweight="1pt">
+                      <o:lock v:ext="edit" aspectratio="t"/>
+                    </v:rect>
+                    <w10:wrap anchorx="page" anchory="page"/>
+                  </v:group>
+                </w:pict>
+              </mc:Fallback>
+            </mc:AlternateContent>
+          </w:r>
+          <w:r>
+            <w:br w:type="page"/>
+          </w:r>
+        </w:p>
+      </w:sdtContent>
+    </w:sdt>
     <w:p>
       <w:pPr>
-        <w:pStyle w:val="Title"/>
-        <w:jc w:val="center"/>
-      </w:pPr>
-      <w:r>
-        <w:t xml:space="preserve">Hillsborough County </w:t>
-      </w:r>
-      <w:r>
-        <w:t>Parcel Sales Prediction</w:t>
-      </w:r>
-    </w:p>
-    <w:p>
-      <w:pPr>
-        <w:jc w:val="center"/>
-        <w:rPr>
-          <w:i/>
-          <w:iCs/>
-        </w:rPr>
-      </w:pPr>
-      <w:r>
-        <w:rPr>
-          <w:i/>
-          <w:iCs/>
-        </w:rPr>
-        <w:t>Bo Fethe</w:t>
-      </w:r>
-    </w:p>
-    <w:p>
-      <w:pPr>
         <w:sectPr>
-          <w:footerReference w:type="even" r:id="rId8"/>
-          <w:footerReference w:type="default" r:id="rId9"/>
+          <w:footerReference w:type="even" r:id="rId9"/>
+          <w:footerReference w:type="default" r:id="rId10"/>
           <w:pgSz w:w="12240" w:h="15840"/>
           <w:pgMar w:top="1440" w:right="1440" w:bottom="1440" w:left="1440" w:header="720" w:footer="720" w:gutter="0"/>
+          <w:pgNumType w:start="0"/>
           <w:cols w:space="720"/>
           <w:vAlign w:val="center"/>
+          <w:titlePg/>
           <w:docGrid w:linePitch="360"/>
         </w:sectPr>
       </w:pPr>
@@ -160,7 +1034,7 @@
     <w:p>
       <w:pPr>
         <w:sectPr>
-          <w:footerReference w:type="default" r:id="rId10"/>
+          <w:footerReference w:type="default" r:id="rId11"/>
           <w:pgSz w:w="12240" w:h="15840"/>
           <w:pgMar w:top="1440" w:right="1440" w:bottom="1440" w:left="1440" w:header="720" w:footer="720" w:gutter="0"/>
           <w:cols w:space="720"/>
@@ -170,6 +1044,16 @@
     </w:p>
     <w:sdt>
       <w:sdtPr>
+        <w:rPr>
+          <w:rFonts w:ascii="Calibri" w:eastAsiaTheme="minorHAnsi" w:hAnsi="Calibri" w:cs="Calibri"/>
+          <w:b w:val="0"/>
+          <w:bCs w:val="0"/>
+          <w:color w:val="auto"/>
+          <w:kern w:val="2"/>
+          <w:sz w:val="24"/>
+          <w:szCs w:val="24"/>
+          <w14:ligatures w14:val="standardContextual"/>
+        </w:rPr>
         <w:id w:val="1003009725"/>
         <w:docPartObj>
           <w:docPartGallery w:val="Table of Contents"/>
@@ -178,13 +1062,7 @@
       </w:sdtPr>
       <w:sdtEndPr>
         <w:rPr>
-          <w:rFonts w:ascii="Calibri" w:eastAsiaTheme="minorHAnsi" w:hAnsi="Calibri" w:cs="Calibri"/>
           <w:noProof/>
-          <w:color w:val="auto"/>
-          <w:kern w:val="2"/>
-          <w:sz w:val="24"/>
-          <w:szCs w:val="24"/>
-          <w14:ligatures w14:val="standardContextual"/>
         </w:rPr>
       </w:sdtEndPr>
       <w:sdtContent>
@@ -233,7 +1111,7 @@
             </w:rPr>
             <w:fldChar w:fldCharType="separate"/>
           </w:r>
-          <w:hyperlink w:anchor="_Toc202275306" w:history="1">
+          <w:hyperlink w:anchor="_Toc202387348" w:history="1">
             <w:r>
               <w:rPr>
                 <w:rStyle w:val="Hyperlink"/>
@@ -280,7 +1158,7 @@
                 <w:noProof/>
                 <w:webHidden/>
               </w:rPr>
-              <w:instrText xml:space="preserve"> PAGEREF _Toc202275306 \h </w:instrText>
+              <w:instrText xml:space="preserve"> PAGEREF _Toc202387348 \h </w:instrText>
             </w:r>
             <w:r>
               <w:rPr>
@@ -327,7 +1205,7 @@
               <w:noProof/>
             </w:rPr>
           </w:pPr>
-          <w:hyperlink w:anchor="_Toc202275307" w:history="1">
+          <w:hyperlink w:anchor="_Toc202387349" w:history="1">
             <w:r>
               <w:rPr>
                 <w:rStyle w:val="Hyperlink"/>
@@ -374,7 +1252,7 @@
                 <w:noProof/>
                 <w:webHidden/>
               </w:rPr>
-              <w:instrText xml:space="preserve"> PAGEREF _Toc202275307 \h </w:instrText>
+              <w:instrText xml:space="preserve"> PAGEREF _Toc202387349 \h </w:instrText>
             </w:r>
             <w:r>
               <w:rPr>
@@ -421,7 +1299,7 @@
               <w:szCs w:val="24"/>
             </w:rPr>
           </w:pPr>
-          <w:hyperlink w:anchor="_Toc202275308" w:history="1">
+          <w:hyperlink w:anchor="_Toc202387350" w:history="1">
             <w:r>
               <w:rPr>
                 <w:rStyle w:val="Hyperlink"/>
@@ -466,7 +1344,7 @@
                 <w:noProof/>
                 <w:webHidden/>
               </w:rPr>
-              <w:instrText xml:space="preserve"> PAGEREF _Toc202275308 \h </w:instrText>
+              <w:instrText xml:space="preserve"> PAGEREF _Toc202387350 \h </w:instrText>
             </w:r>
             <w:r>
               <w:rPr>
@@ -511,7 +1389,7 @@
               <w:szCs w:val="24"/>
             </w:rPr>
           </w:pPr>
-          <w:hyperlink w:anchor="_Toc202275309" w:history="1">
+          <w:hyperlink w:anchor="_Toc202387351" w:history="1">
             <w:r>
               <w:rPr>
                 <w:rStyle w:val="Hyperlink"/>
@@ -554,7 +1432,7 @@
                 <w:noProof/>
                 <w:webHidden/>
               </w:rPr>
-              <w:instrText xml:space="preserve"> PAGEREF _Toc202275309 \h </w:instrText>
+              <w:instrText xml:space="preserve"> PAGEREF _Toc202387351 \h </w:instrText>
             </w:r>
             <w:r>
               <w:rPr>
@@ -599,7 +1477,7 @@
               <w:szCs w:val="24"/>
             </w:rPr>
           </w:pPr>
-          <w:hyperlink w:anchor="_Toc202275310" w:history="1">
+          <w:hyperlink w:anchor="_Toc202387352" w:history="1">
             <w:r>
               <w:rPr>
                 <w:rStyle w:val="Hyperlink"/>
@@ -642,7 +1520,7 @@
                 <w:noProof/>
                 <w:webHidden/>
               </w:rPr>
-              <w:instrText xml:space="preserve"> PAGEREF _Toc202275310 \h </w:instrText>
+              <w:instrText xml:space="preserve"> PAGEREF _Toc202387352 \h </w:instrText>
             </w:r>
             <w:r>
               <w:rPr>
@@ -687,7 +1565,7 @@
               <w:szCs w:val="24"/>
             </w:rPr>
           </w:pPr>
-          <w:hyperlink w:anchor="_Toc202275311" w:history="1">
+          <w:hyperlink w:anchor="_Toc202387353" w:history="1">
             <w:r>
               <w:rPr>
                 <w:rStyle w:val="Hyperlink"/>
@@ -730,7 +1608,7 @@
                 <w:noProof/>
                 <w:webHidden/>
               </w:rPr>
-              <w:instrText xml:space="preserve"> PAGEREF _Toc202275311 \h </w:instrText>
+              <w:instrText xml:space="preserve"> PAGEREF _Toc202387353 \h </w:instrText>
             </w:r>
             <w:r>
               <w:rPr>
@@ -775,7 +1653,7 @@
               <w:szCs w:val="24"/>
             </w:rPr>
           </w:pPr>
-          <w:hyperlink w:anchor="_Toc202275312" w:history="1">
+          <w:hyperlink w:anchor="_Toc202387354" w:history="1">
             <w:r>
               <w:rPr>
                 <w:rStyle w:val="Hyperlink"/>
@@ -818,7 +1696,7 @@
                 <w:noProof/>
                 <w:webHidden/>
               </w:rPr>
-              <w:instrText xml:space="preserve"> PAGEREF _Toc202275312 \h </w:instrText>
+              <w:instrText xml:space="preserve"> PAGEREF _Toc202387354 \h </w:instrText>
             </w:r>
             <w:r>
               <w:rPr>
@@ -863,7 +1741,7 @@
               <w:szCs w:val="24"/>
             </w:rPr>
           </w:pPr>
-          <w:hyperlink w:anchor="_Toc202275313" w:history="1">
+          <w:hyperlink w:anchor="_Toc202387355" w:history="1">
             <w:r>
               <w:rPr>
                 <w:rStyle w:val="Hyperlink"/>
@@ -906,7 +1784,7 @@
                 <w:noProof/>
                 <w:webHidden/>
               </w:rPr>
-              <w:instrText xml:space="preserve"> PAGEREF _Toc202275313 \h </w:instrText>
+              <w:instrText xml:space="preserve"> PAGEREF _Toc202387355 \h </w:instrText>
             </w:r>
             <w:r>
               <w:rPr>
@@ -953,7 +1831,7 @@
               <w:noProof/>
             </w:rPr>
           </w:pPr>
-          <w:hyperlink w:anchor="_Toc202275314" w:history="1">
+          <w:hyperlink w:anchor="_Toc202387356" w:history="1">
             <w:r>
               <w:rPr>
                 <w:rStyle w:val="Hyperlink"/>
@@ -998,7 +1876,7 @@
                 <w:noProof/>
                 <w:webHidden/>
               </w:rPr>
-              <w:instrText xml:space="preserve"> PAGEREF _Toc202275314 \h </w:instrText>
+              <w:instrText xml:space="preserve"> PAGEREF _Toc202387356 \h </w:instrText>
             </w:r>
             <w:r>
               <w:rPr>
@@ -1045,7 +1923,7 @@
               <w:szCs w:val="24"/>
             </w:rPr>
           </w:pPr>
-          <w:hyperlink w:anchor="_Toc202275315" w:history="1">
+          <w:hyperlink w:anchor="_Toc202387357" w:history="1">
             <w:r>
               <w:rPr>
                 <w:rStyle w:val="Hyperlink"/>
@@ -1090,7 +1968,7 @@
                 <w:noProof/>
                 <w:webHidden/>
               </w:rPr>
-              <w:instrText xml:space="preserve"> PAGEREF _Toc202275315 \h </w:instrText>
+              <w:instrText xml:space="preserve"> PAGEREF _Toc202387357 \h </w:instrText>
             </w:r>
             <w:r>
               <w:rPr>
@@ -1137,7 +2015,7 @@
               <w:szCs w:val="24"/>
             </w:rPr>
           </w:pPr>
-          <w:hyperlink w:anchor="_Toc202275316" w:history="1">
+          <w:hyperlink w:anchor="_Toc202387358" w:history="1">
             <w:r>
               <w:rPr>
                 <w:rStyle w:val="Hyperlink"/>
@@ -1182,7 +2060,7 @@
                 <w:noProof/>
                 <w:webHidden/>
               </w:rPr>
-              <w:instrText xml:space="preserve"> PAGEREF _Toc202275316 \h </w:instrText>
+              <w:instrText xml:space="preserve"> PAGEREF _Toc202387358 \h </w:instrText>
             </w:r>
             <w:r>
               <w:rPr>
@@ -1229,7 +2107,7 @@
               <w:szCs w:val="24"/>
             </w:rPr>
           </w:pPr>
-          <w:hyperlink w:anchor="_Toc202275317" w:history="1">
+          <w:hyperlink w:anchor="_Toc202387359" w:history="1">
             <w:r>
               <w:rPr>
                 <w:rStyle w:val="Hyperlink"/>
@@ -1274,7 +2152,7 @@
                 <w:noProof/>
                 <w:webHidden/>
               </w:rPr>
-              <w:instrText xml:space="preserve"> PAGEREF _Toc202275317 \h </w:instrText>
+              <w:instrText xml:space="preserve"> PAGEREF _Toc202387359 \h </w:instrText>
             </w:r>
             <w:r>
               <w:rPr>
@@ -1321,7 +2199,7 @@
               <w:szCs w:val="24"/>
             </w:rPr>
           </w:pPr>
-          <w:hyperlink w:anchor="_Toc202275318" w:history="1">
+          <w:hyperlink w:anchor="_Toc202387360" w:history="1">
             <w:r>
               <w:rPr>
                 <w:rStyle w:val="Hyperlink"/>
@@ -1366,7 +2244,7 @@
                 <w:noProof/>
                 <w:webHidden/>
               </w:rPr>
-              <w:instrText xml:space="preserve"> PAGEREF _Toc202275318 \h </w:instrText>
+              <w:instrText xml:space="preserve"> PAGEREF _Toc202387360 \h </w:instrText>
             </w:r>
             <w:r>
               <w:rPr>
@@ -1413,7 +2291,7 @@
               <w:szCs w:val="24"/>
             </w:rPr>
           </w:pPr>
-          <w:hyperlink w:anchor="_Toc202275319" w:history="1">
+          <w:hyperlink w:anchor="_Toc202387361" w:history="1">
             <w:r>
               <w:rPr>
                 <w:rStyle w:val="Hyperlink"/>
@@ -1458,7 +2336,7 @@
                 <w:noProof/>
                 <w:webHidden/>
               </w:rPr>
-              <w:instrText xml:space="preserve"> PAGEREF _Toc202275319 \h </w:instrText>
+              <w:instrText xml:space="preserve"> PAGEREF _Toc202387361 \h </w:instrText>
             </w:r>
             <w:r>
               <w:rPr>
@@ -1505,7 +2383,7 @@
               <w:noProof/>
             </w:rPr>
           </w:pPr>
-          <w:hyperlink w:anchor="_Toc202275320" w:history="1">
+          <w:hyperlink w:anchor="_Toc202387362" w:history="1">
             <w:r>
               <w:rPr>
                 <w:rStyle w:val="Hyperlink"/>
@@ -1552,7 +2430,7 @@
                 <w:noProof/>
                 <w:webHidden/>
               </w:rPr>
-              <w:instrText xml:space="preserve"> PAGEREF _Toc202275320 \h </w:instrText>
+              <w:instrText xml:space="preserve"> PAGEREF _Toc202387362 \h </w:instrText>
             </w:r>
             <w:r>
               <w:rPr>
@@ -1599,7 +2477,7 @@
               <w:szCs w:val="24"/>
             </w:rPr>
           </w:pPr>
-          <w:hyperlink w:anchor="_Toc202275321" w:history="1">
+          <w:hyperlink w:anchor="_Toc202387363" w:history="1">
             <w:r>
               <w:rPr>
                 <w:rStyle w:val="Hyperlink"/>
@@ -1644,7 +2522,7 @@
                 <w:noProof/>
                 <w:webHidden/>
               </w:rPr>
-              <w:instrText xml:space="preserve"> PAGEREF _Toc202275321 \h </w:instrText>
+              <w:instrText xml:space="preserve"> PAGEREF _Toc202387363 \h </w:instrText>
             </w:r>
             <w:r>
               <w:rPr>
@@ -1691,7 +2569,7 @@
               <w:szCs w:val="24"/>
             </w:rPr>
           </w:pPr>
-          <w:hyperlink w:anchor="_Toc202275322" w:history="1">
+          <w:hyperlink w:anchor="_Toc202387364" w:history="1">
             <w:r>
               <w:rPr>
                 <w:rStyle w:val="Hyperlink"/>
@@ -1736,7 +2614,7 @@
                 <w:noProof/>
                 <w:webHidden/>
               </w:rPr>
-              <w:instrText xml:space="preserve"> PAGEREF _Toc202275322 \h </w:instrText>
+              <w:instrText xml:space="preserve"> PAGEREF _Toc202387364 \h </w:instrText>
             </w:r>
             <w:r>
               <w:rPr>
@@ -1783,7 +2661,7 @@
               <w:noProof/>
             </w:rPr>
           </w:pPr>
-          <w:hyperlink w:anchor="_Toc202275323" w:history="1">
+          <w:hyperlink w:anchor="_Toc202387365" w:history="1">
             <w:r>
               <w:rPr>
                 <w:rStyle w:val="Hyperlink"/>
@@ -1828,7 +2706,7 @@
                 <w:noProof/>
                 <w:webHidden/>
               </w:rPr>
-              <w:instrText xml:space="preserve"> PAGEREF _Toc202275323 \h </w:instrText>
+              <w:instrText xml:space="preserve"> PAGEREF _Toc202387365 \h </w:instrText>
             </w:r>
             <w:r>
               <w:rPr>
@@ -1848,7 +2726,7 @@
                 <w:noProof/>
                 <w:webHidden/>
               </w:rPr>
-              <w:t>11</w:t>
+              <w:t>12</w:t>
             </w:r>
             <w:r>
               <w:rPr>
@@ -1874,7 +2752,7 @@
               <w:noProof/>
             </w:rPr>
           </w:pPr>
-          <w:hyperlink w:anchor="_Toc202275324" w:history="1">
+          <w:hyperlink w:anchor="_Toc202387366" w:history="1">
             <w:r>
               <w:rPr>
                 <w:rStyle w:val="Hyperlink"/>
@@ -1901,7 +2779,7 @@
                 <w:noProof/>
                 <w:webHidden/>
               </w:rPr>
-              <w:instrText xml:space="preserve"> PAGEREF _Toc202275324 \h </w:instrText>
+              <w:instrText xml:space="preserve"> PAGEREF _Toc202387366 \h </w:instrText>
             </w:r>
             <w:r>
               <w:rPr>
@@ -2008,7 +2886,7 @@
           <w:r>
             <w:fldChar w:fldCharType="separate"/>
           </w:r>
-          <w:hyperlink w:anchor="_Toc202275325" w:history="1">
+          <w:hyperlink w:anchor="_Toc202387375" w:history="1">
             <w:r>
               <w:rPr>
                 <w:rStyle w:val="Hyperlink"/>
@@ -2035,7 +2913,7 @@
                 <w:noProof/>
                 <w:webHidden/>
               </w:rPr>
-              <w:instrText xml:space="preserve"> PAGEREF _Toc202275325 \h </w:instrText>
+              <w:instrText xml:space="preserve"> PAGEREF _Toc202387375 \h </w:instrText>
             </w:r>
             <w:r>
               <w:rPr>
@@ -2077,7 +2955,7 @@
               <w:noProof/>
             </w:rPr>
           </w:pPr>
-          <w:hyperlink w:anchor="_Toc202275326" w:history="1">
+          <w:hyperlink w:anchor="_Toc202387376" w:history="1">
             <w:r>
               <w:rPr>
                 <w:rStyle w:val="Hyperlink"/>
@@ -2104,7 +2982,7 @@
                 <w:noProof/>
                 <w:webHidden/>
               </w:rPr>
-              <w:instrText xml:space="preserve"> PAGEREF _Toc202275326 \h </w:instrText>
+              <w:instrText xml:space="preserve"> PAGEREF _Toc202387376 \h </w:instrText>
             </w:r>
             <w:r>
               <w:rPr>
@@ -2146,7 +3024,7 @@
               <w:noProof/>
             </w:rPr>
           </w:pPr>
-          <w:hyperlink w:anchor="_Toc202275327" w:history="1">
+          <w:hyperlink w:anchor="_Toc202387377" w:history="1">
             <w:r>
               <w:rPr>
                 <w:rStyle w:val="Hyperlink"/>
@@ -2173,7 +3051,7 @@
                 <w:noProof/>
                 <w:webHidden/>
               </w:rPr>
-              <w:instrText xml:space="preserve"> PAGEREF _Toc202275327 \h </w:instrText>
+              <w:instrText xml:space="preserve"> PAGEREF _Toc202387377 \h </w:instrText>
             </w:r>
             <w:r>
               <w:rPr>
@@ -2215,7 +3093,7 @@
               <w:noProof/>
             </w:rPr>
           </w:pPr>
-          <w:hyperlink w:anchor="_Toc202275328" w:history="1">
+          <w:hyperlink w:anchor="_Toc202387378" w:history="1">
             <w:r>
               <w:rPr>
                 <w:rStyle w:val="Hyperlink"/>
@@ -2242,7 +3120,7 @@
                 <w:noProof/>
                 <w:webHidden/>
               </w:rPr>
-              <w:instrText xml:space="preserve"> PAGEREF _Toc202275328 \h </w:instrText>
+              <w:instrText xml:space="preserve"> PAGEREF _Toc202387378 \h </w:instrText>
             </w:r>
             <w:r>
               <w:rPr>
@@ -2326,7 +3204,7 @@
           <w:r>
             <w:fldChar w:fldCharType="separate"/>
           </w:r>
-          <w:hyperlink w:anchor="_Toc202275329" w:history="1">
+          <w:hyperlink w:anchor="_Toc202387381" w:history="1">
             <w:r>
               <w:rPr>
                 <w:rStyle w:val="Hyperlink"/>
@@ -2353,7 +3231,7 @@
                 <w:noProof/>
                 <w:webHidden/>
               </w:rPr>
-              <w:instrText xml:space="preserve"> PAGEREF _Toc202275329 \h </w:instrText>
+              <w:instrText xml:space="preserve"> PAGEREF _Toc202387381 \h </w:instrText>
             </w:r>
             <w:r>
               <w:rPr>
@@ -2395,7 +3273,7 @@
               <w:noProof/>
             </w:rPr>
           </w:pPr>
-          <w:hyperlink w:anchor="_Toc202275330" w:history="1">
+          <w:hyperlink w:anchor="_Toc202387382" w:history="1">
             <w:r>
               <w:rPr>
                 <w:rStyle w:val="Hyperlink"/>
@@ -2422,7 +3300,7 @@
                 <w:noProof/>
                 <w:webHidden/>
               </w:rPr>
-              <w:instrText xml:space="preserve"> PAGEREF _Toc202275330 \h </w:instrText>
+              <w:instrText xml:space="preserve"> PAGEREF _Toc202387382 \h </w:instrText>
             </w:r>
             <w:r>
               <w:rPr>
@@ -2464,7 +3342,7 @@
               <w:noProof/>
             </w:rPr>
           </w:pPr>
-          <w:hyperlink w:anchor="_Toc202275331" w:history="1">
+          <w:hyperlink w:anchor="_Toc202387383" w:history="1">
             <w:r>
               <w:rPr>
                 <w:rStyle w:val="Hyperlink"/>
@@ -2491,7 +3369,7 @@
                 <w:noProof/>
                 <w:webHidden/>
               </w:rPr>
-              <w:instrText xml:space="preserve"> PAGEREF _Toc202275331 \h </w:instrText>
+              <w:instrText xml:space="preserve"> PAGEREF _Toc202387383 \h </w:instrText>
             </w:r>
             <w:r>
               <w:rPr>
@@ -2533,7 +3411,7 @@
               <w:noProof/>
             </w:rPr>
           </w:pPr>
-          <w:hyperlink w:anchor="_Toc202275332" w:history="1">
+          <w:hyperlink w:anchor="_Toc202387384" w:history="1">
             <w:r>
               <w:rPr>
                 <w:rStyle w:val="Hyperlink"/>
@@ -2560,7 +3438,7 @@
                 <w:noProof/>
                 <w:webHidden/>
               </w:rPr>
-              <w:instrText xml:space="preserve"> PAGEREF _Toc202275332 \h </w:instrText>
+              <w:instrText xml:space="preserve"> PAGEREF _Toc202387384 \h </w:instrText>
             </w:r>
             <w:r>
               <w:rPr>
@@ -2580,7 +3458,7 @@
                 <w:noProof/>
                 <w:webHidden/>
               </w:rPr>
-              <w:t>10</w:t>
+              <w:t>11</w:t>
             </w:r>
             <w:r>
               <w:rPr>
@@ -2602,7 +3480,7 @@
               <w:noProof/>
             </w:rPr>
           </w:pPr>
-          <w:hyperlink w:anchor="_Toc202275333" w:history="1">
+          <w:hyperlink w:anchor="_Toc202387385" w:history="1">
             <w:r>
               <w:rPr>
                 <w:rStyle w:val="Hyperlink"/>
@@ -2629,7 +3507,7 @@
                 <w:noProof/>
                 <w:webHidden/>
               </w:rPr>
-              <w:instrText xml:space="preserve"> PAGEREF _Toc202275333 \h </w:instrText>
+              <w:instrText xml:space="preserve"> PAGEREF _Toc202387385 \h </w:instrText>
             </w:r>
             <w:r>
               <w:rPr>
@@ -2670,7 +3548,7 @@
     <w:p>
       <w:pPr>
         <w:sectPr>
-          <w:footerReference w:type="default" r:id="rId11"/>
+          <w:footerReference w:type="default" r:id="rId12"/>
           <w:pgSz w:w="12240" w:h="15840"/>
           <w:pgMar w:top="1440" w:right="1440" w:bottom="1440" w:left="1440" w:header="720" w:footer="720" w:gutter="0"/>
           <w:cols w:space="720"/>
@@ -2685,7 +3563,7 @@
           <w:rFonts w:eastAsia="Times New Roman"/>
         </w:rPr>
       </w:pPr>
-      <w:bookmarkStart w:id="0" w:name="_Toc202275306"/>
+      <w:bookmarkStart w:id="0" w:name="_Toc202387348"/>
       <w:r>
         <w:rPr>
           <w:rFonts w:eastAsia="Times New Roman"/>
@@ -2703,10 +3581,16 @@
         <w:t>,</w:t>
       </w:r>
       <w:r>
-        <w:t xml:space="preserve"> such as hurricane</w:t>
-      </w:r>
-      <w:r>
-        <w:t>s,</w:t>
+        <w:t xml:space="preserve"> such as </w:t>
+      </w:r>
+      <w:r>
+        <w:t xml:space="preserve">a </w:t>
+      </w:r>
+      <w:r>
+        <w:t>hurricane</w:t>
+      </w:r>
+      <w:r>
+        <w:t>,</w:t>
       </w:r>
       <w:r>
         <w:t xml:space="preserve"> impacts a community, government entities rely on metrics from property appraisers to quantify and categorize the damages. For example: </w:t>
@@ -2764,7 +3648,51 @@
         <w:t xml:space="preserve"> a buyer would pay to purchase the property</w:t>
       </w:r>
       <w:r>
-        <w:t>. As a result, estimating total impacts can be challenging, and reimbursement programs may undervalue properties</w:t>
+        <w:t xml:space="preserve">. </w:t>
+      </w:r>
+      <w:r>
+        <w:t xml:space="preserve">In addition, </w:t>
+      </w:r>
+      <w:r>
+        <w:t xml:space="preserve">programs such as the Save Our Homes Act </w:t>
+      </w:r>
+      <w:r>
+        <w:t>introduces bias by limiting the annual increase in the assessed value of homesteaded properties to 3% or the change in the Consumer Price Index (CPI), whichever is less</w:t>
+      </w:r>
+      <w:r>
+        <w:t xml:space="preserve"> </w:t>
+      </w:r>
+      <w:sdt>
+        <w:sdtPr>
+          <w:id w:val="-1442139829"/>
+          <w:citation/>
+        </w:sdtPr>
+        <w:sdtContent>
+          <w:r>
+            <w:fldChar w:fldCharType="begin"/>
+          </w:r>
+          <w:r>
+            <w:instrText xml:space="preserve">CITATION Flo25 \l 1033 </w:instrText>
+          </w:r>
+          <w:r>
+            <w:fldChar w:fldCharType="separate"/>
+          </w:r>
+          <w:r>
+            <w:rPr>
+              <w:noProof/>
+            </w:rPr>
+            <w:t>(Florida Legislature, 2025)</w:t>
+          </w:r>
+          <w:r>
+            <w:fldChar w:fldCharType="end"/>
+          </w:r>
+        </w:sdtContent>
+      </w:sdt>
+      <w:r>
+        <w:t xml:space="preserve">. </w:t>
+      </w:r>
+      <w:r>
+        <w:t>As a result, estimating total impacts can be challenging, and reimbursement programs may undervalue properties</w:t>
       </w:r>
       <w:r>
         <w:t xml:space="preserve"> leaving substantial financial burdens on the residents</w:t>
@@ -2990,7 +3918,7 @@
           <w:rFonts w:eastAsia="Times New Roman"/>
         </w:rPr>
       </w:pPr>
-      <w:bookmarkStart w:id="1" w:name="_Toc202275307"/>
+      <w:bookmarkStart w:id="1" w:name="_Toc202387349"/>
       <w:r>
         <w:rPr>
           <w:rFonts w:eastAsia="Times New Roman"/>
@@ -3080,7 +4008,11 @@
         <w:t xml:space="preserve">cross-validation </w:t>
       </w:r>
       <w:r>
-        <w:t>error. Once the optimal hyperparameters are determined, the model</w:t>
+        <w:t xml:space="preserve">error. Once the optimal </w:t>
+      </w:r>
+      <w:r>
+        <w:lastRenderedPageBreak/>
+        <w:t>hyperparameters are determined, the model</w:t>
       </w:r>
       <w:r>
         <w:t>s</w:t>
@@ -3123,7 +4055,6 @@
             <w:rPr>
               <w:rFonts w:ascii="Cambria Math" w:hAnsi="Cambria Math"/>
             </w:rPr>
-            <w:lastRenderedPageBreak/>
             <m:t>RMSE</m:t>
           </m:r>
           <m:r>
@@ -3351,13 +4282,7 @@
       </w:r>
       <w:hyperlink w:anchor="_Appendix_A:_Analytical" w:history="1">
         <w:r>
-          <w:t>Appendi</w:t>
-        </w:r>
-        <w:r>
-          <w:t>x</w:t>
-        </w:r>
-        <w:r>
-          <w:t xml:space="preserve"> A</w:t>
+          <w:t>Appendix A</w:t>
         </w:r>
       </w:hyperlink>
       <w:r>
@@ -3374,7 +4299,7 @@
       <w:pPr>
         <w:pStyle w:val="Heading2"/>
       </w:pPr>
-      <w:bookmarkStart w:id="2" w:name="_Toc202275308"/>
+      <w:bookmarkStart w:id="2" w:name="_Toc202387350"/>
       <w:r>
         <w:t>Models</w:t>
       </w:r>
@@ -3451,19 +4376,10 @@
         <w:t>evaluate</w:t>
       </w:r>
       <w:r>
-        <w:t xml:space="preserve"> complex patterns through a deep learning approach. </w:t>
-      </w:r>
-      <w:r>
-        <w:t xml:space="preserve">These models were selected to represent a diverse range of predictive </w:t>
-      </w:r>
-      <w:r>
-        <w:t xml:space="preserve">approaches </w:t>
-      </w:r>
-      <w:r>
-        <w:t>and balances interpretability and complexity</w:t>
-      </w:r>
-      <w:r>
-        <w:t xml:space="preserve"> using machine learning and deep learning.</w:t>
+        <w:t xml:space="preserve"> complex patterns through a deep learning approach. These models were selected to represent a diverse range of predictive </w:t>
+      </w:r>
+      <w:r>
+        <w:t>approaches and balances interpretability and complexity using machine learning and deep learning.</w:t>
       </w:r>
     </w:p>
     <w:p/>
@@ -3471,7 +4387,7 @@
       <w:pPr>
         <w:pStyle w:val="Heading3"/>
       </w:pPr>
-      <w:bookmarkStart w:id="3" w:name="_Toc202275309"/>
+      <w:bookmarkStart w:id="3" w:name="_Toc202387351"/>
       <w:r>
         <w:t>Linear Regression</w:t>
       </w:r>
@@ -3892,19 +4808,7 @@
           <w:rPr>
             <w:rFonts w:ascii="Cambria Math" w:eastAsiaTheme="minorEastAsia" w:hAnsi="Cambria Math"/>
           </w:rPr>
-          <m:t>:  Coefficient for the j</m:t>
-        </m:r>
-        <m:r>
-          <w:rPr>
-            <w:rFonts w:ascii="Cambria Math" w:eastAsiaTheme="minorEastAsia" w:hAnsi="Cambria Math"/>
-          </w:rPr>
-          <m:t>'</m:t>
-        </m:r>
-        <m:r>
-          <w:rPr>
-            <w:rFonts w:ascii="Cambria Math" w:eastAsiaTheme="minorEastAsia" w:hAnsi="Cambria Math"/>
-          </w:rPr>
-          <m:t>th feature</m:t>
+          <m:t>:  Coefficient for the j'th feature</m:t>
         </m:r>
       </m:oMath>
     </w:p>
@@ -3950,19 +4854,7 @@
           <w:rPr>
             <w:rFonts w:ascii="Cambria Math" w:eastAsiaTheme="minorEastAsia" w:hAnsi="Cambria Math"/>
           </w:rPr>
-          <m:t>:  Input of the j</m:t>
-        </m:r>
-        <m:r>
-          <w:rPr>
-            <w:rFonts w:ascii="Cambria Math" w:eastAsiaTheme="minorEastAsia" w:hAnsi="Cambria Math"/>
-          </w:rPr>
-          <m:t>'</m:t>
-        </m:r>
-        <m:r>
-          <w:rPr>
-            <w:rFonts w:ascii="Cambria Math" w:eastAsiaTheme="minorEastAsia" w:hAnsi="Cambria Math"/>
-          </w:rPr>
-          <m:t>th predictor</m:t>
+          <m:t>:  Input of the j'th predictor</m:t>
         </m:r>
       </m:oMath>
     </w:p>
@@ -3982,13 +4874,7 @@
           <w:rPr>
             <w:rFonts w:ascii="Cambria Math" w:eastAsiaTheme="minorEastAsia" w:hAnsi="Cambria Math"/>
           </w:rPr>
-          <m:t>n</m:t>
-        </m:r>
-        <m:r>
-          <w:rPr>
-            <w:rFonts w:ascii="Cambria Math" w:eastAsiaTheme="minorEastAsia" w:hAnsi="Cambria Math"/>
-          </w:rPr>
-          <m:t>:  Number of features</m:t>
+          <m:t>n:  Number of features</m:t>
         </m:r>
       </m:oMath>
     </w:p>
@@ -4003,7 +4889,7 @@
       <w:pPr>
         <w:pStyle w:val="Heading3"/>
       </w:pPr>
-      <w:bookmarkStart w:id="4" w:name="_Toc202275310"/>
+      <w:bookmarkStart w:id="4" w:name="_Toc202387352"/>
       <w:r>
         <w:t>Elastic Net</w:t>
       </w:r>
@@ -4032,6 +4918,7 @@
     <w:p/>
     <w:p>
       <w:r>
+        <w:lastRenderedPageBreak/>
         <w:t>Elastic Net</w:t>
       </w:r>
       <w:r>
@@ -4060,7 +4947,6 @@
             <w:rPr>
               <w:rFonts w:ascii="Cambria Math" w:hAnsi="Cambria Math"/>
             </w:rPr>
-            <w:lastRenderedPageBreak/>
             <m:t>Loss</m:t>
           </m:r>
           <m:r>
@@ -4833,7 +5719,7 @@
       <w:pPr>
         <w:pStyle w:val="Heading3"/>
       </w:pPr>
-      <w:bookmarkStart w:id="5" w:name="_Toc202275311"/>
+      <w:bookmarkStart w:id="5" w:name="_Toc202387353"/>
       <w:r>
         <w:t>Random Forest</w:t>
       </w:r>
@@ -5156,19 +6042,7 @@
           <w:rPr>
             <w:rFonts w:ascii="Cambria Math" w:eastAsiaTheme="minorEastAsia" w:hAnsi="Cambria Math"/>
           </w:rPr>
-          <m:t>:  Prediction from the t</m:t>
-        </m:r>
-        <m:r>
-          <w:rPr>
-            <w:rFonts w:ascii="Cambria Math" w:eastAsiaTheme="minorEastAsia" w:hAnsi="Cambria Math"/>
-          </w:rPr>
-          <m:t>'</m:t>
-        </m:r>
-        <m:r>
-          <w:rPr>
-            <w:rFonts w:ascii="Cambria Math" w:eastAsiaTheme="minorEastAsia" w:hAnsi="Cambria Math"/>
-          </w:rPr>
-          <m:t>th decision tree</m:t>
+          <m:t>:  Prediction from the t'th decision tree</m:t>
         </m:r>
       </m:oMath>
     </w:p>
@@ -5197,7 +6071,7 @@
       <w:pPr>
         <w:pStyle w:val="Heading3"/>
       </w:pPr>
-      <w:bookmarkStart w:id="6" w:name="_Toc202275312"/>
+      <w:bookmarkStart w:id="6" w:name="_Toc202387354"/>
       <w:r>
         <w:t>Artificial Neural Network</w:t>
       </w:r>
@@ -6018,7 +6892,7 @@
       <w:pPr>
         <w:pStyle w:val="Heading3"/>
       </w:pPr>
-      <w:bookmarkStart w:id="7" w:name="_Toc202275313"/>
+      <w:bookmarkStart w:id="7" w:name="_Toc202387355"/>
       <w:r>
         <w:t>Light Gradient Boosting Machine</w:t>
       </w:r>
@@ -6484,7 +7358,7 @@
           <w:rFonts w:eastAsiaTheme="minorEastAsia"/>
         </w:rPr>
       </w:pPr>
-      <w:bookmarkStart w:id="8" w:name="_Toc202275314"/>
+      <w:bookmarkStart w:id="8" w:name="_Toc202387356"/>
       <w:r>
         <w:rPr>
           <w:rFonts w:eastAsiaTheme="minorEastAsia"/>
@@ -6539,32 +7413,19 @@
         <w:keepNext/>
         <w:jc w:val="center"/>
       </w:pPr>
-      <w:bookmarkStart w:id="9" w:name="_Toc202275329"/>
+      <w:bookmarkStart w:id="9" w:name="_Toc202387381"/>
       <w:r>
         <w:lastRenderedPageBreak/>
         <w:t xml:space="preserve">Table </w:t>
       </w:r>
-      <w:r>
-        <w:fldChar w:fldCharType="begin"/>
-      </w:r>
-      <w:r>
-        <w:instrText xml:space="preserve"> SEQ Table \* ARABIC </w:instrText>
-      </w:r>
-      <w:r>
-        <w:fldChar w:fldCharType="separate"/>
-      </w:r>
-      <w:r>
-        <w:rPr>
-          <w:noProof/>
-        </w:rPr>
-        <w:t>1</w:t>
-      </w:r>
-      <w:r>
-        <w:rPr>
-          <w:noProof/>
-        </w:rPr>
-        <w:fldChar w:fldCharType="end"/>
-      </w:r>
+      <w:fldSimple w:instr=" SEQ Table \* ARABIC ">
+        <w:r>
+          <w:rPr>
+            <w:noProof/>
+          </w:rPr>
+          <w:t>1</w:t>
+        </w:r>
+      </w:fldSimple>
       <w:r>
         <w:t>: Schema for Finalized Data</w:t>
       </w:r>
@@ -8106,7 +8967,7 @@
       <w:pPr>
         <w:pStyle w:val="Heading2"/>
       </w:pPr>
-      <w:bookmarkStart w:id="10" w:name="_Toc202275315"/>
+      <w:bookmarkStart w:id="10" w:name="_Toc202387357"/>
       <w:r>
         <w:t>Land Use</w:t>
       </w:r>
@@ -8143,10 +9004,7 @@
         <w:t xml:space="preserve"> (87.26%, n=</w:t>
       </w:r>
       <w:r>
-        <w:t xml:space="preserve"> </w:t>
-      </w:r>
-      <w:r>
-        <w:t>2</w:t>
+        <w:t xml:space="preserve"> 2</w:t>
       </w:r>
       <w:r>
         <w:t>,</w:t>
@@ -8195,31 +9053,18 @@
         <w:keepNext/>
         <w:jc w:val="center"/>
       </w:pPr>
-      <w:bookmarkStart w:id="11" w:name="_Toc202275330"/>
+      <w:bookmarkStart w:id="11" w:name="_Toc202387382"/>
       <w:r>
         <w:t xml:space="preserve">Table </w:t>
       </w:r>
-      <w:r>
-        <w:fldChar w:fldCharType="begin"/>
-      </w:r>
-      <w:r>
-        <w:instrText xml:space="preserve"> SEQ Table \* ARABIC </w:instrText>
-      </w:r>
-      <w:r>
-        <w:fldChar w:fldCharType="separate"/>
-      </w:r>
-      <w:r>
-        <w:rPr>
-          <w:noProof/>
-        </w:rPr>
-        <w:t>2</w:t>
-      </w:r>
-      <w:r>
-        <w:rPr>
-          <w:noProof/>
-        </w:rPr>
-        <w:fldChar w:fldCharType="end"/>
-      </w:r>
+      <w:fldSimple w:instr=" SEQ Table \* ARABIC ">
+        <w:r>
+          <w:rPr>
+            <w:noProof/>
+          </w:rPr>
+          <w:t>2</w:t>
+        </w:r>
+      </w:fldSimple>
       <w:r>
         <w:t>: Land Use Breakdown for Raw Data</w:t>
       </w:r>
@@ -9064,7 +9909,7 @@
       <w:pPr>
         <w:pStyle w:val="Heading2"/>
       </w:pPr>
-      <w:bookmarkStart w:id="12" w:name="_Toc202275316"/>
+      <w:bookmarkStart w:id="12" w:name="_Toc202387358"/>
       <w:r>
         <w:lastRenderedPageBreak/>
         <w:t>Time Frame</w:t>
@@ -9105,10 +9950,7 @@
         </w:sdtContent>
       </w:sdt>
       <w:r>
-        <w:t>. To avoid significant financial events such as the Subprime Mortgage Crisis which started in 2007 and eventually led to a housing market crash in 2008, records from 2014-2024 are used for this analysis.</w:t>
-      </w:r>
-      <w:r>
-        <w:t xml:space="preserve"> </w:t>
+        <w:t xml:space="preserve">. To avoid significant financial events such as the Subprime Mortgage Crisis which started in 2007 and eventually led to a housing market crash in 2008, records from 2014-2024 are used for this analysis. </w:t>
       </w:r>
       <w:r>
         <w:t>The figure below shows the distribution of sales by year.</w:t>
@@ -9120,31 +9962,18 @@
         <w:keepNext/>
         <w:jc w:val="center"/>
       </w:pPr>
-      <w:bookmarkStart w:id="13" w:name="_Toc202275325"/>
+      <w:bookmarkStart w:id="13" w:name="_Toc202387375"/>
       <w:r>
         <w:t xml:space="preserve">Figure </w:t>
       </w:r>
-      <w:r>
-        <w:fldChar w:fldCharType="begin"/>
-      </w:r>
-      <w:r>
-        <w:instrText xml:space="preserve"> SEQ Figure \* ARABIC </w:instrText>
-      </w:r>
-      <w:r>
-        <w:fldChar w:fldCharType="separate"/>
-      </w:r>
-      <w:r>
-        <w:rPr>
-          <w:noProof/>
-        </w:rPr>
-        <w:t>1</w:t>
-      </w:r>
-      <w:r>
-        <w:rPr>
-          <w:noProof/>
-        </w:rPr>
-        <w:fldChar w:fldCharType="end"/>
-      </w:r>
+      <w:fldSimple w:instr=" SEQ Figure \* ARABIC ">
+        <w:r>
+          <w:rPr>
+            <w:noProof/>
+          </w:rPr>
+          <w:t>1</w:t>
+        </w:r>
+      </w:fldSimple>
       <w:r>
         <w:t>: Sales Distribution for Raw Data</w:t>
       </w:r>
@@ -9185,7 +10014,7 @@
                     </pic:cNvPicPr>
                   </pic:nvPicPr>
                   <pic:blipFill>
-                    <a:blip r:embed="rId12">
+                    <a:blip r:embed="rId13">
                       <a:extLst>
                         <a:ext uri="{28A0092B-C50C-407E-A947-70E740481C1C}">
                           <a14:useLocalDpi xmlns:a14="http://schemas.microsoft.com/office/drawing/2010/main" val="0"/>
@@ -9217,7 +10046,7 @@
       <w:pPr>
         <w:pStyle w:val="Heading2"/>
       </w:pPr>
-      <w:bookmarkStart w:id="14" w:name="_Toc202275317"/>
+      <w:bookmarkStart w:id="14" w:name="_Toc202387359"/>
       <w:r>
         <w:t>Outliers</w:t>
       </w:r>
@@ -9231,7 +10060,19 @@
         <w:t>and</w:t>
       </w:r>
       <w:r>
-        <w:t xml:space="preserve"> sentinel values are systematically removed using an Isolation Forest. This model</w:t>
+        <w:t xml:space="preserve"> sentinel values are systematically removed using </w:t>
+      </w:r>
+      <w:r>
+        <w:t xml:space="preserve">a minimum sales value of </w:t>
+      </w:r>
+      <w:r>
+        <w:t>$</w:t>
+      </w:r>
+      <w:r>
+        <w:t xml:space="preserve">50,000 and </w:t>
+      </w:r>
+      <w:r>
+        <w:t>an Isolation Forest. This model</w:t>
       </w:r>
       <w:r>
         <w:t xml:space="preserve"> is an anomaly detection algorithm </w:t>
@@ -9252,28 +10093,37 @@
         <w:t>es</w:t>
       </w:r>
       <w:r>
-        <w:t xml:space="preserve"> observations by randomly selecting features and split</w:t>
-      </w:r>
-      <w:r>
-        <w:t>s</w:t>
-      </w:r>
-      <w:r>
-        <w:t xml:space="preserve"> values</w:t>
+        <w:t xml:space="preserve"> observations by randomly selecting features and </w:t>
+      </w:r>
+      <w:r>
+        <w:t>a split value</w:t>
       </w:r>
       <w:r>
         <w:t xml:space="preserve"> until the instance is isolated or the tree reaches a predefined height limit</w:t>
       </w:r>
       <w:r>
+        <w:t xml:space="preserve"> and scores </w:t>
+      </w:r>
+      <w:r>
+        <w:t>the average path length</w:t>
+      </w:r>
+      <w:r>
         <w:t>.</w:t>
       </w:r>
       <w:r>
-        <w:t xml:space="preserve"> This uses </w:t>
-      </w:r>
-      <w:r>
-        <w:t>a</w:t>
-      </w:r>
-      <w:r>
-        <w:t xml:space="preserve"> concept that anomalies</w:t>
+        <w:t xml:space="preserve"> </w:t>
+      </w:r>
+      <w:r>
+        <w:t>The key</w:t>
+      </w:r>
+      <w:r>
+        <w:t xml:space="preserve"> concept </w:t>
+      </w:r>
+      <w:r>
+        <w:t xml:space="preserve">is </w:t>
+      </w:r>
+      <w:r>
+        <w:t>that anomalies</w:t>
       </w:r>
       <w:r>
         <w:t xml:space="preserve"> are easier to isolate because they require fewer random splits to be separated from the rest of the data.</w:t>
@@ -9841,31 +10691,18 @@
         <w:keepNext/>
         <w:jc w:val="center"/>
       </w:pPr>
-      <w:bookmarkStart w:id="15" w:name="_Toc202275326"/>
+      <w:bookmarkStart w:id="15" w:name="_Toc202387376"/>
       <w:r>
         <w:t xml:space="preserve">Figure </w:t>
       </w:r>
-      <w:r>
-        <w:fldChar w:fldCharType="begin"/>
-      </w:r>
-      <w:r>
-        <w:instrText xml:space="preserve"> SEQ Figure \* ARABIC </w:instrText>
-      </w:r>
-      <w:r>
-        <w:fldChar w:fldCharType="separate"/>
-      </w:r>
-      <w:r>
-        <w:rPr>
-          <w:noProof/>
-        </w:rPr>
-        <w:t>2</w:t>
-      </w:r>
-      <w:r>
-        <w:rPr>
-          <w:noProof/>
-        </w:rPr>
-        <w:fldChar w:fldCharType="end"/>
-      </w:r>
+      <w:fldSimple w:instr=" SEQ Figure \* ARABIC ">
+        <w:r>
+          <w:rPr>
+            <w:noProof/>
+          </w:rPr>
+          <w:t>2</w:t>
+        </w:r>
+      </w:fldSimple>
       <w:r>
         <w:t>: Outlier Removal</w:t>
       </w:r>
@@ -9909,7 +10746,7 @@
                     </pic:cNvPicPr>
                   </pic:nvPicPr>
                   <pic:blipFill>
-                    <a:blip r:embed="rId13">
+                    <a:blip r:embed="rId14">
                       <a:extLst>
                         <a:ext uri="{28A0092B-C50C-407E-A947-70E740481C1C}">
                           <a14:useLocalDpi xmlns:a14="http://schemas.microsoft.com/office/drawing/2010/main" val="0"/>
@@ -9953,7 +10790,13 @@
         <w:t xml:space="preserve"> from the Isolation Forest. This c</w:t>
       </w:r>
       <w:r>
-        <w:t xml:space="preserve">aptured both sentinel values in the lower tail and extreme high-value properties in the upper tail which are absent in the </w:t>
+        <w:t xml:space="preserve">aptured both sentinel values in the lower tail and extreme high-value </w:t>
+      </w:r>
+      <w:r>
+        <w:t>records</w:t>
+      </w:r>
+      <w:r>
+        <w:t xml:space="preserve"> in the upper tail which are absent in the </w:t>
       </w:r>
       <w:r>
         <w:rPr>
@@ -10030,7 +10873,7 @@
           <w:rFonts w:eastAsiaTheme="minorHAnsi"/>
         </w:rPr>
       </w:pPr>
-      <w:bookmarkStart w:id="16" w:name="_Toc202275318"/>
+      <w:bookmarkStart w:id="16" w:name="_Toc202387360"/>
       <w:r>
         <w:t>Multicollinearity</w:t>
       </w:r>
@@ -10056,10 +10899,19 @@
         <w:t xml:space="preserve"> </w:t>
       </w:r>
       <w:r>
+        <w:t xml:space="preserve">While </w:t>
+      </w:r>
+      <w:r>
         <w:t>Elastic Net</w:t>
       </w:r>
       <w:r>
-        <w:t xml:space="preserve"> and some other models are more reliant to multicollinearity while this can especially be problematic for simple linear models.</w:t>
+        <w:t xml:space="preserve"> and some other models are more reliant to multicollinearity</w:t>
+      </w:r>
+      <w:r>
+        <w:t xml:space="preserve">, </w:t>
+      </w:r>
+      <w:r>
+        <w:t>this can especially be problematic for simple linear models.</w:t>
       </w:r>
       <w:r>
         <w:t xml:space="preserve"> To evaluate this, a correlation heatmap </w:t>
@@ -10102,31 +10954,18 @@
         <w:keepNext/>
         <w:jc w:val="center"/>
       </w:pPr>
-      <w:bookmarkStart w:id="17" w:name="_Toc202275327"/>
+      <w:bookmarkStart w:id="17" w:name="_Toc202387377"/>
       <w:r>
         <w:t xml:space="preserve">Figure </w:t>
       </w:r>
-      <w:r>
-        <w:fldChar w:fldCharType="begin"/>
-      </w:r>
-      <w:r>
-        <w:instrText xml:space="preserve"> SEQ Figure \* ARABIC </w:instrText>
-      </w:r>
-      <w:r>
-        <w:fldChar w:fldCharType="separate"/>
-      </w:r>
-      <w:r>
-        <w:rPr>
-          <w:noProof/>
-        </w:rPr>
-        <w:t>3</w:t>
-      </w:r>
-      <w:r>
-        <w:rPr>
-          <w:noProof/>
-        </w:rPr>
-        <w:fldChar w:fldCharType="end"/>
-      </w:r>
+      <w:fldSimple w:instr=" SEQ Figure \* ARABIC ">
+        <w:r>
+          <w:rPr>
+            <w:noProof/>
+          </w:rPr>
+          <w:t>3</w:t>
+        </w:r>
+      </w:fldSimple>
       <w:r>
         <w:t>: Correlation Plot</w:t>
       </w:r>
@@ -10170,7 +11009,7 @@
                     </pic:cNvPicPr>
                   </pic:nvPicPr>
                   <pic:blipFill>
-                    <a:blip r:embed="rId14">
+                    <a:blip r:embed="rId15">
                       <a:extLst>
                         <a:ext uri="{28A0092B-C50C-407E-A947-70E740481C1C}">
                           <a14:useLocalDpi xmlns:a14="http://schemas.microsoft.com/office/drawing/2010/main" val="0"/>
@@ -10239,32 +11078,19 @@
         <w:keepNext/>
         <w:jc w:val="center"/>
       </w:pPr>
-      <w:bookmarkStart w:id="18" w:name="_Toc202275331"/>
+      <w:bookmarkStart w:id="18" w:name="_Toc202387383"/>
       <w:r>
         <w:lastRenderedPageBreak/>
         <w:t xml:space="preserve">Table </w:t>
       </w:r>
-      <w:r>
-        <w:fldChar w:fldCharType="begin"/>
-      </w:r>
-      <w:r>
-        <w:instrText xml:space="preserve"> SEQ Table \* ARABIC </w:instrText>
-      </w:r>
-      <w:r>
-        <w:fldChar w:fldCharType="separate"/>
-      </w:r>
-      <w:r>
-        <w:rPr>
-          <w:noProof/>
-        </w:rPr>
-        <w:t>3</w:t>
-      </w:r>
-      <w:r>
-        <w:rPr>
-          <w:noProof/>
-        </w:rPr>
-        <w:fldChar w:fldCharType="end"/>
-      </w:r>
+      <w:fldSimple w:instr=" SEQ Table \* ARABIC ">
+        <w:r>
+          <w:rPr>
+            <w:noProof/>
+          </w:rPr>
+          <w:t>3</w:t>
+        </w:r>
+      </w:fldSimple>
       <w:r>
         <w:t xml:space="preserve">: </w:t>
       </w:r>
@@ -11038,7 +11864,7 @@
       <w:pPr>
         <w:pStyle w:val="Heading2"/>
       </w:pPr>
-      <w:bookmarkStart w:id="19" w:name="_Toc202275319"/>
+      <w:bookmarkStart w:id="19" w:name="_Toc202387361"/>
       <w:r>
         <w:t>Transformation</w:t>
       </w:r>
@@ -11046,7 +11872,13 @@
     </w:p>
     <w:p>
       <w:r>
-        <w:t xml:space="preserve">One-hot encoding is a method to convert categorical data into numerical format by representing the values as binary vectors. This ensures models treat each category as independent and avoids implicit ordering systems. Zip codes and land use group values were one-hot encoded to allow the algorithms to understand it and use it efficiently. </w:t>
+        <w:t xml:space="preserve">One-hot encoding is a method to convert categorical data into numerical format by representing the values as binary vectors. This ensures models treat each category as independent and avoids </w:t>
+      </w:r>
+      <w:r>
+        <w:t xml:space="preserve">an </w:t>
+      </w:r>
+      <w:r>
+        <w:t xml:space="preserve">implicit ordering system. Zip codes and land use group values were one-hot encoded to allow the algorithms to understand it and use it efficiently. </w:t>
       </w:r>
     </w:p>
     <w:p/>
@@ -11057,7 +11889,13 @@
         </w:rPr>
       </w:pPr>
       <w:r>
-        <w:t xml:space="preserve">When analyzing datasets using machine learning, a normal distribution is often assumed. If ignored, the results can lead to biased parameter estimation, inaccurate confidence intervals, and faulty hypothesis testing. For this analysis, sales amounts do not follow a normal distribution and needs to be transformed prior to training. </w:t>
+        <w:t xml:space="preserve">When analyzing datasets using machine learning, a normal distribution is often assumed. If ignored, the results can lead to biased parameter estimation, inaccurate confidence intervals, and faulty hypothesis testing. For this </w:t>
+      </w:r>
+      <w:r>
+        <w:t>dataset</w:t>
+      </w:r>
+      <w:r>
+        <w:t xml:space="preserve">, sales amounts do not follow a normal distribution and needs to be transformed prior to training. </w:t>
       </w:r>
       <w:r>
         <w:t xml:space="preserve">The training data’s sales amount is </w:t>
@@ -11098,7 +11936,19 @@
         <w:rPr>
           <w:rFonts w:eastAsiaTheme="minorEastAsia"/>
         </w:rPr>
-        <w:t>formula equation and the results are shown below.</w:t>
+        <w:t xml:space="preserve">formula equation and the </w:t>
+      </w:r>
+      <w:r>
+        <w:rPr>
+          <w:rFonts w:eastAsiaTheme="minorEastAsia"/>
+        </w:rPr>
+        <w:t>distributions before and after transformation</w:t>
+      </w:r>
+      <w:r>
+        <w:rPr>
+          <w:rFonts w:eastAsiaTheme="minorEastAsia"/>
+        </w:rPr>
+        <w:t xml:space="preserve"> are shown below.</w:t>
       </w:r>
     </w:p>
     <w:p>
@@ -11217,6 +12067,13 @@
     </w:p>
     <w:p>
       <w:pPr>
+        <w:rPr>
+          <w:rFonts w:eastAsiaTheme="minorEastAsia"/>
+        </w:rPr>
+      </w:pPr>
+    </w:p>
+    <w:p>
+      <w:pPr>
         <w:pStyle w:val="ListParagraph"/>
         <w:numPr>
           <w:ilvl w:val="0"/>
@@ -11309,13 +12166,7 @@
           <w:rPr>
             <w:rFonts w:ascii="Cambria Math" w:eastAsiaTheme="minorEastAsia" w:hAnsi="Cambria Math"/>
           </w:rPr>
-          <m:t>λ:  transformation control</m:t>
-        </m:r>
-        <m:r>
-          <w:rPr>
-            <w:rFonts w:ascii="Cambria Math" w:eastAsiaTheme="minorEastAsia" w:hAnsi="Cambria Math"/>
-          </w:rPr>
-          <m:t xml:space="preserve"> value</m:t>
+          <m:t>λ:  transformation control value</m:t>
         </m:r>
       </m:oMath>
     </w:p>
@@ -11332,29 +12183,19 @@
         <w:keepNext/>
         <w:jc w:val="center"/>
       </w:pPr>
-      <w:bookmarkStart w:id="20" w:name="_Toc202275328"/>
+      <w:bookmarkStart w:id="20" w:name="_Toc202387378"/>
       <w:r>
         <w:lastRenderedPageBreak/>
         <w:t xml:space="preserve">Figure </w:t>
       </w:r>
-      <w:r>
-        <w:fldChar w:fldCharType="begin"/>
-      </w:r>
-      <w:r>
-        <w:instrText xml:space="preserve"> SEQ Figure \* ARABIC </w:instrText>
-      </w:r>
-      <w:r>
-        <w:fldChar w:fldCharType="separate"/>
-      </w:r>
-      <w:r>
-        <w:rPr>
-          <w:noProof/>
-        </w:rPr>
-        <w:t>4</w:t>
-      </w:r>
-      <w:r>
-        <w:fldChar w:fldCharType="end"/>
-      </w:r>
+      <w:fldSimple w:instr=" SEQ Figure \* ARABIC ">
+        <w:r>
+          <w:rPr>
+            <w:noProof/>
+          </w:rPr>
+          <w:t>4</w:t>
+        </w:r>
+      </w:fldSimple>
       <w:r>
         <w:t>: Box-Cox Transformation</w:t>
       </w:r>
@@ -11384,7 +12225,7 @@
                     <pic:cNvPicPr/>
                   </pic:nvPicPr>
                   <pic:blipFill>
-                    <a:blip r:embed="rId15">
+                    <a:blip r:embed="rId16">
                       <a:extLst>
                         <a:ext uri="{28A0092B-C50C-407E-A947-70E740481C1C}">
                           <a14:useLocalDpi xmlns:a14="http://schemas.microsoft.com/office/drawing/2010/main" val="0"/>
@@ -11418,7 +12259,7 @@
           <w:rFonts w:eastAsia="Times New Roman"/>
         </w:rPr>
       </w:pPr>
-      <w:bookmarkStart w:id="21" w:name="_Toc202275320"/>
+      <w:bookmarkStart w:id="21" w:name="_Toc202387362"/>
       <w:r>
         <w:rPr>
           <w:rFonts w:eastAsia="Times New Roman"/>
@@ -11431,7 +12272,7 @@
       <w:pPr>
         <w:pStyle w:val="Heading2"/>
       </w:pPr>
-      <w:bookmarkStart w:id="22" w:name="_Toc202275321"/>
+      <w:bookmarkStart w:id="22" w:name="_Toc202387363"/>
       <w:r>
         <w:t>Training</w:t>
       </w:r>
@@ -11482,7 +12323,16 @@
         <w:t>, which randomly samples from a predefined parameter grid. This approach provides a more computationally efficient approach compared to an exhaustive grid search while still exploring a wide range of hyperparameter options.</w:t>
       </w:r>
       <w:r>
-        <w:t xml:space="preserve"> The tuning process was performed using a 5-fold cross-validation and evaluated based on the RMSE to identify the optimal combination of hyperparameters for each model.</w:t>
+        <w:t xml:space="preserve"> The tuning process was performed using a 5-fold cross-validation and evaluated based on the RMSE to identify the </w:t>
+      </w:r>
+      <w:r>
+        <w:t>best</w:t>
+      </w:r>
+      <w:r>
+        <w:t xml:space="preserve"> combination of hyperparameters for each model.</w:t>
+      </w:r>
+      <w:r>
+        <w:t xml:space="preserve"> Once the best hyperparameters were selected, the parameter grid was adjusted to fine tune each model until the optimal hyperparameters were discovered. Consideration was given to inputs such as number of estimators or tree depth to avoid potentially overfitting the training data.</w:t>
       </w:r>
     </w:p>
     <w:p/>
@@ -11492,31 +12342,19 @@
         <w:keepNext/>
         <w:jc w:val="center"/>
       </w:pPr>
-      <w:bookmarkStart w:id="23" w:name="_Toc202275332"/>
-      <w:r>
+      <w:bookmarkStart w:id="23" w:name="_Toc202387384"/>
+      <w:r>
+        <w:lastRenderedPageBreak/>
         <w:t xml:space="preserve">Table </w:t>
       </w:r>
-      <w:r>
-        <w:fldChar w:fldCharType="begin"/>
-      </w:r>
-      <w:r>
-        <w:instrText xml:space="preserve"> SEQ Table \* ARABIC </w:instrText>
-      </w:r>
-      <w:r>
-        <w:fldChar w:fldCharType="separate"/>
-      </w:r>
-      <w:r>
-        <w:rPr>
-          <w:noProof/>
-        </w:rPr>
-        <w:t>4</w:t>
-      </w:r>
-      <w:r>
-        <w:rPr>
-          <w:noProof/>
-        </w:rPr>
-        <w:fldChar w:fldCharType="end"/>
-      </w:r>
+      <w:fldSimple w:instr=" SEQ Table \* ARABIC ">
+        <w:r>
+          <w:rPr>
+            <w:noProof/>
+          </w:rPr>
+          <w:t>4</w:t>
+        </w:r>
+      </w:fldSimple>
       <w:r>
         <w:t>: Parameter Grid</w:t>
       </w:r>
@@ -11524,7 +12362,7 @@
     </w:p>
     <w:tbl>
       <w:tblPr>
-        <w:tblW w:w="9080" w:type="dxa"/>
+        <w:tblW w:w="9340" w:type="dxa"/>
         <w:jc w:val="center"/>
         <w:tblCellMar>
           <w:left w:w="0" w:type="dxa"/>
@@ -11533,8 +12371,9 @@
         <w:tblLook w:val="0420" w:firstRow="1" w:lastRow="0" w:firstColumn="0" w:lastColumn="0" w:noHBand="0" w:noVBand="1"/>
       </w:tblPr>
       <w:tblGrid>
-        <w:gridCol w:w="1880"/>
-        <w:gridCol w:w="7200"/>
+        <w:gridCol w:w="1384"/>
+        <w:gridCol w:w="4424"/>
+        <w:gridCol w:w="3532"/>
       </w:tblGrid>
       <w:tr>
         <w:trPr>
@@ -11544,7 +12383,7 @@
         </w:trPr>
         <w:tc>
           <w:tcPr>
-            <w:tcW w:w="1880" w:type="dxa"/>
+            <w:tcW w:w="1384" w:type="dxa"/>
             <w:tcBorders>
               <w:top w:val="single" w:sz="8" w:space="0" w:color="3B43D7"/>
               <w:left w:val="single" w:sz="8" w:space="0" w:color="3B43D7"/>
@@ -11580,7 +12419,7 @@
         </w:tc>
         <w:tc>
           <w:tcPr>
-            <w:tcW w:w="7200" w:type="dxa"/>
+            <w:tcW w:w="4424" w:type="dxa"/>
             <w:tcBorders>
               <w:top w:val="single" w:sz="8" w:space="0" w:color="3B43D7"/>
               <w:left w:val="nil"/>
@@ -11614,6 +12453,37 @@
             </w:r>
           </w:p>
         </w:tc>
+        <w:tc>
+          <w:tcPr>
+            <w:tcW w:w="3532" w:type="dxa"/>
+            <w:tcBorders>
+              <w:top w:val="single" w:sz="8" w:space="0" w:color="3B43D7"/>
+              <w:left w:val="nil"/>
+              <w:bottom w:val="single" w:sz="8" w:space="0" w:color="3B43D7"/>
+              <w:right w:val="single" w:sz="8" w:space="0" w:color="3B43D7"/>
+            </w:tcBorders>
+            <w:shd w:val="clear" w:color="auto" w:fill="3B43D7"/>
+            <w:vAlign w:val="center"/>
+          </w:tcPr>
+          <w:p>
+            <w:pPr>
+              <w:jc w:val="center"/>
+              <w:rPr>
+                <w:b/>
+                <w:bCs/>
+                <w:color w:val="FFFFFF" w:themeColor="background1"/>
+              </w:rPr>
+            </w:pPr>
+            <w:r>
+              <w:rPr>
+                <w:b/>
+                <w:bCs/>
+                <w:color w:val="FFFFFF" w:themeColor="background1"/>
+              </w:rPr>
+              <w:t>Optimal Hyperparameters</w:t>
+            </w:r>
+          </w:p>
+        </w:tc>
       </w:tr>
       <w:tr>
         <w:trPr>
@@ -11622,7 +12492,7 @@
         </w:trPr>
         <w:tc>
           <w:tcPr>
-            <w:tcW w:w="1880" w:type="dxa"/>
+            <w:tcW w:w="1384" w:type="dxa"/>
             <w:tcBorders>
               <w:top w:val="single" w:sz="8" w:space="0" w:color="3B43D7"/>
               <w:left w:val="single" w:sz="8" w:space="0" w:color="3B43D7"/>
@@ -11658,7 +12528,7 @@
         </w:tc>
         <w:tc>
           <w:tcPr>
-            <w:tcW w:w="7200" w:type="dxa"/>
+            <w:tcW w:w="4424" w:type="dxa"/>
             <w:tcBorders>
               <w:top w:val="single" w:sz="8" w:space="0" w:color="3B43D7"/>
               <w:left w:val="nil"/>
@@ -11690,12 +12560,33 @@
               </w:rPr>
               <w:t>None</w:t>
             </w:r>
-            <w:r>
-              <w:rPr>
-                <w:sz w:val="22"/>
-                <w:szCs w:val="22"/>
-              </w:rPr>
-              <w:t>; uses default</w:t>
+          </w:p>
+        </w:tc>
+        <w:tc>
+          <w:tcPr>
+            <w:tcW w:w="3532" w:type="dxa"/>
+            <w:tcBorders>
+              <w:top w:val="single" w:sz="8" w:space="0" w:color="3B43D7"/>
+              <w:left w:val="nil"/>
+              <w:bottom w:val="single" w:sz="8" w:space="0" w:color="3B43D7"/>
+              <w:right w:val="single" w:sz="8" w:space="0" w:color="3B43D7"/>
+            </w:tcBorders>
+            <w:shd w:val="clear" w:color="auto" w:fill="E8E9F8"/>
+          </w:tcPr>
+          <w:p>
+            <w:pPr>
+              <w:jc w:val="center"/>
+              <w:rPr>
+                <w:sz w:val="22"/>
+                <w:szCs w:val="22"/>
+              </w:rPr>
+            </w:pPr>
+            <w:r>
+              <w:rPr>
+                <w:sz w:val="22"/>
+                <w:szCs w:val="22"/>
+              </w:rPr>
+              <w:t>Use default</w:t>
             </w:r>
           </w:p>
         </w:tc>
@@ -11707,7 +12598,7 @@
         </w:trPr>
         <w:tc>
           <w:tcPr>
-            <w:tcW w:w="1880" w:type="dxa"/>
+            <w:tcW w:w="1384" w:type="dxa"/>
             <w:tcBorders>
               <w:top w:val="single" w:sz="8" w:space="0" w:color="3B43D7"/>
               <w:left w:val="single" w:sz="8" w:space="0" w:color="3B43D7"/>
@@ -11743,7 +12634,7 @@
         </w:tc>
         <w:tc>
           <w:tcPr>
-            <w:tcW w:w="7200" w:type="dxa"/>
+            <w:tcW w:w="4424" w:type="dxa"/>
             <w:tcBorders>
               <w:top w:val="single" w:sz="8" w:space="0" w:color="3B43D7"/>
               <w:left w:val="nil"/>
@@ -11788,6 +12679,53 @@
             </w:r>
           </w:p>
         </w:tc>
+        <w:tc>
+          <w:tcPr>
+            <w:tcW w:w="3532" w:type="dxa"/>
+            <w:tcBorders>
+              <w:top w:val="single" w:sz="8" w:space="0" w:color="3B43D7"/>
+              <w:left w:val="nil"/>
+              <w:bottom w:val="single" w:sz="8" w:space="0" w:color="3B43D7"/>
+              <w:right w:val="single" w:sz="8" w:space="0" w:color="3B43D7"/>
+            </w:tcBorders>
+          </w:tcPr>
+          <w:p>
+            <w:pPr>
+              <w:jc w:val="center"/>
+              <w:rPr>
+                <w:rFonts w:eastAsia="Aptos"/>
+                <w:sz w:val="22"/>
+                <w:szCs w:val="22"/>
+              </w:rPr>
+            </w:pPr>
+            <m:oMath>
+              <m:r>
+                <w:rPr>
+                  <w:rFonts w:ascii="Cambria Math" w:eastAsia="Aptos" w:hAnsi="Cambria Math"/>
+                  <w:sz w:val="22"/>
+                  <w:szCs w:val="22"/>
+                </w:rPr>
+                <m:t>α</m:t>
+              </m:r>
+            </m:oMath>
+            <w:r>
+              <w:rPr>
+                <w:rFonts w:eastAsia="Aptos"/>
+                <w:sz w:val="22"/>
+                <w:szCs w:val="22"/>
+              </w:rPr>
+              <w:t>=0.001</w:t>
+            </w:r>
+            <w:r>
+              <w:rPr>
+                <w:rFonts w:eastAsia="Aptos"/>
+                <w:sz w:val="22"/>
+                <w:szCs w:val="22"/>
+              </w:rPr>
+              <w:t>, L1=0.01</w:t>
+            </w:r>
+          </w:p>
+        </w:tc>
       </w:tr>
       <w:tr>
         <w:trPr>
@@ -11796,7 +12734,7 @@
         </w:trPr>
         <w:tc>
           <w:tcPr>
-            <w:tcW w:w="1880" w:type="dxa"/>
+            <w:tcW w:w="1384" w:type="dxa"/>
             <w:tcBorders>
               <w:top w:val="single" w:sz="8" w:space="0" w:color="3B43D7"/>
               <w:left w:val="single" w:sz="8" w:space="0" w:color="3B43D7"/>
@@ -11826,14 +12764,13 @@
                 <w:sz w:val="22"/>
                 <w:szCs w:val="22"/>
               </w:rPr>
-              <w:lastRenderedPageBreak/>
               <w:t>Random Forest</w:t>
             </w:r>
           </w:p>
         </w:tc>
         <w:tc>
           <w:tcPr>
-            <w:tcW w:w="7200" w:type="dxa"/>
+            <w:tcW w:w="4424" w:type="dxa"/>
             <w:tcBorders>
               <w:top w:val="single" w:sz="8" w:space="0" w:color="3B43D7"/>
               <w:left w:val="nil"/>
@@ -11867,6 +12804,69 @@
             </w:r>
           </w:p>
         </w:tc>
+        <w:tc>
+          <w:tcPr>
+            <w:tcW w:w="3532" w:type="dxa"/>
+            <w:tcBorders>
+              <w:top w:val="single" w:sz="8" w:space="0" w:color="3B43D7"/>
+              <w:left w:val="nil"/>
+              <w:bottom w:val="single" w:sz="8" w:space="0" w:color="3B43D7"/>
+              <w:right w:val="single" w:sz="8" w:space="0" w:color="3B43D7"/>
+            </w:tcBorders>
+            <w:shd w:val="clear" w:color="auto" w:fill="E8E9F8"/>
+          </w:tcPr>
+          <w:p>
+            <w:pPr>
+              <w:jc w:val="center"/>
+              <w:rPr>
+                <w:sz w:val="22"/>
+                <w:szCs w:val="22"/>
+              </w:rPr>
+            </w:pPr>
+            <w:r>
+              <w:rPr>
+                <w:sz w:val="22"/>
+                <w:szCs w:val="22"/>
+              </w:rPr>
+              <w:t>m</w:t>
+            </w:r>
+            <w:r>
+              <w:rPr>
+                <w:sz w:val="22"/>
+                <w:szCs w:val="22"/>
+              </w:rPr>
+              <w:t>ax</w:t>
+            </w:r>
+            <w:r>
+              <w:rPr>
+                <w:sz w:val="22"/>
+                <w:szCs w:val="22"/>
+              </w:rPr>
+              <w:t xml:space="preserve"> </w:t>
+            </w:r>
+            <w:r>
+              <w:rPr>
+                <w:sz w:val="22"/>
+                <w:szCs w:val="22"/>
+              </w:rPr>
+              <w:t>depth=25, n</w:t>
+            </w:r>
+            <w:r>
+              <w:rPr>
+                <w:sz w:val="22"/>
+                <w:szCs w:val="22"/>
+              </w:rPr>
+              <w:t xml:space="preserve">umber of </w:t>
+            </w:r>
+            <w:r>
+              <w:rPr>
+                <w:sz w:val="22"/>
+                <w:szCs w:val="22"/>
+              </w:rPr>
+              <w:t>estimators=425</w:t>
+            </w:r>
+          </w:p>
+        </w:tc>
       </w:tr>
       <w:tr>
         <w:trPr>
@@ -11875,7 +12875,7 @@
         </w:trPr>
         <w:tc>
           <w:tcPr>
-            <w:tcW w:w="1880" w:type="dxa"/>
+            <w:tcW w:w="1384" w:type="dxa"/>
             <w:tcBorders>
               <w:top w:val="single" w:sz="8" w:space="0" w:color="3B43D7"/>
               <w:left w:val="single" w:sz="8" w:space="0" w:color="3B43D7"/>
@@ -11913,7 +12913,7 @@
         </w:tc>
         <w:tc>
           <w:tcPr>
-            <w:tcW w:w="7200" w:type="dxa"/>
+            <w:tcW w:w="4424" w:type="dxa"/>
             <w:tcBorders>
               <w:top w:val="single" w:sz="8" w:space="0" w:color="3B43D7"/>
               <w:left w:val="nil"/>
@@ -11947,6 +12947,138 @@
             </w:r>
           </w:p>
         </w:tc>
+        <w:tc>
+          <w:tcPr>
+            <w:tcW w:w="3532" w:type="dxa"/>
+            <w:tcBorders>
+              <w:top w:val="single" w:sz="8" w:space="0" w:color="3B43D7"/>
+              <w:left w:val="nil"/>
+              <w:bottom w:val="single" w:sz="8" w:space="0" w:color="3B43D7"/>
+              <w:right w:val="single" w:sz="8" w:space="0" w:color="3B43D7"/>
+            </w:tcBorders>
+          </w:tcPr>
+          <w:p>
+            <w:pPr>
+              <w:jc w:val="center"/>
+              <w:rPr>
+                <w:sz w:val="22"/>
+                <w:szCs w:val="22"/>
+              </w:rPr>
+            </w:pPr>
+            <w:r>
+              <w:rPr>
+                <w:sz w:val="22"/>
+                <w:szCs w:val="22"/>
+              </w:rPr>
+              <w:t>l</w:t>
+            </w:r>
+            <w:r>
+              <w:rPr>
+                <w:sz w:val="22"/>
+                <w:szCs w:val="22"/>
+              </w:rPr>
+              <w:t>earning</w:t>
+            </w:r>
+            <w:r>
+              <w:rPr>
+                <w:sz w:val="22"/>
+                <w:szCs w:val="22"/>
+              </w:rPr>
+              <w:t xml:space="preserve"> </w:t>
+            </w:r>
+            <w:r>
+              <w:rPr>
+                <w:sz w:val="22"/>
+                <w:szCs w:val="22"/>
+              </w:rPr>
+              <w:t>rate=0.05, min</w:t>
+            </w:r>
+            <w:r>
+              <w:rPr>
+                <w:sz w:val="22"/>
+                <w:szCs w:val="22"/>
+              </w:rPr>
+              <w:t xml:space="preserve"> </w:t>
+            </w:r>
+            <w:r>
+              <w:rPr>
+                <w:sz w:val="22"/>
+                <w:szCs w:val="22"/>
+              </w:rPr>
+              <w:t>child</w:t>
+            </w:r>
+            <w:r>
+              <w:rPr>
+                <w:sz w:val="22"/>
+                <w:szCs w:val="22"/>
+              </w:rPr>
+              <w:t xml:space="preserve"> </w:t>
+            </w:r>
+            <w:r>
+              <w:rPr>
+                <w:sz w:val="22"/>
+                <w:szCs w:val="22"/>
+              </w:rPr>
+              <w:t>samples=10,</w:t>
+            </w:r>
+            <w:r>
+              <w:rPr>
+                <w:sz w:val="22"/>
+                <w:szCs w:val="22"/>
+              </w:rPr>
+              <w:t xml:space="preserve"> </w:t>
+            </w:r>
+            <w:r>
+              <w:rPr>
+                <w:sz w:val="22"/>
+                <w:szCs w:val="22"/>
+              </w:rPr>
+              <w:t>n</w:t>
+            </w:r>
+            <w:r>
+              <w:rPr>
+                <w:sz w:val="22"/>
+                <w:szCs w:val="22"/>
+              </w:rPr>
+              <w:t xml:space="preserve"> </w:t>
+            </w:r>
+            <w:r>
+              <w:rPr>
+                <w:sz w:val="22"/>
+                <w:szCs w:val="22"/>
+              </w:rPr>
+              <w:t>estimators=300, num</w:t>
+            </w:r>
+            <w:r>
+              <w:rPr>
+                <w:sz w:val="22"/>
+                <w:szCs w:val="22"/>
+              </w:rPr>
+              <w:t xml:space="preserve"> </w:t>
+            </w:r>
+            <w:r>
+              <w:rPr>
+                <w:sz w:val="22"/>
+                <w:szCs w:val="22"/>
+              </w:rPr>
+              <w:t>leaves=56,</w:t>
+            </w:r>
+            <w:r>
+              <w:rPr>
+                <w:sz w:val="22"/>
+                <w:szCs w:val="22"/>
+              </w:rPr>
+              <w:t xml:space="preserve"> L2</w:t>
+            </w:r>
+            <w:r>
+              <w:rPr>
+                <w:sz w:val="22"/>
+                <w:szCs w:val="22"/>
+              </w:rPr>
+              <w:t>=0.5, subsample=0.9</w:t>
+            </w:r>
+          </w:p>
+        </w:tc>
       </w:tr>
       <w:tr>
         <w:trPr>
@@ -11955,7 +13087,7 @@
         </w:trPr>
         <w:tc>
           <w:tcPr>
-            <w:tcW w:w="1880" w:type="dxa"/>
+            <w:tcW w:w="1384" w:type="dxa"/>
             <w:tcBorders>
               <w:top w:val="single" w:sz="8" w:space="0" w:color="3B43D7"/>
               <w:left w:val="single" w:sz="8" w:space="0" w:color="3B43D7"/>
@@ -11991,7 +13123,7 @@
         </w:tc>
         <w:tc>
           <w:tcPr>
-            <w:tcW w:w="7200" w:type="dxa"/>
+            <w:tcW w:w="4424" w:type="dxa"/>
             <w:tcBorders>
               <w:top w:val="single" w:sz="8" w:space="0" w:color="3B43D7"/>
               <w:left w:val="nil"/>
@@ -12041,6 +13173,168 @@
               </w:rPr>
               <w:t>, initial learning rate, max iterations</w:t>
             </w:r>
+            <w:r>
+              <w:rPr>
+                <w:rFonts w:eastAsiaTheme="minorEastAsia"/>
+                <w:sz w:val="22"/>
+                <w:szCs w:val="22"/>
+              </w:rPr>
+              <w:t>, activation function</w:t>
+            </w:r>
+          </w:p>
+        </w:tc>
+        <w:tc>
+          <w:tcPr>
+            <w:tcW w:w="3532" w:type="dxa"/>
+            <w:tcBorders>
+              <w:top w:val="single" w:sz="8" w:space="0" w:color="3B43D7"/>
+              <w:left w:val="nil"/>
+              <w:bottom w:val="single" w:sz="8" w:space="0" w:color="3B43D7"/>
+              <w:right w:val="single" w:sz="8" w:space="0" w:color="3B43D7"/>
+            </w:tcBorders>
+            <w:shd w:val="clear" w:color="auto" w:fill="E8E9F8"/>
+          </w:tcPr>
+          <w:p>
+            <w:pPr>
+              <w:jc w:val="center"/>
+              <w:rPr>
+                <w:sz w:val="22"/>
+                <w:szCs w:val="22"/>
+              </w:rPr>
+            </w:pPr>
+            <m:oMath>
+              <m:r>
+                <w:rPr>
+                  <w:rFonts w:ascii="Cambria Math" w:hAnsi="Cambria Math"/>
+                  <w:sz w:val="22"/>
+                  <w:szCs w:val="22"/>
+                </w:rPr>
+                <m:t>α</m:t>
+              </m:r>
+            </m:oMath>
+            <w:r>
+              <w:rPr>
+                <w:sz w:val="22"/>
+                <w:szCs w:val="22"/>
+              </w:rPr>
+              <w:t>=0.001, hidden</w:t>
+            </w:r>
+            <w:r>
+              <w:rPr>
+                <w:sz w:val="22"/>
+                <w:szCs w:val="22"/>
+              </w:rPr>
+              <w:t xml:space="preserve"> </w:t>
+            </w:r>
+            <w:r>
+              <w:rPr>
+                <w:sz w:val="22"/>
+                <w:szCs w:val="22"/>
+              </w:rPr>
+              <w:t>layer</w:t>
+            </w:r>
+            <w:r>
+              <w:rPr>
+                <w:sz w:val="22"/>
+                <w:szCs w:val="22"/>
+              </w:rPr>
+              <w:t xml:space="preserve"> </w:t>
+            </w:r>
+            <w:r>
+              <w:rPr>
+                <w:sz w:val="22"/>
+                <w:szCs w:val="22"/>
+              </w:rPr>
+              <w:t>sizes</w:t>
+            </w:r>
+            <w:proofErr w:type="gramStart"/>
+            <w:r>
+              <w:rPr>
+                <w:sz w:val="22"/>
+                <w:szCs w:val="22"/>
+              </w:rPr>
+              <w:t>=(</w:t>
+            </w:r>
+            <w:proofErr w:type="gramEnd"/>
+            <w:r>
+              <w:rPr>
+                <w:sz w:val="22"/>
+                <w:szCs w:val="22"/>
+              </w:rPr>
+              <w:t>64,),</w:t>
+            </w:r>
+            <w:r>
+              <w:rPr>
+                <w:sz w:val="22"/>
+                <w:szCs w:val="22"/>
+              </w:rPr>
+              <w:t xml:space="preserve"> initial </w:t>
+            </w:r>
+            <w:r>
+              <w:rPr>
+                <w:sz w:val="22"/>
+                <w:szCs w:val="22"/>
+              </w:rPr>
+              <w:t>learning</w:t>
+            </w:r>
+            <w:r>
+              <w:rPr>
+                <w:sz w:val="22"/>
+                <w:szCs w:val="22"/>
+              </w:rPr>
+              <w:t xml:space="preserve"> </w:t>
+            </w:r>
+            <w:r>
+              <w:rPr>
+                <w:sz w:val="22"/>
+                <w:szCs w:val="22"/>
+              </w:rPr>
+              <w:t>rate=0.0005, max</w:t>
+            </w:r>
+            <w:r>
+              <w:rPr>
+                <w:sz w:val="22"/>
+                <w:szCs w:val="22"/>
+              </w:rPr>
+              <w:t xml:space="preserve"> i</w:t>
+            </w:r>
+            <w:r>
+              <w:rPr>
+                <w:sz w:val="22"/>
+                <w:szCs w:val="22"/>
+              </w:rPr>
+              <w:t>ter</w:t>
+            </w:r>
+            <w:r>
+              <w:rPr>
+                <w:sz w:val="22"/>
+                <w:szCs w:val="22"/>
+              </w:rPr>
+              <w:t>ations</w:t>
+            </w:r>
+            <w:r>
+              <w:rPr>
+                <w:sz w:val="22"/>
+                <w:szCs w:val="22"/>
+              </w:rPr>
+              <w:t>=300,</w:t>
+            </w:r>
+            <w:r>
+              <w:rPr>
+                <w:sz w:val="22"/>
+                <w:szCs w:val="22"/>
+              </w:rPr>
+              <w:t xml:space="preserve"> activation function=</w:t>
+            </w:r>
+            <w:proofErr w:type="spellStart"/>
+            <w:r>
+              <w:rPr>
+                <w:sz w:val="22"/>
+                <w:szCs w:val="22"/>
+              </w:rPr>
+              <w:t>relu</w:t>
+            </w:r>
+            <w:proofErr w:type="spellEnd"/>
           </w:p>
         </w:tc>
       </w:tr>
@@ -12050,7 +13344,7 @@
       <w:pPr>
         <w:pStyle w:val="Heading2"/>
       </w:pPr>
-      <w:bookmarkStart w:id="24" w:name="_Toc202275322"/>
+      <w:bookmarkStart w:id="24" w:name="_Toc202387364"/>
       <w:r>
         <w:t>Results</w:t>
       </w:r>
@@ -12103,13 +13397,7 @@
         <w:t>USD.</w:t>
       </w:r>
       <w:r>
-        <w:t xml:space="preserve"> Reporting RMSE on both the transformed and original scale provides a more complete picture of model performance and </w:t>
-      </w:r>
-      <w:r>
-        <w:t>provides both statistically validity and stakeholder relevance</w:t>
-      </w:r>
-      <w:r>
-        <w:t>. The transformed RMSE reflects how well the model learned from a normalized distribution while the original scale RMSE reflects the error in real monetary terms for practical interpretation.</w:t>
+        <w:t xml:space="preserve"> Reporting RMSE on both the transformed and original scale provides a more complete picture of model performance and provides both statistically validity and stakeholder relevance. The transformed RMSE reflects how well the model learned from a normalized distribution while the original scale RMSE reflects the error in real monetary terms for practical interpretation.</w:t>
       </w:r>
     </w:p>
     <w:p/>
@@ -12119,31 +13407,18 @@
         <w:keepNext/>
         <w:jc w:val="center"/>
       </w:pPr>
-      <w:bookmarkStart w:id="25" w:name="_Toc202275333"/>
+      <w:bookmarkStart w:id="25" w:name="_Toc202387385"/>
       <w:r>
         <w:t xml:space="preserve">Table </w:t>
       </w:r>
-      <w:r>
-        <w:fldChar w:fldCharType="begin"/>
-      </w:r>
-      <w:r>
-        <w:instrText xml:space="preserve"> SEQ Table \* ARABIC </w:instrText>
-      </w:r>
-      <w:r>
-        <w:fldChar w:fldCharType="separate"/>
-      </w:r>
-      <w:r>
-        <w:rPr>
-          <w:noProof/>
-        </w:rPr>
-        <w:t>5</w:t>
-      </w:r>
-      <w:r>
-        <w:rPr>
-          <w:noProof/>
-        </w:rPr>
-        <w:fldChar w:fldCharType="end"/>
-      </w:r>
+      <w:fldSimple w:instr=" SEQ Table \* ARABIC ">
+        <w:r>
+          <w:rPr>
+            <w:noProof/>
+          </w:rPr>
+          <w:t>5</w:t>
+        </w:r>
+      </w:fldSimple>
       <w:r>
         <w:t xml:space="preserve">: </w:t>
       </w:r>
@@ -12846,8 +14121,9 @@
       <w:pPr>
         <w:pStyle w:val="Heading1"/>
       </w:pPr>
-      <w:bookmarkStart w:id="26" w:name="_Toc202275323"/>
-      <w:r>
+      <w:bookmarkStart w:id="26" w:name="_Toc202387365"/>
+      <w:r>
+        <w:lastRenderedPageBreak/>
         <w:t>Conclusion</w:t>
       </w:r>
       <w:bookmarkEnd w:id="26"/>
@@ -12878,112 +14154,188 @@
     <w:p/>
     <w:p>
       <w:r>
-        <w:t xml:space="preserve">A Box-Cox transformation was necessary to normalize the skewed response variable, sales amount, to improve model performance and stability. </w:t>
-      </w:r>
-      <w:r>
-        <w:t>Analytical</w:t>
-      </w:r>
-      <w:r>
-        <w:t xml:space="preserve"> models were trained and evaluated, including </w:t>
-      </w:r>
-      <w:r>
-        <w:t>Linear Regression</w:t>
-      </w:r>
-      <w:r>
-        <w:t xml:space="preserve">, </w:t>
-      </w:r>
-      <w:r>
-        <w:t>Elastic Net</w:t>
-      </w:r>
-      <w:r>
-        <w:t xml:space="preserve">, </w:t>
-      </w:r>
-      <w:r>
-        <w:t>Random Forest</w:t>
-      </w:r>
-      <w:r>
-        <w:t xml:space="preserve">, </w:t>
-      </w:r>
-      <w:r>
-        <w:t>ANN</w:t>
-      </w:r>
-      <w:r>
-        <w:t xml:space="preserve">, and </w:t>
-      </w:r>
-      <w:proofErr w:type="spellStart"/>
-      <w:r>
-        <w:t>LightGBM</w:t>
-      </w:r>
-      <w:proofErr w:type="spellEnd"/>
-      <w:r>
-        <w:t xml:space="preserve">. Each </w:t>
-      </w:r>
-      <w:r>
-        <w:lastRenderedPageBreak/>
-        <w:t xml:space="preserve">model was processed through a consistent pipeline </w:t>
-      </w:r>
-      <w:r>
-        <w:t xml:space="preserve">and parameter grid </w:t>
-      </w:r>
-      <w:r>
-        <w:t>that handles preprocessing and hyperparameter optimization using randomization with cross-validation.</w:t>
+        <w:t>The quality of an</w:t>
+      </w:r>
+      <w:r>
+        <w:t xml:space="preserve"> analy</w:t>
+      </w:r>
+      <w:r>
+        <w:t>sis using property appraiser data</w:t>
+      </w:r>
+      <w:r>
+        <w:t xml:space="preserve"> heavily relies on outlier detection. This data is largely manually entered </w:t>
+      </w:r>
+      <w:r>
+        <w:t>which</w:t>
+      </w:r>
+      <w:r>
+        <w:t xml:space="preserve"> can result in data entry errors as well as missing values represented by</w:t>
+      </w:r>
+      <w:r>
+        <w:t xml:space="preserve"> placeholder</w:t>
+      </w:r>
+      <w:r>
+        <w:t xml:space="preserve"> </w:t>
+      </w:r>
+      <w:r>
+        <w:t>sentinel</w:t>
+      </w:r>
+      <w:r>
+        <w:t xml:space="preserve"> values.</w:t>
+      </w:r>
+      <w:r>
+        <w:t xml:space="preserve"> </w:t>
+      </w:r>
+      <w:r>
+        <w:t xml:space="preserve">In this study, outlier detection was addressed using </w:t>
+      </w:r>
+      <w:r>
+        <w:t xml:space="preserve">a </w:t>
+      </w:r>
+      <w:r>
+        <w:t xml:space="preserve">conservative and realistic </w:t>
+      </w:r>
+      <w:r>
+        <w:t xml:space="preserve">minimum threshold of </w:t>
+      </w:r>
+      <w:r>
+        <w:t>$</w:t>
+      </w:r>
+      <w:r>
+        <w:t xml:space="preserve">50,000 and </w:t>
+      </w:r>
+      <w:r>
+        <w:t>Isolation Forest, which helped identify and remove anomalous records based on multivariate patterns. By cleaning the data of such inconsistencies, the models were better able to generalize and produce meaningful results.</w:t>
       </w:r>
     </w:p>
     <w:p/>
     <w:p>
       <w:r>
-        <w:t>Among the models</w:t>
-      </w:r>
-      <w:r>
-        <w:t xml:space="preserve"> used</w:t>
-      </w:r>
-      <w:r>
-        <w:t xml:space="preserve">, ensemble methods like </w:t>
+        <w:t xml:space="preserve">A Box-Cox transformation was necessary to normalize the skewed response variable, sales amount, to improve model performance and stability. </w:t>
+      </w:r>
+      <w:r>
+        <w:t>Analytical</w:t>
+      </w:r>
+      <w:r>
+        <w:t xml:space="preserve"> models were trained and evaluated, including </w:t>
+      </w:r>
+      <w:r>
+        <w:t>Linear Regression</w:t>
+      </w:r>
+      <w:r>
+        <w:t xml:space="preserve">, </w:t>
+      </w:r>
+      <w:r>
+        <w:t>Elastic Net</w:t>
+      </w:r>
+      <w:r>
+        <w:t xml:space="preserve">, </w:t>
       </w:r>
       <w:r>
         <w:t>Random Forest</w:t>
       </w:r>
       <w:r>
-        <w:t xml:space="preserve"> and </w:t>
-      </w:r>
-      <w:r>
-        <w:t>Light Gradient Boosting Machine</w:t>
-      </w:r>
-      <w:r>
-        <w:t xml:space="preserve"> </w:t>
-      </w:r>
-      <w:r>
-        <w:t xml:space="preserve">outperformed others in terms of RMSE when evaluated on the holdout testing subset. While simpler models such as </w:t>
-      </w:r>
-      <w:r>
-        <w:t>Linear Regression</w:t>
-      </w:r>
-      <w:r>
-        <w:t xml:space="preserve"> provide transparency and i</w:t>
-      </w:r>
-      <w:r>
-        <w:t>nterpretability</w:t>
-      </w:r>
-      <w:r>
-        <w:t>, boosting and bagging models better captured the complex and non-linear relationships in the data.</w:t>
+        <w:t xml:space="preserve">, </w:t>
+      </w:r>
+      <w:r>
+        <w:t>ANN</w:t>
+      </w:r>
+      <w:r>
+        <w:t xml:space="preserve">, and </w:t>
+      </w:r>
+      <w:proofErr w:type="spellStart"/>
+      <w:r>
+        <w:t>LightGBM</w:t>
+      </w:r>
+      <w:proofErr w:type="spellEnd"/>
+      <w:r>
+        <w:t xml:space="preserve">. Each model was processed through a consistent pipeline </w:t>
+      </w:r>
+      <w:r>
+        <w:t xml:space="preserve">and parameter grid </w:t>
+      </w:r>
+      <w:r>
+        <w:t>that handles preprocessing and hyperparameter optimization using randomization with cross-validation.</w:t>
       </w:r>
     </w:p>
     <w:p/>
     <w:p>
       <w:r>
-        <w:t xml:space="preserve">The final models showed predictive accuracy at levels suitable for offering valuable insights for future </w:t>
-      </w:r>
-      <w:r>
-        <w:t>property valuation</w:t>
-      </w:r>
-      <w:r>
-        <w:t xml:space="preserve"> for emergency response planning and recovery</w:t>
-      </w:r>
-      <w:r>
-        <w:t xml:space="preserve"> efforts.</w:t>
+        <w:t>Among the models</w:t>
+      </w:r>
+      <w:r>
+        <w:t xml:space="preserve"> used</w:t>
+      </w:r>
+      <w:r>
+        <w:t xml:space="preserve">, ensemble methods like </w:t>
+      </w:r>
+      <w:r>
+        <w:t>Random Forest</w:t>
+      </w:r>
+      <w:r>
+        <w:t xml:space="preserve"> and </w:t>
+      </w:r>
+      <w:r>
+        <w:t>Light Gradient Boosting Machine</w:t>
+      </w:r>
+      <w:r>
+        <w:t xml:space="preserve"> </w:t>
+      </w:r>
+      <w:r>
+        <w:t xml:space="preserve">outperformed others in terms of RMSE when evaluated on the holdout testing subset. While simpler models such as </w:t>
+      </w:r>
+      <w:r>
+        <w:t>Linear Regression</w:t>
+      </w:r>
+      <w:r>
+        <w:t xml:space="preserve"> provide transparency and i</w:t>
+      </w:r>
+      <w:r>
+        <w:t>nterpretability</w:t>
+      </w:r>
+      <w:r>
+        <w:t>, boosting and bagging models better captured the complex and non-linear relationships in the data.</w:t>
       </w:r>
     </w:p>
     <w:p/>
+    <w:p>
+      <w:r>
+        <w:t xml:space="preserve">The final models showed predictive accuracy at levels suitable for offering valuable insights for future </w:t>
+      </w:r>
+      <w:r>
+        <w:t>property valuation</w:t>
+      </w:r>
+      <w:r>
+        <w:t xml:space="preserve"> for emergency response planning and recovery</w:t>
+      </w:r>
+      <w:r>
+        <w:t xml:space="preserve"> efforts.</w:t>
+      </w:r>
+      <w:r>
+        <w:t xml:space="preserve"> </w:t>
+      </w:r>
+      <w:r>
+        <w:t>The analysis could be further improved by incorporating a</w:t>
+      </w:r>
+      <w:r>
+        <w:t xml:space="preserve"> </w:t>
+      </w:r>
+      <w:r>
+        <w:t xml:space="preserve">quality indicator or condition rating into the set of predictor variables. While structural characteristics such as the number of bedrooms and bathrooms provide a baseline for valuation, they do not fully capture differences in </w:t>
+      </w:r>
+      <w:r>
+        <w:t>structural</w:t>
+      </w:r>
+      <w:r>
+        <w:t xml:space="preserve"> condition</w:t>
+      </w:r>
+      <w:r>
+        <w:t xml:space="preserve"> </w:t>
+      </w:r>
+      <w:r>
+        <w:t>or renovation status.</w:t>
+      </w:r>
+    </w:p>
     <w:p>
       <w:r>
         <w:br w:type="page"/>
@@ -12999,7 +14351,15 @@
       </w:sdtPr>
       <w:sdtContent>
         <w:p>
+          <w:pPr>
+            <w:rPr>
+              <w:rStyle w:val="Heading1Char"/>
+            </w:rPr>
+          </w:pPr>
           <w:r>
+            <w:rPr>
+              <w:rStyle w:val="Heading1Char"/>
+            </w:rPr>
             <w:t>References</w:t>
           </w:r>
         </w:p>
@@ -13076,6 +14436,35 @@
                   <w:noProof/>
                 </w:rPr>
                 <w:t>. (GitHub) Retrieved from https://github.com/bofethe/parcel-sales</w:t>
+              </w:r>
+            </w:p>
+            <w:p>
+              <w:pPr>
+                <w:pStyle w:val="Bibliography"/>
+                <w:ind w:left="720" w:hanging="720"/>
+                <w:rPr>
+                  <w:noProof/>
+                </w:rPr>
+              </w:pPr>
+              <w:r>
+                <w:rPr>
+                  <w:noProof/>
+                </w:rPr>
+                <w:t xml:space="preserve">Florida Legislature. (2025). </w:t>
+              </w:r>
+              <w:r>
+                <w:rPr>
+                  <w:i/>
+                  <w:iCs/>
+                  <w:noProof/>
+                </w:rPr>
+                <w:t>Section 193.155 - Homestead Assessments</w:t>
+              </w:r>
+              <w:r>
+                <w:rPr>
+                  <w:noProof/>
+                </w:rPr>
+                <w:t>. Retrieved from http://leg.state.fl.us/Statutes/index.cfm?App_mode=Display_Statute&amp;URL=0100-0199/0193/Sections/0193.155.html</w:t>
               </w:r>
             </w:p>
             <w:p>
@@ -13211,7 +14600,7 @@
     <w:p>
       <w:pPr>
         <w:sectPr>
-          <w:footerReference w:type="default" r:id="rId16"/>
+          <w:footerReference w:type="default" r:id="rId17"/>
           <w:pgSz w:w="12240" w:h="15840"/>
           <w:pgMar w:top="1440" w:right="1440" w:bottom="1440" w:left="1440" w:header="720" w:footer="720" w:gutter="0"/>
           <w:pgNumType w:start="1"/>
@@ -13230,7 +14619,7 @@
         <w:ind w:left="432"/>
         <w:jc w:val="center"/>
         <w:sectPr>
-          <w:footerReference w:type="default" r:id="rId17"/>
+          <w:footerReference w:type="default" r:id="rId18"/>
           <w:pgSz w:w="12240" w:h="15840"/>
           <w:pgMar w:top="1440" w:right="1440" w:bottom="1440" w:left="1440" w:header="720" w:footer="720" w:gutter="0"/>
           <w:cols w:space="720"/>
@@ -13239,7 +14628,7 @@
         </w:sectPr>
       </w:pPr>
       <w:bookmarkStart w:id="27" w:name="_Appendix_A:_Analytical"/>
-      <w:bookmarkStart w:id="28" w:name="_Toc202275324"/>
+      <w:bookmarkStart w:id="28" w:name="_Toc202387366"/>
       <w:bookmarkEnd w:id="27"/>
       <w:r>
         <w:lastRenderedPageBreak/>
@@ -13279,7 +14668,7 @@
                     <pic:cNvPicPr/>
                   </pic:nvPicPr>
                   <pic:blipFill>
-                    <a:blip r:embed="rId18">
+                    <a:blip r:embed="rId19">
                       <a:extLst>
                         <a:ext uri="{28A0092B-C50C-407E-A947-70E740481C1C}">
                           <a14:useLocalDpi xmlns:a14="http://schemas.microsoft.com/office/drawing/2010/main" val="0"/>
@@ -13314,7 +14703,7 @@
       </w:r>
     </w:p>
     <w:sectPr>
-      <w:footerReference w:type="default" r:id="rId23"/>
+      <w:footerReference w:type="default" r:id="rId24"/>
       <w:pgSz w:w="15840" w:h="12240" w:orient="landscape"/>
       <w:pgMar w:top="720" w:right="720" w:bottom="720" w:left="720" w:header="720" w:footer="720" w:gutter="0"/>
       <w:cols w:space="720"/>
@@ -16650,6 +18039,36 @@
       <w:szCs w:val="20"/>
     </w:rPr>
   </w:style>
+  <w:style w:type="paragraph" w:styleId="NoSpacing">
+    <w:name w:val="No Spacing"/>
+    <w:link w:val="NoSpacingChar"/>
+    <w:uiPriority w:val="1"/>
+    <w:qFormat/>
+    <w:rsid w:val="009939C5"/>
+    <w:rPr>
+      <w:rFonts w:asciiTheme="minorHAnsi" w:eastAsiaTheme="minorEastAsia" w:hAnsiTheme="minorHAnsi" w:cstheme="minorBidi"/>
+      <w:kern w:val="0"/>
+      <w:sz w:val="22"/>
+      <w:szCs w:val="22"/>
+      <w:lang w:eastAsia="zh-CN"/>
+      <w14:ligatures w14:val="none"/>
+    </w:rPr>
+  </w:style>
+  <w:style w:type="character" w:customStyle="1" w:styleId="NoSpacingChar">
+    <w:name w:val="No Spacing Char"/>
+    <w:basedOn w:val="DefaultParagraphFont"/>
+    <w:link w:val="NoSpacing"/>
+    <w:uiPriority w:val="1"/>
+    <w:rsid w:val="009939C5"/>
+    <w:rPr>
+      <w:rFonts w:asciiTheme="minorHAnsi" w:eastAsiaTheme="minorEastAsia" w:hAnsiTheme="minorHAnsi" w:cstheme="minorBidi"/>
+      <w:kern w:val="0"/>
+      <w:sz w:val="22"/>
+      <w:szCs w:val="22"/>
+      <w:lang w:eastAsia="zh-CN"/>
+      <w14:ligatures w14:val="none"/>
+    </w:rPr>
+  </w:style>
 </w:styles>
 </file>
 
@@ -16949,6 +18368,17 @@
 </file>
 
 <file path=customXml/item1.xml><?xml version="1.0" encoding="utf-8"?>
+<CoverPageProperties xmlns="http://schemas.microsoft.com/office/2006/coverPageProps">
+  <PublishDate/>
+  <Abstract/>
+  <CompanyAddress>bfethe3@gatech.edu</CompanyAddress>
+  <CompanyPhone/>
+  <CompanyFax/>
+  <CompanyEmail/>
+</CoverPageProperties>
+</file>
+
+<file path=customXml/item2.xml><?xml version="1.0" encoding="utf-8"?>
 <b:Sources xmlns:b="http://schemas.openxmlformats.org/officeDocument/2006/bibliography" xmlns="http://schemas.openxmlformats.org/officeDocument/2006/bibliography" SelectedStyle="/APASixthEditionOfficeOnline.xsl" StyleName="APA" Version="6">
   <b:Source>
     <b:Tag>Yaz21</b:Tag>
@@ -16968,7 +18398,7 @@
     <b:City>Boulder</b:City>
     <b:Publisher>Department of Economics, Colorado University at Boulder</b:Publisher>
     <b:Year>2021</b:Year>
-    <b:RefOrder>1</b:RefOrder>
+    <b:RefOrder>2</b:RefOrder>
   </b:Source>
   <b:Source>
     <b:Tag>Mor22</b:Tag>
@@ -16997,7 +18427,7 @@
     <b:Year>2022</b:Year>
     <b:JournalName>Land</b:JournalName>
     <b:Pages>11, 2100</b:Pages>
-    <b:RefOrder>2</b:RefOrder>
+    <b:RefOrder>3</b:RefOrder>
   </b:Source>
   <b:Source>
     <b:Tag>Vik18</b:Tag>
@@ -17033,7 +18463,7 @@
     <b:Year>2018</b:Year>
     <b:Publisher>South Ural State University</b:Publisher>
     <b:City>Chelyabinsk</b:City>
-    <b:RefOrder>3</b:RefOrder>
+    <b:RefOrder>4</b:RefOrder>
   </b:Source>
   <b:Source>
     <b:Tag>Fet25</b:Tag>
@@ -17053,7 +18483,7 @@
     <b:URL>https://github.com/bofethe/parcel-sales</b:URL>
     <b:Year>2025</b:Year>
     <b:ProductionCompany>GitHub</b:ProductionCompany>
-    <b:RefOrder>5</b:RefOrder>
+    <b:RefOrder>6</b:RefOrder>
   </b:Source>
   <b:Source>
     <b:Tag>Hil25</b:Tag>
@@ -17067,7 +18497,7 @@
     </b:Author>
     <b:URL>https://downloads.hcpafl.org/</b:URL>
     <b:Title>Public Downloads</b:Title>
-    <b:RefOrder>6</b:RefOrder>
+    <b:RefOrder>7</b:RefOrder>
   </b:Source>
   <b:Source>
     <b:Tag>Duc13</b:Tag>
@@ -17090,13 +18520,35 @@
     <b:URL>https://www.federalreservehistory.org/essays/subprime-mortgage-crisis</b:URL>
     <b:Month>November</b:Month>
     <b:Day>22</b:Day>
-    <b:RefOrder>4</b:RefOrder>
+    <b:RefOrder>5</b:RefOrder>
+  </b:Source>
+  <b:Source>
+    <b:Tag>Flo25</b:Tag>
+    <b:SourceType>InternetSite</b:SourceType>
+    <b:Guid>{87EDE4E0-5AC6-B745-ABE5-7C460A3342C0}</b:Guid>
+    <b:Title>Section 193.155 - Homestead Assessments</b:Title>
+    <b:URL>http://leg.state.fl.us/Statutes/index.cfm?App_mode=Display_Statute&amp;URL=0100-0199/0193/Sections/0193.155.html</b:URL>
+    <b:Year>2025</b:Year>
+    <b:Author>
+      <b:Author>
+        <b:Corporate>Florida Legislature</b:Corporate>
+      </b:Author>
+    </b:Author>
+    <b:RefOrder>1</b:RefOrder>
   </b:Source>
 </b:Sources>
 </file>
 
 <file path=customXml/itemProps1.xml><?xml version="1.0" encoding="utf-8"?>
-<ds:datastoreItem xmlns:ds="http://schemas.openxmlformats.org/officeDocument/2006/customXml" ds:itemID="{84F10FC2-88D1-8F46-88BF-6E2C3ED5C0C8}">
+<ds:datastoreItem xmlns:ds="http://schemas.openxmlformats.org/officeDocument/2006/customXml" ds:itemID="{55AF091B-3C7A-41E3-B477-F2FDAA23CFDA}">
+  <ds:schemaRefs>
+    <ds:schemaRef ds:uri="http://schemas.microsoft.com/office/2006/coverPageProps"/>
+  </ds:schemaRefs>
+</ds:datastoreItem>
+</file>
+
+<file path=customXml/itemProps2.xml><?xml version="1.0" encoding="utf-8"?>
+<ds:datastoreItem xmlns:ds="http://schemas.openxmlformats.org/officeDocument/2006/customXml" ds:itemID="{FA5D7E6F-1375-C844-8BE6-5D5ABDDB1B75}">
   <ds:schemaRefs>
     <ds:schemaRef ds:uri="http://schemas.openxmlformats.org/officeDocument/2006/bibliography"/>
   </ds:schemaRefs>

</xml_diff>

<commit_message>
submitted for final qc
</commit_message>
<xml_diff>
--- a/reports/HC_Parcel_Sales_Prediction.docx
+++ b/reports/HC_Parcel_Sales_Prediction.docx
@@ -1153,7 +1153,7 @@
             </w:rPr>
             <w:fldChar w:fldCharType="separate"/>
           </w:r>
-          <w:hyperlink w:anchor="_Toc202629155" w:history="1">
+          <w:hyperlink w:anchor="_Toc203387745" w:history="1">
             <w:r>
               <w:rPr>
                 <w:rStyle w:val="Hyperlink"/>
@@ -1200,7 +1200,7 @@
                 <w:noProof/>
                 <w:webHidden/>
               </w:rPr>
-              <w:instrText xml:space="preserve"> PAGEREF _Toc202629155 \h </w:instrText>
+              <w:instrText xml:space="preserve"> PAGEREF _Toc203387745 \h </w:instrText>
             </w:r>
             <w:r>
               <w:rPr>
@@ -1247,7 +1247,7 @@
               <w:noProof/>
             </w:rPr>
           </w:pPr>
-          <w:hyperlink w:anchor="_Toc202629156" w:history="1">
+          <w:hyperlink w:anchor="_Toc203387746" w:history="1">
             <w:r>
               <w:rPr>
                 <w:rStyle w:val="Hyperlink"/>
@@ -1294,7 +1294,7 @@
                 <w:noProof/>
                 <w:webHidden/>
               </w:rPr>
-              <w:instrText xml:space="preserve"> PAGEREF _Toc202629156 \h </w:instrText>
+              <w:instrText xml:space="preserve"> PAGEREF _Toc203387746 \h </w:instrText>
             </w:r>
             <w:r>
               <w:rPr>
@@ -1341,7 +1341,7 @@
               <w:szCs w:val="24"/>
             </w:rPr>
           </w:pPr>
-          <w:hyperlink w:anchor="_Toc202629157" w:history="1">
+          <w:hyperlink w:anchor="_Toc203387747" w:history="1">
             <w:r>
               <w:rPr>
                 <w:rStyle w:val="Hyperlink"/>
@@ -1386,7 +1386,7 @@
                 <w:noProof/>
                 <w:webHidden/>
               </w:rPr>
-              <w:instrText xml:space="preserve"> PAGEREF _Toc202629157 \h </w:instrText>
+              <w:instrText xml:space="preserve"> PAGEREF _Toc203387747 \h </w:instrText>
             </w:r>
             <w:r>
               <w:rPr>
@@ -1431,7 +1431,7 @@
               <w:szCs w:val="24"/>
             </w:rPr>
           </w:pPr>
-          <w:hyperlink w:anchor="_Toc202629158" w:history="1">
+          <w:hyperlink w:anchor="_Toc203387748" w:history="1">
             <w:r>
               <w:rPr>
                 <w:rStyle w:val="Hyperlink"/>
@@ -1474,7 +1474,7 @@
                 <w:noProof/>
                 <w:webHidden/>
               </w:rPr>
-              <w:instrText xml:space="preserve"> PAGEREF _Toc202629158 \h </w:instrText>
+              <w:instrText xml:space="preserve"> PAGEREF _Toc203387748 \h </w:instrText>
             </w:r>
             <w:r>
               <w:rPr>
@@ -1519,7 +1519,7 @@
               <w:szCs w:val="24"/>
             </w:rPr>
           </w:pPr>
-          <w:hyperlink w:anchor="_Toc202629159" w:history="1">
+          <w:hyperlink w:anchor="_Toc203387749" w:history="1">
             <w:r>
               <w:rPr>
                 <w:rStyle w:val="Hyperlink"/>
@@ -1562,7 +1562,7 @@
                 <w:noProof/>
                 <w:webHidden/>
               </w:rPr>
-              <w:instrText xml:space="preserve"> PAGEREF _Toc202629159 \h </w:instrText>
+              <w:instrText xml:space="preserve"> PAGEREF _Toc203387749 \h </w:instrText>
             </w:r>
             <w:r>
               <w:rPr>
@@ -1607,7 +1607,7 @@
               <w:szCs w:val="24"/>
             </w:rPr>
           </w:pPr>
-          <w:hyperlink w:anchor="_Toc202629160" w:history="1">
+          <w:hyperlink w:anchor="_Toc203387750" w:history="1">
             <w:r>
               <w:rPr>
                 <w:rStyle w:val="Hyperlink"/>
@@ -1650,7 +1650,7 @@
                 <w:noProof/>
                 <w:webHidden/>
               </w:rPr>
-              <w:instrText xml:space="preserve"> PAGEREF _Toc202629160 \h </w:instrText>
+              <w:instrText xml:space="preserve"> PAGEREF _Toc203387750 \h </w:instrText>
             </w:r>
             <w:r>
               <w:rPr>
@@ -1695,7 +1695,7 @@
               <w:szCs w:val="24"/>
             </w:rPr>
           </w:pPr>
-          <w:hyperlink w:anchor="_Toc202629161" w:history="1">
+          <w:hyperlink w:anchor="_Toc203387751" w:history="1">
             <w:r>
               <w:rPr>
                 <w:rStyle w:val="Hyperlink"/>
@@ -1717,7 +1717,7 @@
                 <w:rStyle w:val="Hyperlink"/>
                 <w:noProof/>
               </w:rPr>
-              <w:t>Artificial Neural Network (ANN)</w:t>
+              <w:t>Light Gradient Boosting Machine (LightGBM)</w:t>
             </w:r>
             <w:r>
               <w:rPr>
@@ -1738,7 +1738,7 @@
                 <w:noProof/>
                 <w:webHidden/>
               </w:rPr>
-              <w:instrText xml:space="preserve"> PAGEREF _Toc202629161 \h </w:instrText>
+              <w:instrText xml:space="preserve"> PAGEREF _Toc203387751 \h </w:instrText>
             </w:r>
             <w:r>
               <w:rPr>
@@ -1783,7 +1783,7 @@
               <w:szCs w:val="24"/>
             </w:rPr>
           </w:pPr>
-          <w:hyperlink w:anchor="_Toc202629162" w:history="1">
+          <w:hyperlink w:anchor="_Toc203387752" w:history="1">
             <w:r>
               <w:rPr>
                 <w:rStyle w:val="Hyperlink"/>
@@ -1805,7 +1805,7 @@
                 <w:rStyle w:val="Hyperlink"/>
                 <w:noProof/>
               </w:rPr>
-              <w:t>Light Gradient Boosting Machine (LightGBM)</w:t>
+              <w:t>Artificial Neural Network (ANN)</w:t>
             </w:r>
             <w:r>
               <w:rPr>
@@ -1826,7 +1826,7 @@
                 <w:noProof/>
                 <w:webHidden/>
               </w:rPr>
-              <w:instrText xml:space="preserve"> PAGEREF _Toc202629162 \h </w:instrText>
+              <w:instrText xml:space="preserve"> PAGEREF _Toc203387752 \h </w:instrText>
             </w:r>
             <w:r>
               <w:rPr>
@@ -1873,7 +1873,7 @@
               <w:noProof/>
             </w:rPr>
           </w:pPr>
-          <w:hyperlink w:anchor="_Toc202629163" w:history="1">
+          <w:hyperlink w:anchor="_Toc203387753" w:history="1">
             <w:r>
               <w:rPr>
                 <w:rStyle w:val="Hyperlink"/>
@@ -1918,7 +1918,7 @@
                 <w:noProof/>
                 <w:webHidden/>
               </w:rPr>
-              <w:instrText xml:space="preserve"> PAGEREF _Toc202629163 \h </w:instrText>
+              <w:instrText xml:space="preserve"> PAGEREF _Toc203387753 \h </w:instrText>
             </w:r>
             <w:r>
               <w:rPr>
@@ -1965,7 +1965,7 @@
               <w:szCs w:val="24"/>
             </w:rPr>
           </w:pPr>
-          <w:hyperlink w:anchor="_Toc202629164" w:history="1">
+          <w:hyperlink w:anchor="_Toc203387754" w:history="1">
             <w:r>
               <w:rPr>
                 <w:rStyle w:val="Hyperlink"/>
@@ -2010,7 +2010,7 @@
                 <w:noProof/>
                 <w:webHidden/>
               </w:rPr>
-              <w:instrText xml:space="preserve"> PAGEREF _Toc202629164 \h </w:instrText>
+              <w:instrText xml:space="preserve"> PAGEREF _Toc203387754 \h </w:instrText>
             </w:r>
             <w:r>
               <w:rPr>
@@ -2057,7 +2057,7 @@
               <w:szCs w:val="24"/>
             </w:rPr>
           </w:pPr>
-          <w:hyperlink w:anchor="_Toc202629165" w:history="1">
+          <w:hyperlink w:anchor="_Toc203387755" w:history="1">
             <w:r>
               <w:rPr>
                 <w:rStyle w:val="Hyperlink"/>
@@ -2102,7 +2102,7 @@
                 <w:noProof/>
                 <w:webHidden/>
               </w:rPr>
-              <w:instrText xml:space="preserve"> PAGEREF _Toc202629165 \h </w:instrText>
+              <w:instrText xml:space="preserve"> PAGEREF _Toc203387755 \h </w:instrText>
             </w:r>
             <w:r>
               <w:rPr>
@@ -2149,7 +2149,7 @@
               <w:szCs w:val="24"/>
             </w:rPr>
           </w:pPr>
-          <w:hyperlink w:anchor="_Toc202629166" w:history="1">
+          <w:hyperlink w:anchor="_Toc203387756" w:history="1">
             <w:r>
               <w:rPr>
                 <w:rStyle w:val="Hyperlink"/>
@@ -2194,7 +2194,7 @@
                 <w:noProof/>
                 <w:webHidden/>
               </w:rPr>
-              <w:instrText xml:space="preserve"> PAGEREF _Toc202629166 \h </w:instrText>
+              <w:instrText xml:space="preserve"> PAGEREF _Toc203387756 \h </w:instrText>
             </w:r>
             <w:r>
               <w:rPr>
@@ -2241,7 +2241,7 @@
               <w:szCs w:val="24"/>
             </w:rPr>
           </w:pPr>
-          <w:hyperlink w:anchor="_Toc202629167" w:history="1">
+          <w:hyperlink w:anchor="_Toc203387757" w:history="1">
             <w:r>
               <w:rPr>
                 <w:rStyle w:val="Hyperlink"/>
@@ -2286,7 +2286,7 @@
                 <w:noProof/>
                 <w:webHidden/>
               </w:rPr>
-              <w:instrText xml:space="preserve"> PAGEREF _Toc202629167 \h </w:instrText>
+              <w:instrText xml:space="preserve"> PAGEREF _Toc203387757 \h </w:instrText>
             </w:r>
             <w:r>
               <w:rPr>
@@ -2333,7 +2333,7 @@
               <w:szCs w:val="24"/>
             </w:rPr>
           </w:pPr>
-          <w:hyperlink w:anchor="_Toc202629168" w:history="1">
+          <w:hyperlink w:anchor="_Toc203387758" w:history="1">
             <w:r>
               <w:rPr>
                 <w:rStyle w:val="Hyperlink"/>
@@ -2378,7 +2378,7 @@
                 <w:noProof/>
                 <w:webHidden/>
               </w:rPr>
-              <w:instrText xml:space="preserve"> PAGEREF _Toc202629168 \h </w:instrText>
+              <w:instrText xml:space="preserve"> PAGEREF _Toc203387758 \h </w:instrText>
             </w:r>
             <w:r>
               <w:rPr>
@@ -2425,7 +2425,7 @@
               <w:noProof/>
             </w:rPr>
           </w:pPr>
-          <w:hyperlink w:anchor="_Toc202629169" w:history="1">
+          <w:hyperlink w:anchor="_Toc203387759" w:history="1">
             <w:r>
               <w:rPr>
                 <w:rStyle w:val="Hyperlink"/>
@@ -2472,7 +2472,7 @@
                 <w:noProof/>
                 <w:webHidden/>
               </w:rPr>
-              <w:instrText xml:space="preserve"> PAGEREF _Toc202629169 \h </w:instrText>
+              <w:instrText xml:space="preserve"> PAGEREF _Toc203387759 \h </w:instrText>
             </w:r>
             <w:r>
               <w:rPr>
@@ -2519,7 +2519,7 @@
               <w:szCs w:val="24"/>
             </w:rPr>
           </w:pPr>
-          <w:hyperlink w:anchor="_Toc202629170" w:history="1">
+          <w:hyperlink w:anchor="_Toc203387760" w:history="1">
             <w:r>
               <w:rPr>
                 <w:rStyle w:val="Hyperlink"/>
@@ -2564,7 +2564,7 @@
                 <w:noProof/>
                 <w:webHidden/>
               </w:rPr>
-              <w:instrText xml:space="preserve"> PAGEREF _Toc202629170 \h </w:instrText>
+              <w:instrText xml:space="preserve"> PAGEREF _Toc203387760 \h </w:instrText>
             </w:r>
             <w:r>
               <w:rPr>
@@ -2611,7 +2611,7 @@
               <w:szCs w:val="24"/>
             </w:rPr>
           </w:pPr>
-          <w:hyperlink w:anchor="_Toc202629171" w:history="1">
+          <w:hyperlink w:anchor="_Toc203387761" w:history="1">
             <w:r>
               <w:rPr>
                 <w:rStyle w:val="Hyperlink"/>
@@ -2656,7 +2656,7 @@
                 <w:noProof/>
                 <w:webHidden/>
               </w:rPr>
-              <w:instrText xml:space="preserve"> PAGEREF _Toc202629171 \h </w:instrText>
+              <w:instrText xml:space="preserve"> PAGEREF _Toc203387761 \h </w:instrText>
             </w:r>
             <w:r>
               <w:rPr>
@@ -2703,7 +2703,7 @@
               <w:noProof/>
             </w:rPr>
           </w:pPr>
-          <w:hyperlink w:anchor="_Toc202629172" w:history="1">
+          <w:hyperlink w:anchor="_Toc203387762" w:history="1">
             <w:r>
               <w:rPr>
                 <w:rStyle w:val="Hyperlink"/>
@@ -2748,7 +2748,7 @@
                 <w:noProof/>
                 <w:webHidden/>
               </w:rPr>
-              <w:instrText xml:space="preserve"> PAGEREF _Toc202629172 \h </w:instrText>
+              <w:instrText xml:space="preserve"> PAGEREF _Toc203387762 \h </w:instrText>
             </w:r>
             <w:r>
               <w:rPr>
@@ -2794,7 +2794,7 @@
               <w:noProof/>
             </w:rPr>
           </w:pPr>
-          <w:hyperlink w:anchor="_Toc202629173" w:history="1">
+          <w:hyperlink w:anchor="_Toc203387763" w:history="1">
             <w:r>
               <w:rPr>
                 <w:rStyle w:val="Hyperlink"/>
@@ -2821,7 +2821,7 @@
                 <w:noProof/>
                 <w:webHidden/>
               </w:rPr>
-              <w:instrText xml:space="preserve"> PAGEREF _Toc202629173 \h </w:instrText>
+              <w:instrText xml:space="preserve"> PAGEREF _Toc203387763 \h </w:instrText>
             </w:r>
             <w:r>
               <w:rPr>
@@ -2928,13 +2928,13 @@
           <w:r>
             <w:fldChar w:fldCharType="separate"/>
           </w:r>
-          <w:hyperlink w:anchor="_Toc202387375" w:history="1">
+          <w:hyperlink w:anchor="_Toc203387764" w:history="1">
             <w:r>
               <w:rPr>
                 <w:rStyle w:val="Hyperlink"/>
                 <w:noProof/>
               </w:rPr>
-              <w:t>Figure 1: Sales Distribution for Raw Data</w:t>
+              <w:t>Figure 1: ANN Diagram</w:t>
             </w:r>
             <w:r>
               <w:rPr>
@@ -2955,7 +2955,7 @@
                 <w:noProof/>
                 <w:webHidden/>
               </w:rPr>
-              <w:instrText xml:space="preserve"> PAGEREF _Toc202387375 \h </w:instrText>
+              <w:instrText xml:space="preserve"> PAGEREF _Toc203387764 \h </w:instrText>
             </w:r>
             <w:r>
               <w:rPr>
@@ -2975,7 +2975,7 @@
                 <w:noProof/>
                 <w:webHidden/>
               </w:rPr>
-              <w:t>6</w:t>
+              <w:t>4</w:t>
             </w:r>
             <w:r>
               <w:rPr>
@@ -2997,13 +2997,13 @@
               <w:noProof/>
             </w:rPr>
           </w:pPr>
-          <w:hyperlink w:anchor="_Toc202387376" w:history="1">
+          <w:hyperlink w:anchor="_Toc203387765" w:history="1">
             <w:r>
               <w:rPr>
                 <w:rStyle w:val="Hyperlink"/>
                 <w:noProof/>
               </w:rPr>
-              <w:t>Figure 2: Outlier Removal</w:t>
+              <w:t>Figure 2: Sales Distribution for Raw Data</w:t>
             </w:r>
             <w:r>
               <w:rPr>
@@ -3024,7 +3024,7 @@
                 <w:noProof/>
                 <w:webHidden/>
               </w:rPr>
-              <w:instrText xml:space="preserve"> PAGEREF _Toc202387376 \h </w:instrText>
+              <w:instrText xml:space="preserve"> PAGEREF _Toc203387765 \h </w:instrText>
             </w:r>
             <w:r>
               <w:rPr>
@@ -3044,7 +3044,7 @@
                 <w:noProof/>
                 <w:webHidden/>
               </w:rPr>
-              <w:t>7</w:t>
+              <w:t>6</w:t>
             </w:r>
             <w:r>
               <w:rPr>
@@ -3066,13 +3066,13 @@
               <w:noProof/>
             </w:rPr>
           </w:pPr>
-          <w:hyperlink w:anchor="_Toc202387377" w:history="1">
+          <w:hyperlink w:anchor="_Toc203387766" w:history="1">
             <w:r>
               <w:rPr>
                 <w:rStyle w:val="Hyperlink"/>
                 <w:noProof/>
               </w:rPr>
-              <w:t>Figure 3: Correlation Plot</w:t>
+              <w:t>Figure 3: Outlier Removal</w:t>
             </w:r>
             <w:r>
               <w:rPr>
@@ -3093,7 +3093,7 @@
                 <w:noProof/>
                 <w:webHidden/>
               </w:rPr>
-              <w:instrText xml:space="preserve"> PAGEREF _Toc202387377 \h </w:instrText>
+              <w:instrText xml:space="preserve"> PAGEREF _Toc203387766 \h </w:instrText>
             </w:r>
             <w:r>
               <w:rPr>
@@ -3113,7 +3113,7 @@
                 <w:noProof/>
                 <w:webHidden/>
               </w:rPr>
-              <w:t>8</w:t>
+              <w:t>7</w:t>
             </w:r>
             <w:r>
               <w:rPr>
@@ -3135,13 +3135,13 @@
               <w:noProof/>
             </w:rPr>
           </w:pPr>
-          <w:hyperlink w:anchor="_Toc202387378" w:history="1">
+          <w:hyperlink w:anchor="_Toc203387767" w:history="1">
             <w:r>
               <w:rPr>
                 <w:rStyle w:val="Hyperlink"/>
                 <w:noProof/>
               </w:rPr>
-              <w:t>Figure 4: Box-Cox Transformation</w:t>
+              <w:t>Figure 4: Correlation Plot</w:t>
             </w:r>
             <w:r>
               <w:rPr>
@@ -3162,7 +3162,76 @@
                 <w:noProof/>
                 <w:webHidden/>
               </w:rPr>
-              <w:instrText xml:space="preserve"> PAGEREF _Toc202387378 \h </w:instrText>
+              <w:instrText xml:space="preserve"> PAGEREF _Toc203387767 \h </w:instrText>
+            </w:r>
+            <w:r>
+              <w:rPr>
+                <w:noProof/>
+                <w:webHidden/>
+              </w:rPr>
+            </w:r>
+            <w:r>
+              <w:rPr>
+                <w:noProof/>
+                <w:webHidden/>
+              </w:rPr>
+              <w:fldChar w:fldCharType="separate"/>
+            </w:r>
+            <w:r>
+              <w:rPr>
+                <w:noProof/>
+                <w:webHidden/>
+              </w:rPr>
+              <w:t>8</w:t>
+            </w:r>
+            <w:r>
+              <w:rPr>
+                <w:noProof/>
+                <w:webHidden/>
+              </w:rPr>
+              <w:fldChar w:fldCharType="end"/>
+            </w:r>
+          </w:hyperlink>
+        </w:p>
+        <w:p>
+          <w:pPr>
+            <w:pStyle w:val="TableofFigures"/>
+            <w:tabs>
+              <w:tab w:val="right" w:leader="dot" w:pos="9350"/>
+            </w:tabs>
+            <w:rPr>
+              <w:rFonts w:asciiTheme="minorHAnsi" w:eastAsiaTheme="minorEastAsia" w:hAnsiTheme="minorHAnsi" w:cstheme="minorBidi"/>
+              <w:noProof/>
+            </w:rPr>
+          </w:pPr>
+          <w:hyperlink w:anchor="_Toc203387768" w:history="1">
+            <w:r>
+              <w:rPr>
+                <w:rStyle w:val="Hyperlink"/>
+                <w:noProof/>
+              </w:rPr>
+              <w:t>Figure 5: Box-Cox Transformation</w:t>
+            </w:r>
+            <w:r>
+              <w:rPr>
+                <w:noProof/>
+                <w:webHidden/>
+              </w:rPr>
+              <w:tab/>
+            </w:r>
+            <w:r>
+              <w:rPr>
+                <w:noProof/>
+                <w:webHidden/>
+              </w:rPr>
+              <w:fldChar w:fldCharType="begin"/>
+            </w:r>
+            <w:r>
+              <w:rPr>
+                <w:noProof/>
+                <w:webHidden/>
+              </w:rPr>
+              <w:instrText xml:space="preserve"> PAGEREF _Toc203387768 \h </w:instrText>
             </w:r>
             <w:r>
               <w:rPr>
@@ -3246,7 +3315,7 @@
           <w:r>
             <w:fldChar w:fldCharType="separate"/>
           </w:r>
-          <w:hyperlink w:anchor="_Toc202387381" w:history="1">
+          <w:hyperlink w:anchor="_Toc203387769" w:history="1">
             <w:r>
               <w:rPr>
                 <w:rStyle w:val="Hyperlink"/>
@@ -3273,7 +3342,7 @@
                 <w:noProof/>
                 <w:webHidden/>
               </w:rPr>
-              <w:instrText xml:space="preserve"> PAGEREF _Toc202387381 \h </w:instrText>
+              <w:instrText xml:space="preserve"> PAGEREF _Toc203387769 \h </w:instrText>
             </w:r>
             <w:r>
               <w:rPr>
@@ -3315,7 +3384,7 @@
               <w:noProof/>
             </w:rPr>
           </w:pPr>
-          <w:hyperlink w:anchor="_Toc202387382" w:history="1">
+          <w:hyperlink w:anchor="_Toc203387770" w:history="1">
             <w:r>
               <w:rPr>
                 <w:rStyle w:val="Hyperlink"/>
@@ -3342,7 +3411,7 @@
                 <w:noProof/>
                 <w:webHidden/>
               </w:rPr>
-              <w:instrText xml:space="preserve"> PAGEREF _Toc202387382 \h </w:instrText>
+              <w:instrText xml:space="preserve"> PAGEREF _Toc203387770 \h </w:instrText>
             </w:r>
             <w:r>
               <w:rPr>
@@ -3384,7 +3453,7 @@
               <w:noProof/>
             </w:rPr>
           </w:pPr>
-          <w:hyperlink w:anchor="_Toc202387383" w:history="1">
+          <w:hyperlink w:anchor="_Toc203387771" w:history="1">
             <w:r>
               <w:rPr>
                 <w:rStyle w:val="Hyperlink"/>
@@ -3411,7 +3480,7 @@
                 <w:noProof/>
                 <w:webHidden/>
               </w:rPr>
-              <w:instrText xml:space="preserve"> PAGEREF _Toc202387383 \h </w:instrText>
+              <w:instrText xml:space="preserve"> PAGEREF _Toc203387771 \h </w:instrText>
             </w:r>
             <w:r>
               <w:rPr>
@@ -3453,7 +3522,7 @@
               <w:noProof/>
             </w:rPr>
           </w:pPr>
-          <w:hyperlink w:anchor="_Toc202387384" w:history="1">
+          <w:hyperlink w:anchor="_Toc203387772" w:history="1">
             <w:r>
               <w:rPr>
                 <w:rStyle w:val="Hyperlink"/>
@@ -3480,7 +3549,7 @@
                 <w:noProof/>
                 <w:webHidden/>
               </w:rPr>
-              <w:instrText xml:space="preserve"> PAGEREF _Toc202387384 \h </w:instrText>
+              <w:instrText xml:space="preserve"> PAGEREF _Toc203387772 \h </w:instrText>
             </w:r>
             <w:r>
               <w:rPr>
@@ -3522,7 +3591,7 @@
               <w:noProof/>
             </w:rPr>
           </w:pPr>
-          <w:hyperlink w:anchor="_Toc202387385" w:history="1">
+          <w:hyperlink w:anchor="_Toc203387773" w:history="1">
             <w:r>
               <w:rPr>
                 <w:rStyle w:val="Hyperlink"/>
@@ -3549,7 +3618,7 @@
                 <w:noProof/>
                 <w:webHidden/>
               </w:rPr>
-              <w:instrText xml:space="preserve"> PAGEREF _Toc202387385 \h </w:instrText>
+              <w:instrText xml:space="preserve"> PAGEREF _Toc203387773 \h </w:instrText>
             </w:r>
             <w:r>
               <w:rPr>
@@ -3605,7 +3674,7 @@
           <w:rFonts w:eastAsia="Times New Roman"/>
         </w:rPr>
       </w:pPr>
-      <w:bookmarkStart w:id="0" w:name="_Toc202629155"/>
+      <w:bookmarkStart w:id="0" w:name="_Toc203387745"/>
       <w:r>
         <w:rPr>
           <w:rFonts w:eastAsia="Times New Roman"/>
@@ -3978,7 +4047,7 @@
           <w:rFonts w:eastAsia="Times New Roman"/>
         </w:rPr>
       </w:pPr>
-      <w:bookmarkStart w:id="1" w:name="_Toc202629156"/>
+      <w:bookmarkStart w:id="1" w:name="_Toc203387746"/>
       <w:r>
         <w:rPr>
           <w:rFonts w:eastAsia="Times New Roman"/>
@@ -4016,7 +4085,13 @@
         <w:t xml:space="preserve">. </w:t>
       </w:r>
       <w:r>
-        <w:t xml:space="preserve">A cleaned version of the data will be split into training and testing subsets and will </w:t>
+        <w:t xml:space="preserve">A cleaned version of the data </w:t>
+      </w:r>
+      <w:r>
+        <w:t xml:space="preserve">is </w:t>
+      </w:r>
+      <w:r>
+        <w:t xml:space="preserve">split into training and testing subsets and will </w:t>
       </w:r>
       <w:r>
         <w:t>use a Box-Cox transformation to transform the data</w:t>
@@ -4045,10 +4120,16 @@
         <w:t xml:space="preserve">model </w:t>
       </w:r>
       <w:r>
-        <w:t xml:space="preserve">training. The training subset will </w:t>
-      </w:r>
-      <w:r>
-        <w:t xml:space="preserve">undergo multiple rounds of machine learning and deep learning </w:t>
+        <w:t xml:space="preserve">training. The training subset </w:t>
+      </w:r>
+      <w:r>
+        <w:t>undergo</w:t>
+      </w:r>
+      <w:r>
+        <w:t>es</w:t>
+      </w:r>
+      <w:r>
+        <w:t xml:space="preserve"> multiple rounds of machine learning and deep learning </w:t>
       </w:r>
       <w:proofErr w:type="spellStart"/>
       <w:r>
@@ -4078,7 +4159,15 @@
         <w:t>s</w:t>
       </w:r>
       <w:r>
-        <w:t xml:space="preserve"> will be fitted to the testing data subset to measure its performance</w:t>
+        <w:t xml:space="preserve"> </w:t>
+      </w:r>
+      <w:proofErr w:type="gramStart"/>
+      <w:r>
+        <w:t>is</w:t>
+      </w:r>
+      <w:proofErr w:type="gramEnd"/>
+      <w:r>
+        <w:t xml:space="preserve"> fitted to the testing data subset to measure its performance</w:t>
       </w:r>
       <w:r>
         <w:t xml:space="preserve"> using </w:t>
@@ -4352,14 +4441,17 @@
         <w:t>n analytical</w:t>
       </w:r>
       <w:r>
-        <w:t xml:space="preserve"> workflow diagram.</w:t>
+        <w:t xml:space="preserve"> workflow diagram</w:t>
+      </w:r>
+      <w:r>
+        <w:t>.</w:t>
       </w:r>
     </w:p>
     <w:p>
       <w:pPr>
         <w:pStyle w:val="Heading2"/>
       </w:pPr>
-      <w:bookmarkStart w:id="2" w:name="_Toc202629157"/>
+      <w:bookmarkStart w:id="2" w:name="_Toc203387747"/>
       <w:r>
         <w:t>Models</w:t>
       </w:r>
@@ -4447,7 +4539,7 @@
       <w:pPr>
         <w:pStyle w:val="Heading3"/>
       </w:pPr>
-      <w:bookmarkStart w:id="3" w:name="_Toc202629158"/>
+      <w:bookmarkStart w:id="3" w:name="_Toc203387748"/>
       <w:r>
         <w:t>Linear Regression</w:t>
       </w:r>
@@ -4949,7 +5041,7 @@
       <w:pPr>
         <w:pStyle w:val="Heading3"/>
       </w:pPr>
-      <w:bookmarkStart w:id="4" w:name="_Toc202629159"/>
+      <w:bookmarkStart w:id="4" w:name="_Toc203387749"/>
       <w:r>
         <w:t>Elastic Net</w:t>
       </w:r>
@@ -4982,133 +5074,176 @@
         <w:t>Elastic Net</w:t>
       </w:r>
       <w:r>
-        <w:t xml:space="preserve"> can be described as the following equation</w:t>
+        <w:t xml:space="preserve"> can be described </w:t>
+      </w:r>
+      <w:r>
+        <w:t>by minimizing</w:t>
+      </w:r>
+      <w:r>
+        <w:t xml:space="preserve"> the following equation</w:t>
       </w:r>
       <w:r>
         <w:t>:</w:t>
       </w:r>
     </w:p>
-    <w:p/>
     <w:p>
       <w:pPr>
         <w:rPr>
           <w:rFonts w:eastAsiaTheme="minorEastAsia"/>
         </w:rPr>
       </w:pPr>
+    </w:p>
+    <w:p>
+      <w:pPr>
+        <w:rPr>
+          <w:rFonts w:eastAsiaTheme="minorEastAsia"/>
+        </w:rPr>
+      </w:pPr>
       <m:oMathPara>
-        <m:oMathParaPr>
-          <m:jc m:val="center"/>
-        </m:oMathParaPr>
         <m:oMath>
-          <m:r>
-            <m:rPr>
-              <m:nor/>
-            </m:rPr>
-            <w:rPr>
-              <w:rFonts w:ascii="Cambria Math" w:hAnsi="Cambria Math"/>
-            </w:rPr>
-            <m:t>Loss</m:t>
-          </m:r>
+          <m:acc>
+            <m:accPr>
+              <m:ctrlPr>
+                <w:rPr>
+                  <w:rFonts w:ascii="Cambria Math" w:hAnsi="Cambria Math"/>
+                  <w:i/>
+                </w:rPr>
+              </m:ctrlPr>
+            </m:accPr>
+            <m:e>
+              <m:r>
+                <w:rPr>
+                  <w:rFonts w:ascii="Cambria Math" w:hAnsi="Cambria Math"/>
+                </w:rPr>
+                <m:t>β</m:t>
+              </m:r>
+            </m:e>
+          </m:acc>
           <m:r>
             <w:rPr>
               <w:rFonts w:ascii="Cambria Math" w:hAnsi="Cambria Math"/>
             </w:rPr>
             <m:t>=</m:t>
           </m:r>
-          <m:f>
-            <m:fPr>
-              <m:ctrlPr>
-                <w:rPr>
-                  <w:rFonts w:ascii="Cambria Math" w:hAnsi="Cambria Math"/>
-                </w:rPr>
-              </m:ctrlPr>
-            </m:fPr>
-            <m:num>
-              <m:r>
-                <w:rPr>
-                  <w:rFonts w:ascii="Cambria Math" w:hAnsi="Cambria Math"/>
-                </w:rPr>
-                <m:t>1</m:t>
-              </m:r>
+          <m:sSup>
+            <m:sSupPr>
               <m:ctrlPr>
                 <w:rPr>
                   <w:rFonts w:ascii="Cambria Math" w:hAnsi="Cambria Math"/>
                   <w:i/>
                 </w:rPr>
               </m:ctrlPr>
-            </m:num>
-            <m:den>
-              <m:r>
-                <w:rPr>
-                  <w:rFonts w:ascii="Cambria Math" w:hAnsi="Cambria Math"/>
-                </w:rPr>
-                <m:t>n</m:t>
-              </m:r>
-              <m:ctrlPr>
-                <w:rPr>
-                  <w:rFonts w:ascii="Cambria Math" w:hAnsi="Cambria Math"/>
-                  <w:i/>
-                </w:rPr>
-              </m:ctrlPr>
-            </m:den>
-          </m:f>
-          <m:nary>
-            <m:naryPr>
-              <m:chr m:val="∑"/>
-              <m:ctrlPr>
-                <w:rPr>
-                  <w:rFonts w:ascii="Cambria Math" w:hAnsi="Cambria Math"/>
-                </w:rPr>
-              </m:ctrlPr>
-            </m:naryPr>
-            <m:sub>
-              <m:r>
-                <w:rPr>
-                  <w:rFonts w:ascii="Cambria Math" w:hAnsi="Cambria Math"/>
-                </w:rPr>
-                <m:t>i=1</m:t>
-              </m:r>
-              <m:ctrlPr>
-                <w:rPr>
-                  <w:rFonts w:ascii="Cambria Math" w:hAnsi="Cambria Math"/>
-                  <w:i/>
-                </w:rPr>
-              </m:ctrlPr>
-            </m:sub>
-            <m:sup>
-              <m:r>
-                <w:rPr>
-                  <w:rFonts w:ascii="Cambria Math" w:hAnsi="Cambria Math"/>
-                </w:rPr>
-                <m:t>n</m:t>
-              </m:r>
-              <m:ctrlPr>
-                <w:rPr>
-                  <w:rFonts w:ascii="Cambria Math" w:hAnsi="Cambria Math"/>
-                  <w:i/>
-                </w:rPr>
-              </m:ctrlPr>
-            </m:sup>
+            </m:sSupPr>
             <m:e>
-              <m:sSup>
-                <m:sSupPr>
+              <m:func>
+                <m:funcPr>
                   <m:ctrlPr>
                     <w:rPr>
                       <w:rFonts w:ascii="Cambria Math" w:hAnsi="Cambria Math"/>
                       <w:i/>
                     </w:rPr>
                   </m:ctrlPr>
-                </m:sSupPr>
-                <m:e>
-                  <m:d>
-                    <m:dPr>
+                </m:funcPr>
+                <m:fName>
+                  <m:limLow>
+                    <m:limLowPr>
                       <m:ctrlPr>
                         <w:rPr>
                           <w:rFonts w:ascii="Cambria Math" w:hAnsi="Cambria Math"/>
                           <w:i/>
                         </w:rPr>
                       </m:ctrlPr>
-                    </m:dPr>
+                    </m:limLowPr>
+                    <m:e>
+                      <m:r>
+                        <m:rPr>
+                          <m:sty m:val="p"/>
+                        </m:rPr>
+                        <w:rPr>
+                          <w:rFonts w:ascii="Cambria Math" w:hAnsi="Cambria Math"/>
+                        </w:rPr>
+                        <m:t>min</m:t>
+                      </m:r>
+                      <m:ctrlPr>
+                        <w:rPr>
+                          <w:rFonts w:ascii="Cambria Math" w:hAnsi="Cambria Math"/>
+                        </w:rPr>
+                      </m:ctrlPr>
+                    </m:e>
+                    <m:lim>
+                      <m:r>
+                        <w:rPr>
+                          <w:rFonts w:ascii="Cambria Math" w:hAnsi="Cambria Math"/>
+                        </w:rPr>
+                        <m:t>β</m:t>
+                      </m:r>
+                      <m:ctrlPr>
+                        <w:rPr>
+                          <w:rFonts w:ascii="Cambria Math" w:hAnsi="Cambria Math"/>
+                        </w:rPr>
+                      </m:ctrlPr>
+                    </m:lim>
+                  </m:limLow>
+                </m:fName>
+                <m:e>
+                  <m:r>
+                    <w:rPr>
+                      <w:rFonts w:ascii="Cambria Math" w:hAnsi="Cambria Math"/>
+                    </w:rPr>
+                    <m:t>||</m:t>
+                  </m:r>
+                </m:e>
+              </m:func>
+              <m:d>
+                <m:dPr>
+                  <m:ctrlPr>
+                    <w:rPr>
+                      <w:rFonts w:ascii="Cambria Math" w:hAnsi="Cambria Math"/>
+                      <w:i/>
+                    </w:rPr>
+                  </m:ctrlPr>
+                </m:dPr>
+                <m:e>
+                  <m:sSub>
+                    <m:sSubPr>
+                      <m:ctrlPr>
+                        <w:rPr>
+                          <w:rFonts w:ascii="Cambria Math" w:hAnsi="Cambria Math"/>
+                          <w:i/>
+                        </w:rPr>
+                      </m:ctrlPr>
+                    </m:sSubPr>
+                    <m:e>
+                      <m:r>
+                        <w:rPr>
+                          <w:rFonts w:ascii="Cambria Math" w:hAnsi="Cambria Math"/>
+                        </w:rPr>
+                        <m:t>y</m:t>
+                      </m:r>
+                    </m:e>
+                    <m:sub>
+                      <m:r>
+                        <w:rPr>
+                          <w:rFonts w:ascii="Cambria Math" w:hAnsi="Cambria Math"/>
+                        </w:rPr>
+                        <m:t>i</m:t>
+                      </m:r>
+                    </m:sub>
+                  </m:sSub>
+                  <m:r>
+                    <w:rPr>
+                      <w:rFonts w:ascii="Cambria Math" w:hAnsi="Cambria Math"/>
+                    </w:rPr>
+                    <m:t>-</m:t>
+                  </m:r>
+                  <m:acc>
+                    <m:accPr>
+                      <m:ctrlPr>
+                        <w:rPr>
+                          <w:rFonts w:ascii="Cambria Math" w:hAnsi="Cambria Math"/>
+                        </w:rPr>
+                      </m:ctrlPr>
+                    </m:accPr>
                     <m:e>
                       <m:sSub>
                         <m:sSubPr>
@@ -5126,6 +5261,11 @@
                             </w:rPr>
                             <m:t>y</m:t>
                           </m:r>
+                          <m:ctrlPr>
+                            <w:rPr>
+                              <w:rFonts w:ascii="Cambria Math" w:hAnsi="Cambria Math"/>
+                            </w:rPr>
+                          </m:ctrlPr>
                         </m:e>
                         <m:sub>
                           <m:r>
@@ -5136,74 +5276,26 @@
                           </m:r>
                         </m:sub>
                       </m:sSub>
-                      <m:r>
-                        <w:rPr>
-                          <w:rFonts w:ascii="Cambria Math" w:hAnsi="Cambria Math"/>
-                        </w:rPr>
-                        <m:t>-</m:t>
-                      </m:r>
-                      <m:acc>
-                        <m:accPr>
-                          <m:ctrlPr>
-                            <w:rPr>
-                              <w:rFonts w:ascii="Cambria Math" w:hAnsi="Cambria Math"/>
-                            </w:rPr>
-                          </m:ctrlPr>
-                        </m:accPr>
-                        <m:e>
-                          <m:sSub>
-                            <m:sSubPr>
-                              <m:ctrlPr>
-                                <w:rPr>
-                                  <w:rFonts w:ascii="Cambria Math" w:hAnsi="Cambria Math"/>
-                                  <w:i/>
-                                </w:rPr>
-                              </m:ctrlPr>
-                            </m:sSubPr>
-                            <m:e>
-                              <m:r>
-                                <w:rPr>
-                                  <w:rFonts w:ascii="Cambria Math" w:hAnsi="Cambria Math"/>
-                                </w:rPr>
-                                <m:t>y</m:t>
-                              </m:r>
-                              <m:ctrlPr>
-                                <w:rPr>
-                                  <w:rFonts w:ascii="Cambria Math" w:hAnsi="Cambria Math"/>
-                                </w:rPr>
-                              </m:ctrlPr>
-                            </m:e>
-                            <m:sub>
-                              <m:r>
-                                <w:rPr>
-                                  <w:rFonts w:ascii="Cambria Math" w:hAnsi="Cambria Math"/>
-                                </w:rPr>
-                                <m:t>i</m:t>
-                              </m:r>
-                            </m:sub>
-                          </m:sSub>
-                        </m:e>
-                      </m:acc>
                     </m:e>
-                  </m:d>
+                  </m:acc>
                 </m:e>
-                <m:sup>
-                  <m:r>
-                    <w:rPr>
-                      <w:rFonts w:ascii="Cambria Math" w:hAnsi="Cambria Math"/>
-                    </w:rPr>
-                    <m:t>2</m:t>
-                  </m:r>
-                </m:sup>
-              </m:sSup>
-              <m:ctrlPr>
+              </m:d>
+              <m:r>
                 <w:rPr>
                   <w:rFonts w:ascii="Cambria Math" w:hAnsi="Cambria Math"/>
-                  <w:i/>
                 </w:rPr>
-              </m:ctrlPr>
+                <m:t>||</m:t>
+              </m:r>
             </m:e>
-          </m:nary>
+            <m:sup>
+              <m:r>
+                <w:rPr>
+                  <w:rFonts w:ascii="Cambria Math" w:hAnsi="Cambria Math"/>
+                </w:rPr>
+                <m:t>2</m:t>
+              </m:r>
+            </m:sup>
+          </m:sSup>
           <m:r>
             <w:rPr>
               <w:rFonts w:ascii="Cambria Math" w:hAnsi="Cambria Math"/>
@@ -5779,7 +5871,7 @@
       <w:pPr>
         <w:pStyle w:val="Heading3"/>
       </w:pPr>
-      <w:bookmarkStart w:id="5" w:name="_Toc202629160"/>
+      <w:bookmarkStart w:id="5" w:name="_Toc203387750"/>
       <w:r>
         <w:t>Random Forest</w:t>
       </w:r>
@@ -5799,7 +5891,13 @@
         <w:t>multiple</w:t>
       </w:r>
       <w:r>
-        <w:t xml:space="preserve"> decision trees using bootstrapped samples and random subsets of features. Each tree contributes to the final prediction through majority voting (classification) or averaging (regression). </w:t>
+        <w:t xml:space="preserve"> decision trees using bootstrapped samples and random subsets of features. Each tree contributes to the final prediction through majority voting </w:t>
+      </w:r>
+      <w:r>
+        <w:t>(</w:t>
+      </w:r>
+      <w:r>
+        <w:t xml:space="preserve">classification) or averaging (regression). </w:t>
       </w:r>
       <w:r>
         <w:t>Random Forest</w:t>
@@ -5829,7 +5927,10 @@
         <w:t>it</w:t>
       </w:r>
       <w:r>
-        <w:t xml:space="preserve"> can typically be described as the following equation:</w:t>
+        <w:t xml:space="preserve"> can typically be described as </w:t>
+      </w:r>
+      <w:r>
+        <w:t>drawing a bootstrap sample form the training dataset and fitting a model to each sample as shown the in the equation below:</w:t>
       </w:r>
     </w:p>
     <w:p/>
@@ -5861,6 +5962,12 @@
               </m:r>
             </m:e>
           </m:acc>
+          <m:r>
+            <w:rPr>
+              <w:rFonts w:ascii="Cambria Math" w:hAnsi="Cambria Math"/>
+            </w:rPr>
+            <m:t>(x)</m:t>
+          </m:r>
           <m:r>
             <w:rPr>
               <w:rFonts w:ascii="Cambria Math" w:hAnsi="Cambria Math"/>
@@ -5894,7 +6001,7 @@
                 <w:rPr>
                   <w:rFonts w:ascii="Cambria Math" w:hAnsi="Cambria Math"/>
                 </w:rPr>
-                <m:t>T</m:t>
+                <m:t>B</m:t>
               </m:r>
               <m:ctrlPr>
                 <w:rPr>
@@ -5918,7 +6025,13 @@
                 <w:rPr>
                   <w:rFonts w:ascii="Cambria Math" w:hAnsi="Cambria Math"/>
                 </w:rPr>
-                <m:t>t=1</m:t>
+                <m:t>b</m:t>
+              </m:r>
+              <m:r>
+                <w:rPr>
+                  <w:rFonts w:ascii="Cambria Math" w:hAnsi="Cambria Math"/>
+                </w:rPr>
+                <m:t>=1</m:t>
               </m:r>
               <m:ctrlPr>
                 <w:rPr>
@@ -5932,7 +6045,7 @@
                 <w:rPr>
                   <w:rFonts w:ascii="Cambria Math" w:hAnsi="Cambria Math"/>
                 </w:rPr>
-                <m:t>T</m:t>
+                <m:t>B</m:t>
               </m:r>
               <m:ctrlPr>
                 <w:rPr>
@@ -5964,7 +6077,7 @@
                     <w:rPr>
                       <w:rFonts w:ascii="Cambria Math" w:hAnsi="Cambria Math"/>
                     </w:rPr>
-                    <m:t>t</m:t>
+                    <m:t>b</m:t>
                   </m:r>
                 </m:sub>
               </m:sSub>
@@ -6034,11 +6147,29 @@
             </m:r>
           </m:e>
         </m:acc>
+        <m:d>
+          <m:dPr>
+            <m:ctrlPr>
+              <w:rPr>
+                <w:rFonts w:ascii="Cambria Math" w:hAnsi="Cambria Math"/>
+                <w:i/>
+              </w:rPr>
+            </m:ctrlPr>
+          </m:dPr>
+          <m:e>
+            <m:r>
+              <w:rPr>
+                <w:rFonts w:ascii="Cambria Math" w:hAnsi="Cambria Math"/>
+              </w:rPr>
+              <m:t>x</m:t>
+            </m:r>
+          </m:e>
+        </m:d>
         <m:r>
           <w:rPr>
             <w:rFonts w:ascii="Cambria Math" w:hAnsi="Cambria Math"/>
           </w:rPr>
-          <m:t>:  Final prediction</m:t>
+          <m:t>:  Final prediction at point x</m:t>
         </m:r>
       </m:oMath>
     </w:p>
@@ -6076,7 +6207,7 @@
               <w:rPr>
                 <w:rFonts w:ascii="Cambria Math" w:eastAsiaTheme="minorEastAsia" w:hAnsi="Cambria Math"/>
               </w:rPr>
-              <m:t>t</m:t>
+              <m:t>b</m:t>
             </m:r>
           </m:sub>
         </m:sSub>
@@ -6102,7 +6233,19 @@
           <w:rPr>
             <w:rFonts w:ascii="Cambria Math" w:eastAsiaTheme="minorEastAsia" w:hAnsi="Cambria Math"/>
           </w:rPr>
-          <m:t>:  Prediction from the t'th decision tree</m:t>
+          <m:t xml:space="preserve">:  Prediction from the </m:t>
+        </m:r>
+        <m:r>
+          <w:rPr>
+            <w:rFonts w:ascii="Cambria Math" w:eastAsiaTheme="minorEastAsia" w:hAnsi="Cambria Math"/>
+          </w:rPr>
+          <m:t>b</m:t>
+        </m:r>
+        <m:r>
+          <w:rPr>
+            <w:rFonts w:ascii="Cambria Math" w:eastAsiaTheme="minorEastAsia" w:hAnsi="Cambria Math"/>
+          </w:rPr>
+          <m:t>'th decision tree</m:t>
         </m:r>
       </m:oMath>
     </w:p>
@@ -6122,7 +6265,13 @@
           <w:rPr>
             <w:rFonts w:ascii="Cambria Math" w:eastAsiaTheme="minorEastAsia" w:hAnsi="Cambria Math"/>
           </w:rPr>
-          <m:t>T:  Total number of trees</m:t>
+          <m:t>B</m:t>
+        </m:r>
+        <m:r>
+          <w:rPr>
+            <w:rFonts w:ascii="Cambria Math" w:eastAsiaTheme="minorEastAsia" w:hAnsi="Cambria Math"/>
+          </w:rPr>
+          <m:t>:  Total number of trees</m:t>
         </m:r>
       </m:oMath>
     </w:p>
@@ -6131,18 +6280,34 @@
       <w:pPr>
         <w:pStyle w:val="Heading3"/>
       </w:pPr>
-      <w:bookmarkStart w:id="6" w:name="_Toc202629161"/>
-      <w:r>
-        <w:t>Artificial Neural Network</w:t>
-      </w:r>
-      <w:r>
-        <w:t xml:space="preserve"> (ANN)</w:t>
+      <w:bookmarkStart w:id="6" w:name="_Toc203387751"/>
+      <w:r>
+        <w:t>Light Gradient Boosting Machine</w:t>
+      </w:r>
+      <w:r>
+        <w:t xml:space="preserve"> (</w:t>
+      </w:r>
+      <w:proofErr w:type="spellStart"/>
+      <w:r>
+        <w:t>LightGBM</w:t>
+      </w:r>
+      <w:proofErr w:type="spellEnd"/>
+      <w:r>
+        <w:t>)</w:t>
       </w:r>
       <w:bookmarkEnd w:id="6"/>
     </w:p>
     <w:p>
       <w:r>
-        <w:t>A layered computational model composed of input, hidden, and output layers, where each node simulates a neuron. During training, the network adjusts the weights of connections between nodes to minimize prediction error. ANNs are powerful for capturing intricate patterns and nonlinear dependencies, making them suitable for tasks like image recognition, time series forecasting, and natural language processing.</w:t>
+        <w:t xml:space="preserve">A high-performance gradient boosting framework that builds decision trees sequentially, with each new tree correcting the errors of its predecessors. It uses histogram-based algorithms and leaf-wise tree growth to improve speed and accuracy. </w:t>
+      </w:r>
+      <w:proofErr w:type="spellStart"/>
+      <w:r>
+        <w:t>LightGBM</w:t>
+      </w:r>
+      <w:proofErr w:type="spellEnd"/>
+      <w:r>
+        <w:t xml:space="preserve"> is well-suited for large-scale structured data and excels in both classification and regression tasks, especially when model performance is prioritized over training time.</w:t>
       </w:r>
       <w:r>
         <w:t xml:space="preserve"> </w:t>
@@ -6151,885 +6316,29 @@
     <w:p/>
     <w:p>
       <w:r>
-        <w:t>For a simple feedforward network with one hidden layer</w:t>
-      </w:r>
-      <w:r>
-        <w:t>, ANN can be described as the following equation:</w:t>
+        <w:t xml:space="preserve">Like Random Forest, </w:t>
+      </w:r>
+      <w:proofErr w:type="spellStart"/>
+      <w:r>
+        <w:t>LightGBM</w:t>
+      </w:r>
+      <w:proofErr w:type="spellEnd"/>
+      <w:r>
+        <w:t xml:space="preserve"> is</w:t>
+      </w:r>
+      <w:r>
+        <w:t xml:space="preserve"> not a single </w:t>
+      </w:r>
+      <w:r>
+        <w:t xml:space="preserve">close-formed </w:t>
+      </w:r>
+      <w:r>
+        <w:t>equation, but the model is built iteratively</w:t>
+      </w:r>
+      <w:r>
+        <w:t xml:space="preserve"> as described in the equation below:</w:t>
       </w:r>
     </w:p>
-    <w:p/>
-    <w:p>
-      <w:pPr>
-        <w:rPr>
-          <w:rFonts w:eastAsiaTheme="minorEastAsia"/>
-        </w:rPr>
-      </w:pPr>
-      <m:oMathPara>
-        <m:oMathParaPr>
-          <m:jc m:val="center"/>
-        </m:oMathParaPr>
-        <m:oMath>
-          <m:acc>
-            <m:accPr>
-              <m:ctrlPr>
-                <w:rPr>
-                  <w:rFonts w:ascii="Cambria Math" w:hAnsi="Cambria Math"/>
-                </w:rPr>
-              </m:ctrlPr>
-            </m:accPr>
-            <m:e>
-              <m:r>
-                <w:rPr>
-                  <w:rFonts w:ascii="Cambria Math" w:hAnsi="Cambria Math"/>
-                </w:rPr>
-                <m:t>y</m:t>
-              </m:r>
-            </m:e>
-          </m:acc>
-          <m:r>
-            <w:rPr>
-              <w:rFonts w:ascii="Cambria Math" w:hAnsi="Cambria Math"/>
-            </w:rPr>
-            <m:t>=f</m:t>
-          </m:r>
-          <m:d>
-            <m:dPr>
-              <m:ctrlPr>
-                <w:rPr>
-                  <w:rFonts w:ascii="Cambria Math" w:hAnsi="Cambria Math"/>
-                </w:rPr>
-              </m:ctrlPr>
-            </m:dPr>
-            <m:e>
-              <m:nary>
-                <m:naryPr>
-                  <m:chr m:val="∑"/>
-                  <m:ctrlPr>
-                    <w:rPr>
-                      <w:rFonts w:ascii="Cambria Math" w:hAnsi="Cambria Math"/>
-                    </w:rPr>
-                  </m:ctrlPr>
-                </m:naryPr>
-                <m:sub>
-                  <m:r>
-                    <w:rPr>
-                      <w:rFonts w:ascii="Cambria Math" w:hAnsi="Cambria Math"/>
-                    </w:rPr>
-                    <m:t>j=1</m:t>
-                  </m:r>
-                  <m:ctrlPr>
-                    <w:rPr>
-                      <w:rFonts w:ascii="Cambria Math" w:hAnsi="Cambria Math"/>
-                      <w:i/>
-                    </w:rPr>
-                  </m:ctrlPr>
-                </m:sub>
-                <m:sup>
-                  <m:r>
-                    <w:rPr>
-                      <w:rFonts w:ascii="Cambria Math" w:hAnsi="Cambria Math"/>
-                    </w:rPr>
-                    <m:t>H</m:t>
-                  </m:r>
-                  <m:ctrlPr>
-                    <w:rPr>
-                      <w:rFonts w:ascii="Cambria Math" w:hAnsi="Cambria Math"/>
-                      <w:i/>
-                    </w:rPr>
-                  </m:ctrlPr>
-                </m:sup>
-                <m:e>
-                  <m:sSubSup>
-                    <m:sSubSupPr>
-                      <m:ctrlPr>
-                        <w:rPr>
-                          <w:rFonts w:ascii="Cambria Math" w:hAnsi="Cambria Math"/>
-                          <w:i/>
-                        </w:rPr>
-                      </m:ctrlPr>
-                    </m:sSubSupPr>
-                    <m:e>
-                      <m:r>
-                        <w:rPr>
-                          <w:rFonts w:ascii="Cambria Math" w:hAnsi="Cambria Math"/>
-                        </w:rPr>
-                        <m:t>w</m:t>
-                      </m:r>
-                    </m:e>
-                    <m:sub>
-                      <m:r>
-                        <w:rPr>
-                          <w:rFonts w:ascii="Cambria Math" w:hAnsi="Cambria Math"/>
-                        </w:rPr>
-                        <m:t>j</m:t>
-                      </m:r>
-                    </m:sub>
-                    <m:sup>
-                      <m:d>
-                        <m:dPr>
-                          <m:ctrlPr>
-                            <w:rPr>
-                              <w:rFonts w:ascii="Cambria Math" w:hAnsi="Cambria Math"/>
-                              <w:i/>
-                            </w:rPr>
-                          </m:ctrlPr>
-                        </m:dPr>
-                        <m:e>
-                          <m:r>
-                            <w:rPr>
-                              <w:rFonts w:ascii="Cambria Math" w:hAnsi="Cambria Math"/>
-                            </w:rPr>
-                            <m:t>2</m:t>
-                          </m:r>
-                        </m:e>
-                      </m:d>
-                    </m:sup>
-                  </m:sSubSup>
-                  <m:ctrlPr>
-                    <w:rPr>
-                      <w:rFonts w:ascii="Cambria Math" w:hAnsi="Cambria Math"/>
-                      <w:i/>
-                    </w:rPr>
-                  </m:ctrlPr>
-                </m:e>
-              </m:nary>
-              <m:r>
-                <m:rPr>
-                  <m:sty m:val="p"/>
-                </m:rPr>
-                <w:rPr>
-                  <w:rFonts w:ascii="Cambria Math" w:hAnsi="Cambria Math"/>
-                </w:rPr>
-                <m:t>⋅σ</m:t>
-              </m:r>
-              <m:d>
-                <m:dPr>
-                  <m:ctrlPr>
-                    <w:rPr>
-                      <w:rFonts w:ascii="Cambria Math" w:hAnsi="Cambria Math"/>
-                    </w:rPr>
-                  </m:ctrlPr>
-                </m:dPr>
-                <m:e>
-                  <m:nary>
-                    <m:naryPr>
-                      <m:chr m:val="∑"/>
-                      <m:ctrlPr>
-                        <w:rPr>
-                          <w:rFonts w:ascii="Cambria Math" w:hAnsi="Cambria Math"/>
-                        </w:rPr>
-                      </m:ctrlPr>
-                    </m:naryPr>
-                    <m:sub>
-                      <m:r>
-                        <w:rPr>
-                          <w:rFonts w:ascii="Cambria Math" w:hAnsi="Cambria Math"/>
-                        </w:rPr>
-                        <m:t>i=1</m:t>
-                      </m:r>
-                      <m:ctrlPr>
-                        <w:rPr>
-                          <w:rFonts w:ascii="Cambria Math" w:hAnsi="Cambria Math"/>
-                          <w:i/>
-                        </w:rPr>
-                      </m:ctrlPr>
-                    </m:sub>
-                    <m:sup>
-                      <m:r>
-                        <w:rPr>
-                          <w:rFonts w:ascii="Cambria Math" w:hAnsi="Cambria Math"/>
-                        </w:rPr>
-                        <m:t>p</m:t>
-                      </m:r>
-                      <m:ctrlPr>
-                        <w:rPr>
-                          <w:rFonts w:ascii="Cambria Math" w:hAnsi="Cambria Math"/>
-                          <w:i/>
-                        </w:rPr>
-                      </m:ctrlPr>
-                    </m:sup>
-                    <m:e>
-                      <m:sSubSup>
-                        <m:sSubSupPr>
-                          <m:ctrlPr>
-                            <w:rPr>
-                              <w:rFonts w:ascii="Cambria Math" w:hAnsi="Cambria Math"/>
-                              <w:i/>
-                            </w:rPr>
-                          </m:ctrlPr>
-                        </m:sSubSupPr>
-                        <m:e>
-                          <m:r>
-                            <w:rPr>
-                              <w:rFonts w:ascii="Cambria Math" w:hAnsi="Cambria Math"/>
-                            </w:rPr>
-                            <m:t>w</m:t>
-                          </m:r>
-                        </m:e>
-                        <m:sub>
-                          <m:r>
-                            <w:rPr>
-                              <w:rFonts w:ascii="Cambria Math" w:hAnsi="Cambria Math"/>
-                            </w:rPr>
-                            <m:t>ij</m:t>
-                          </m:r>
-                        </m:sub>
-                        <m:sup>
-                          <m:d>
-                            <m:dPr>
-                              <m:ctrlPr>
-                                <w:rPr>
-                                  <w:rFonts w:ascii="Cambria Math" w:hAnsi="Cambria Math"/>
-                                  <w:i/>
-                                </w:rPr>
-                              </m:ctrlPr>
-                            </m:dPr>
-                            <m:e>
-                              <m:r>
-                                <w:rPr>
-                                  <w:rFonts w:ascii="Cambria Math" w:hAnsi="Cambria Math"/>
-                                </w:rPr>
-                                <m:t>1</m:t>
-                              </m:r>
-                            </m:e>
-                          </m:d>
-                        </m:sup>
-                      </m:sSubSup>
-                      <m:sSub>
-                        <m:sSubPr>
-                          <m:ctrlPr>
-                            <w:rPr>
-                              <w:rFonts w:ascii="Cambria Math" w:hAnsi="Cambria Math"/>
-                              <w:i/>
-                            </w:rPr>
-                          </m:ctrlPr>
-                        </m:sSubPr>
-                        <m:e>
-                          <m:r>
-                            <w:rPr>
-                              <w:rFonts w:ascii="Cambria Math" w:hAnsi="Cambria Math"/>
-                            </w:rPr>
-                            <m:t>x</m:t>
-                          </m:r>
-                        </m:e>
-                        <m:sub>
-                          <m:r>
-                            <w:rPr>
-                              <w:rFonts w:ascii="Cambria Math" w:hAnsi="Cambria Math"/>
-                            </w:rPr>
-                            <m:t>i</m:t>
-                          </m:r>
-                        </m:sub>
-                      </m:sSub>
-                      <m:ctrlPr>
-                        <w:rPr>
-                          <w:rFonts w:ascii="Cambria Math" w:hAnsi="Cambria Math"/>
-                          <w:i/>
-                        </w:rPr>
-                      </m:ctrlPr>
-                    </m:e>
-                  </m:nary>
-                  <m:r>
-                    <w:rPr>
-                      <w:rFonts w:ascii="Cambria Math" w:hAnsi="Cambria Math"/>
-                    </w:rPr>
-                    <m:t>+</m:t>
-                  </m:r>
-                  <m:sSubSup>
-                    <m:sSubSupPr>
-                      <m:ctrlPr>
-                        <w:rPr>
-                          <w:rFonts w:ascii="Cambria Math" w:hAnsi="Cambria Math"/>
-                          <w:i/>
-                        </w:rPr>
-                      </m:ctrlPr>
-                    </m:sSubSupPr>
-                    <m:e>
-                      <m:r>
-                        <w:rPr>
-                          <w:rFonts w:ascii="Cambria Math" w:hAnsi="Cambria Math"/>
-                        </w:rPr>
-                        <m:t>b</m:t>
-                      </m:r>
-                    </m:e>
-                    <m:sub>
-                      <m:r>
-                        <w:rPr>
-                          <w:rFonts w:ascii="Cambria Math" w:hAnsi="Cambria Math"/>
-                        </w:rPr>
-                        <m:t>j</m:t>
-                      </m:r>
-                    </m:sub>
-                    <m:sup>
-                      <m:d>
-                        <m:dPr>
-                          <m:ctrlPr>
-                            <w:rPr>
-                              <w:rFonts w:ascii="Cambria Math" w:hAnsi="Cambria Math"/>
-                              <w:i/>
-                            </w:rPr>
-                          </m:ctrlPr>
-                        </m:dPr>
-                        <m:e>
-                          <m:r>
-                            <w:rPr>
-                              <w:rFonts w:ascii="Cambria Math" w:hAnsi="Cambria Math"/>
-                            </w:rPr>
-                            <m:t>1</m:t>
-                          </m:r>
-                        </m:e>
-                      </m:d>
-                    </m:sup>
-                  </m:sSubSup>
-                  <m:ctrlPr>
-                    <w:rPr>
-                      <w:rFonts w:ascii="Cambria Math" w:hAnsi="Cambria Math"/>
-                      <w:i/>
-                    </w:rPr>
-                  </m:ctrlPr>
-                </m:e>
-              </m:d>
-              <m:r>
-                <w:rPr>
-                  <w:rFonts w:ascii="Cambria Math" w:hAnsi="Cambria Math"/>
-                </w:rPr>
-                <m:t>+</m:t>
-              </m:r>
-              <m:sSup>
-                <m:sSupPr>
-                  <m:ctrlPr>
-                    <w:rPr>
-                      <w:rFonts w:ascii="Cambria Math" w:hAnsi="Cambria Math"/>
-                      <w:i/>
-                    </w:rPr>
-                  </m:ctrlPr>
-                </m:sSupPr>
-                <m:e>
-                  <m:r>
-                    <w:rPr>
-                      <w:rFonts w:ascii="Cambria Math" w:hAnsi="Cambria Math"/>
-                    </w:rPr>
-                    <m:t>b</m:t>
-                  </m:r>
-                </m:e>
-                <m:sup>
-                  <m:d>
-                    <m:dPr>
-                      <m:ctrlPr>
-                        <w:rPr>
-                          <w:rFonts w:ascii="Cambria Math" w:hAnsi="Cambria Math"/>
-                          <w:i/>
-                        </w:rPr>
-                      </m:ctrlPr>
-                    </m:dPr>
-                    <m:e>
-                      <m:r>
-                        <w:rPr>
-                          <w:rFonts w:ascii="Cambria Math" w:hAnsi="Cambria Math"/>
-                        </w:rPr>
-                        <m:t>2</m:t>
-                      </m:r>
-                    </m:e>
-                  </m:d>
-                </m:sup>
-              </m:sSup>
-              <m:ctrlPr>
-                <w:rPr>
-                  <w:rFonts w:ascii="Cambria Math" w:hAnsi="Cambria Math"/>
-                  <w:i/>
-                </w:rPr>
-              </m:ctrlPr>
-            </m:e>
-          </m:d>
-        </m:oMath>
-      </m:oMathPara>
-    </w:p>
-    <w:p>
-      <w:pPr>
-        <w:rPr>
-          <w:rFonts w:eastAsiaTheme="minorEastAsia"/>
-        </w:rPr>
-      </w:pPr>
-    </w:p>
-    <w:p>
-      <w:pPr>
-        <w:pStyle w:val="ListParagraph"/>
-        <w:numPr>
-          <w:ilvl w:val="0"/>
-          <w:numId w:val="4"/>
-        </w:numPr>
-        <w:rPr>
-          <w:rFonts w:eastAsiaTheme="minorEastAsia"/>
-        </w:rPr>
-      </w:pPr>
-      <m:oMath>
-        <m:sSub>
-          <m:sSubPr>
-            <m:ctrlPr>
-              <w:rPr>
-                <w:rFonts w:ascii="Cambria Math" w:hAnsi="Cambria Math"/>
-                <w:i/>
-              </w:rPr>
-            </m:ctrlPr>
-          </m:sSubPr>
-          <m:e>
-            <m:r>
-              <w:rPr>
-                <w:rFonts w:ascii="Cambria Math" w:hAnsi="Cambria Math"/>
-              </w:rPr>
-              <m:t>x</m:t>
-            </m:r>
-          </m:e>
-          <m:sub>
-            <m:r>
-              <w:rPr>
-                <w:rFonts w:ascii="Cambria Math" w:hAnsi="Cambria Math"/>
-              </w:rPr>
-              <m:t>i</m:t>
-            </m:r>
-          </m:sub>
-        </m:sSub>
-        <m:r>
-          <w:rPr>
-            <w:rFonts w:ascii="Cambria Math" w:hAnsi="Cambria Math"/>
-          </w:rPr>
-          <m:t>:  Input feature i</m:t>
-        </m:r>
-      </m:oMath>
-    </w:p>
-    <w:p>
-      <w:pPr>
-        <w:pStyle w:val="ListParagraph"/>
-        <w:numPr>
-          <w:ilvl w:val="0"/>
-          <w:numId w:val="4"/>
-        </w:numPr>
-        <w:rPr>
-          <w:rFonts w:eastAsiaTheme="minorEastAsia"/>
-        </w:rPr>
-      </w:pPr>
-      <m:oMath>
-        <m:sSubSup>
-          <m:sSubSupPr>
-            <m:ctrlPr>
-              <w:rPr>
-                <w:rFonts w:ascii="Cambria Math" w:eastAsiaTheme="minorEastAsia" w:hAnsi="Cambria Math"/>
-                <w:i/>
-              </w:rPr>
-            </m:ctrlPr>
-          </m:sSubSupPr>
-          <m:e>
-            <m:r>
-              <w:rPr>
-                <w:rFonts w:ascii="Cambria Math" w:eastAsiaTheme="minorEastAsia" w:hAnsi="Cambria Math"/>
-              </w:rPr>
-              <m:t>w</m:t>
-            </m:r>
-          </m:e>
-          <m:sub>
-            <m:r>
-              <w:rPr>
-                <w:rFonts w:ascii="Cambria Math" w:eastAsiaTheme="minorEastAsia" w:hAnsi="Cambria Math"/>
-              </w:rPr>
-              <m:t>ij</m:t>
-            </m:r>
-          </m:sub>
-          <m:sup>
-            <m:r>
-              <w:rPr>
-                <w:rFonts w:ascii="Cambria Math" w:eastAsiaTheme="minorEastAsia" w:hAnsi="Cambria Math"/>
-              </w:rPr>
-              <m:t>(1)</m:t>
-            </m:r>
-          </m:sup>
-        </m:sSubSup>
-        <m:r>
-          <w:rPr>
-            <w:rFonts w:ascii="Cambria Math" w:eastAsiaTheme="minorEastAsia" w:hAnsi="Cambria Math"/>
-          </w:rPr>
-          <m:t>:  Weight from input i to hidden node j</m:t>
-        </m:r>
-      </m:oMath>
-    </w:p>
-    <w:p>
-      <w:pPr>
-        <w:pStyle w:val="ListParagraph"/>
-        <w:numPr>
-          <w:ilvl w:val="0"/>
-          <w:numId w:val="4"/>
-        </w:numPr>
-        <w:rPr>
-          <w:rFonts w:eastAsiaTheme="minorEastAsia"/>
-        </w:rPr>
-      </w:pPr>
-      <m:oMath>
-        <m:sSubSup>
-          <m:sSubSupPr>
-            <m:ctrlPr>
-              <w:rPr>
-                <w:rFonts w:ascii="Cambria Math" w:eastAsiaTheme="minorEastAsia" w:hAnsi="Cambria Math"/>
-                <w:i/>
-              </w:rPr>
-            </m:ctrlPr>
-          </m:sSubSupPr>
-          <m:e>
-            <m:r>
-              <w:rPr>
-                <w:rFonts w:ascii="Cambria Math" w:eastAsiaTheme="minorEastAsia" w:hAnsi="Cambria Math"/>
-              </w:rPr>
-              <m:t>w</m:t>
-            </m:r>
-          </m:e>
-          <m:sub>
-            <m:r>
-              <w:rPr>
-                <w:rFonts w:ascii="Cambria Math" w:eastAsiaTheme="minorEastAsia" w:hAnsi="Cambria Math"/>
-              </w:rPr>
-              <m:t>j</m:t>
-            </m:r>
-          </m:sub>
-          <m:sup>
-            <m:r>
-              <w:rPr>
-                <w:rFonts w:ascii="Cambria Math" w:eastAsiaTheme="minorEastAsia" w:hAnsi="Cambria Math"/>
-              </w:rPr>
-              <m:t>(2)</m:t>
-            </m:r>
-          </m:sup>
-        </m:sSubSup>
-        <m:r>
-          <w:rPr>
-            <w:rFonts w:ascii="Cambria Math" w:eastAsiaTheme="minorEastAsia" w:hAnsi="Cambria Math"/>
-          </w:rPr>
-          <m:t>:  Weight from hidden node j to output</m:t>
-        </m:r>
-      </m:oMath>
-    </w:p>
-    <w:p>
-      <w:pPr>
-        <w:pStyle w:val="ListParagraph"/>
-        <w:numPr>
-          <w:ilvl w:val="0"/>
-          <w:numId w:val="4"/>
-        </w:numPr>
-        <w:rPr>
-          <w:rFonts w:eastAsiaTheme="minorEastAsia"/>
-        </w:rPr>
-      </w:pPr>
-      <m:oMath>
-        <m:sSubSup>
-          <m:sSubSupPr>
-            <m:ctrlPr>
-              <w:rPr>
-                <w:rFonts w:ascii="Cambria Math" w:eastAsiaTheme="minorEastAsia" w:hAnsi="Cambria Math"/>
-                <w:i/>
-              </w:rPr>
-            </m:ctrlPr>
-          </m:sSubSupPr>
-          <m:e>
-            <m:r>
-              <w:rPr>
-                <w:rFonts w:ascii="Cambria Math" w:eastAsiaTheme="minorEastAsia" w:hAnsi="Cambria Math"/>
-              </w:rPr>
-              <m:t>b</m:t>
-            </m:r>
-          </m:e>
-          <m:sub>
-            <m:r>
-              <w:rPr>
-                <w:rFonts w:ascii="Cambria Math" w:eastAsiaTheme="minorEastAsia" w:hAnsi="Cambria Math"/>
-              </w:rPr>
-              <m:t>j</m:t>
-            </m:r>
-          </m:sub>
-          <m:sup>
-            <m:d>
-              <m:dPr>
-                <m:ctrlPr>
-                  <w:rPr>
-                    <w:rFonts w:ascii="Cambria Math" w:eastAsiaTheme="minorEastAsia" w:hAnsi="Cambria Math"/>
-                    <w:i/>
-                  </w:rPr>
-                </m:ctrlPr>
-              </m:dPr>
-              <m:e>
-                <m:r>
-                  <w:rPr>
-                    <w:rFonts w:ascii="Cambria Math" w:eastAsiaTheme="minorEastAsia" w:hAnsi="Cambria Math"/>
-                  </w:rPr>
-                  <m:t>1</m:t>
-                </m:r>
-              </m:e>
-            </m:d>
-          </m:sup>
-        </m:sSubSup>
-        <m:r>
-          <w:rPr>
-            <w:rFonts w:ascii="Cambria Math" w:eastAsiaTheme="minorEastAsia" w:hAnsi="Cambria Math"/>
-          </w:rPr>
-          <m:t>:  Bias for hidden node j</m:t>
-        </m:r>
-      </m:oMath>
-    </w:p>
-    <w:p>
-      <w:pPr>
-        <w:pStyle w:val="ListParagraph"/>
-        <w:numPr>
-          <w:ilvl w:val="0"/>
-          <w:numId w:val="4"/>
-        </w:numPr>
-        <w:rPr>
-          <w:rFonts w:eastAsiaTheme="minorEastAsia"/>
-        </w:rPr>
-      </w:pPr>
-      <m:oMath>
-        <m:sSup>
-          <m:sSupPr>
-            <m:ctrlPr>
-              <w:rPr>
-                <w:rFonts w:ascii="Cambria Math" w:eastAsiaTheme="minorEastAsia" w:hAnsi="Cambria Math"/>
-                <w:i/>
-              </w:rPr>
-            </m:ctrlPr>
-          </m:sSupPr>
-          <m:e>
-            <m:r>
-              <w:rPr>
-                <w:rFonts w:ascii="Cambria Math" w:eastAsiaTheme="minorEastAsia" w:hAnsi="Cambria Math"/>
-              </w:rPr>
-              <m:t>b</m:t>
-            </m:r>
-          </m:e>
-          <m:sup>
-            <m:d>
-              <m:dPr>
-                <m:ctrlPr>
-                  <w:rPr>
-                    <w:rFonts w:ascii="Cambria Math" w:eastAsiaTheme="minorEastAsia" w:hAnsi="Cambria Math"/>
-                    <w:i/>
-                  </w:rPr>
-                </m:ctrlPr>
-              </m:dPr>
-              <m:e>
-                <m:r>
-                  <w:rPr>
-                    <w:rFonts w:ascii="Cambria Math" w:eastAsiaTheme="minorEastAsia" w:hAnsi="Cambria Math"/>
-                  </w:rPr>
-                  <m:t>2</m:t>
-                </m:r>
-              </m:e>
-            </m:d>
-          </m:sup>
-        </m:sSup>
-        <m:r>
-          <w:rPr>
-            <w:rFonts w:ascii="Cambria Math" w:eastAsiaTheme="minorEastAsia" w:hAnsi="Cambria Math"/>
-          </w:rPr>
-          <m:t>:  Bias for output node</m:t>
-        </m:r>
-      </m:oMath>
-    </w:p>
-    <w:p>
-      <w:pPr>
-        <w:pStyle w:val="ListParagraph"/>
-        <w:numPr>
-          <w:ilvl w:val="0"/>
-          <w:numId w:val="4"/>
-        </w:numPr>
-        <w:rPr>
-          <w:rFonts w:eastAsiaTheme="minorEastAsia"/>
-        </w:rPr>
-      </w:pPr>
-      <m:oMath>
-        <m:r>
-          <w:rPr>
-            <w:rFonts w:ascii="Cambria Math" w:eastAsiaTheme="minorEastAsia" w:hAnsi="Cambria Math"/>
-          </w:rPr>
-          <m:t>σ:  Activation function</m:t>
-        </m:r>
-      </m:oMath>
-    </w:p>
-    <w:p>
-      <w:pPr>
-        <w:pStyle w:val="ListParagraph"/>
-        <w:numPr>
-          <w:ilvl w:val="0"/>
-          <w:numId w:val="4"/>
-        </w:numPr>
-        <w:rPr>
-          <w:rFonts w:eastAsiaTheme="minorEastAsia"/>
-        </w:rPr>
-      </w:pPr>
-      <m:oMath>
-        <m:r>
-          <w:rPr>
-            <w:rFonts w:ascii="Cambria Math" w:eastAsiaTheme="minorEastAsia" w:hAnsi="Cambria Math"/>
-          </w:rPr>
-          <m:t>f:  Output activation function</m:t>
-        </m:r>
-      </m:oMath>
-    </w:p>
-    <w:p>
-      <w:pPr>
-        <w:pStyle w:val="ListParagraph"/>
-        <w:numPr>
-          <w:ilvl w:val="0"/>
-          <w:numId w:val="4"/>
-        </w:numPr>
-        <w:rPr>
-          <w:rFonts w:eastAsiaTheme="minorEastAsia"/>
-        </w:rPr>
-      </w:pPr>
-      <m:oMath>
-        <m:r>
-          <w:rPr>
-            <w:rFonts w:ascii="Cambria Math" w:eastAsiaTheme="minorEastAsia" w:hAnsi="Cambria Math"/>
-          </w:rPr>
-          <m:t>H:  Number of hidden units</m:t>
-        </m:r>
-      </m:oMath>
-    </w:p>
-    <w:p>
-      <w:pPr>
-        <w:pStyle w:val="ListParagraph"/>
-        <w:numPr>
-          <w:ilvl w:val="0"/>
-          <w:numId w:val="4"/>
-        </w:numPr>
-        <w:rPr>
-          <w:rFonts w:eastAsiaTheme="minorEastAsia"/>
-        </w:rPr>
-      </w:pPr>
-      <m:oMath>
-        <m:r>
-          <w:rPr>
-            <w:rFonts w:ascii="Cambria Math" w:eastAsiaTheme="minorEastAsia" w:hAnsi="Cambria Math"/>
-          </w:rPr>
-          <m:t>p:  Number of input features</m:t>
-        </m:r>
-      </m:oMath>
-    </w:p>
-    <w:p>
-      <w:pPr>
-        <w:pStyle w:val="ListParagraph"/>
-        <w:numPr>
-          <w:ilvl w:val="0"/>
-          <w:numId w:val="4"/>
-        </w:numPr>
-        <w:rPr>
-          <w:rFonts w:eastAsiaTheme="minorEastAsia"/>
-        </w:rPr>
-      </w:pPr>
-      <m:oMath>
-        <m:acc>
-          <m:accPr>
-            <m:ctrlPr>
-              <w:rPr>
-                <w:rFonts w:ascii="Cambria Math" w:eastAsiaTheme="minorEastAsia" w:hAnsi="Cambria Math"/>
-                <w:i/>
-              </w:rPr>
-            </m:ctrlPr>
-          </m:accPr>
-          <m:e>
-            <m:r>
-              <w:rPr>
-                <w:rFonts w:ascii="Cambria Math" w:eastAsiaTheme="minorEastAsia" w:hAnsi="Cambria Math"/>
-              </w:rPr>
-              <m:t>y</m:t>
-            </m:r>
-          </m:e>
-        </m:acc>
-        <m:r>
-          <w:rPr>
-            <w:rFonts w:ascii="Cambria Math" w:eastAsiaTheme="minorEastAsia" w:hAnsi="Cambria Math"/>
-          </w:rPr>
-          <m:t>:  Predicted output</m:t>
-        </m:r>
-      </m:oMath>
-    </w:p>
-    <w:p/>
-    <w:p>
-      <w:pPr>
-        <w:pStyle w:val="Heading3"/>
-      </w:pPr>
-      <w:bookmarkStart w:id="7" w:name="_Toc202629162"/>
-      <w:r>
-        <w:t>Light Gradient Boosting Machine</w:t>
-      </w:r>
-      <w:r>
-        <w:t xml:space="preserve"> (</w:t>
-      </w:r>
-      <w:proofErr w:type="spellStart"/>
-      <w:r>
-        <w:t>LightGBM</w:t>
-      </w:r>
-      <w:proofErr w:type="spellEnd"/>
-      <w:r>
-        <w:t>)</w:t>
-      </w:r>
-      <w:bookmarkEnd w:id="7"/>
-    </w:p>
-    <w:p>
-      <w:r>
-        <w:t xml:space="preserve">A high-performance gradient boosting framework that builds decision trees sequentially, with each new tree correcting the errors of its predecessors. It uses histogram-based algorithms and leaf-wise tree growth to improve speed and accuracy. </w:t>
-      </w:r>
-      <w:proofErr w:type="spellStart"/>
-      <w:r>
-        <w:t>LightGBM</w:t>
-      </w:r>
-      <w:proofErr w:type="spellEnd"/>
-      <w:r>
-        <w:t xml:space="preserve"> is well-suited for large-scale structured data and excels in both classification and regression tasks, especially when model performance is prioritized over training time.</w:t>
-      </w:r>
-      <w:r>
-        <w:t xml:space="preserve"> </w:t>
-      </w:r>
-    </w:p>
-    <w:p/>
-    <w:p>
-      <w:r>
-        <w:t>Like</w:t>
-      </w:r>
-      <w:r>
-        <w:t xml:space="preserve"> </w:t>
-      </w:r>
-      <w:r>
-        <w:t>Random Forest</w:t>
-      </w:r>
-      <w:r>
-        <w:t xml:space="preserve">, </w:t>
-      </w:r>
-      <w:proofErr w:type="spellStart"/>
-      <w:r>
-        <w:t>LightGBM</w:t>
-      </w:r>
-      <w:proofErr w:type="spellEnd"/>
-      <w:r>
-        <w:t xml:space="preserve"> </w:t>
-      </w:r>
-      <w:r>
-        <w:t>is</w:t>
-      </w:r>
-      <w:r>
-        <w:t xml:space="preserve"> not a single </w:t>
-      </w:r>
-      <w:r>
-        <w:t xml:space="preserve">close-formed </w:t>
-      </w:r>
-      <w:r>
-        <w:t>equation, but the model is built iteratively</w:t>
-      </w:r>
-      <w:r>
-        <w:t xml:space="preserve"> as </w:t>
-      </w:r>
-      <w:r>
-        <w:t xml:space="preserve">described in </w:t>
-      </w:r>
-      <w:r>
-        <w:t>the equation below:</w:t>
-      </w:r>
-    </w:p>
-    <w:p/>
     <w:p>
       <w:pPr>
         <w:rPr>
@@ -7422,19 +6731,140 @@
     <w:p/>
     <w:p>
       <w:pPr>
+        <w:pStyle w:val="Heading3"/>
+      </w:pPr>
+      <w:bookmarkStart w:id="7" w:name="_Toc203387752"/>
+      <w:r>
+        <w:t>Artificial Neural Network</w:t>
+      </w:r>
+      <w:r>
+        <w:t xml:space="preserve"> (ANN)</w:t>
+      </w:r>
+      <w:bookmarkEnd w:id="7"/>
+    </w:p>
+    <w:p>
+      <w:r>
+        <w:t xml:space="preserve">A layered computational model composed of input, hidden, and output layers, where each node simulates a neuron. During training, the network </w:t>
+      </w:r>
+      <w:r>
+        <w:t xml:space="preserve">uses an activation function and </w:t>
+      </w:r>
+      <w:r>
+        <w:t>adjusts the weights of connections between nodes to minimize prediction error. ANNs are powerful for capturing intricate patterns and nonlinear dependencies, making them suitable for tasks like image recognition, time series forecasting, and natural language processing.</w:t>
+      </w:r>
+      <w:r>
+        <w:t xml:space="preserve"> </w:t>
+      </w:r>
+    </w:p>
+    <w:p/>
+    <w:p>
+      <w:r>
+        <w:t xml:space="preserve">For a simple </w:t>
+      </w:r>
+      <w:r>
+        <w:t xml:space="preserve">neural </w:t>
+      </w:r>
+      <w:r>
+        <w:t>network with hidden layer</w:t>
+      </w:r>
+      <w:r>
+        <w:t>s</w:t>
+      </w:r>
+      <w:r>
+        <w:t xml:space="preserve">, ANN can be described as the following </w:t>
+      </w:r>
+      <w:r>
+        <w:t>diagram with 2 input layers and 1 output layer</w:t>
+      </w:r>
+      <w:r>
+        <w:t>:</w:t>
+      </w:r>
+    </w:p>
+    <w:p/>
+    <w:p>
+      <w:pPr>
+        <w:pStyle w:val="Caption"/>
+        <w:keepNext/>
+        <w:jc w:val="center"/>
+      </w:pPr>
+      <w:bookmarkStart w:id="8" w:name="_Toc203387764"/>
+      <w:r>
+        <w:t xml:space="preserve">Figure </w:t>
+      </w:r>
+      <w:fldSimple w:instr=" SEQ Figure \* ARABIC ">
+        <w:r>
+          <w:rPr>
+            <w:noProof/>
+          </w:rPr>
+          <w:t>1</w:t>
+        </w:r>
+      </w:fldSimple>
+      <w:r>
+        <w:t>: ANN Diagram</w:t>
+      </w:r>
+      <w:bookmarkEnd w:id="8"/>
+    </w:p>
+    <w:p>
+      <w:pPr>
+        <w:jc w:val="center"/>
+      </w:pPr>
+      <w:r>
+        <w:rPr>
+          <w:noProof/>
+        </w:rPr>
+        <w:drawing>
+          <wp:inline distT="0" distB="0" distL="0" distR="0" wp14:anchorId="22783B80" wp14:editId="677F43F1">
+            <wp:extent cx="3625702" cy="2984572"/>
+            <wp:effectExtent l="0" t="0" r="0" b="0"/>
+            <wp:docPr id="65782022" name="Picture 1"/>
+            <wp:cNvGraphicFramePr>
+              <a:graphicFrameLocks xmlns:a="http://schemas.openxmlformats.org/drawingml/2006/main" noChangeAspect="1"/>
+            </wp:cNvGraphicFramePr>
+            <a:graphic xmlns:a="http://schemas.openxmlformats.org/drawingml/2006/main">
+              <a:graphicData uri="http://schemas.openxmlformats.org/drawingml/2006/picture">
+                <pic:pic xmlns:pic="http://schemas.openxmlformats.org/drawingml/2006/picture">
+                  <pic:nvPicPr>
+                    <pic:cNvPr id="65782022" name=""/>
+                    <pic:cNvPicPr/>
+                  </pic:nvPicPr>
+                  <pic:blipFill>
+                    <a:blip r:embed="rId13"/>
+                    <a:stretch>
+                      <a:fillRect/>
+                    </a:stretch>
+                  </pic:blipFill>
+                  <pic:spPr>
+                    <a:xfrm>
+                      <a:off x="0" y="0"/>
+                      <a:ext cx="3666114" cy="3017838"/>
+                    </a:xfrm>
+                    <a:prstGeom prst="rect">
+                      <a:avLst/>
+                    </a:prstGeom>
+                  </pic:spPr>
+                </pic:pic>
+              </a:graphicData>
+            </a:graphic>
+          </wp:inline>
+        </w:drawing>
+      </w:r>
+    </w:p>
+    <w:p/>
+    <w:p>
+      <w:pPr>
         <w:pStyle w:val="Heading1"/>
         <w:rPr>
           <w:rFonts w:eastAsiaTheme="minorEastAsia"/>
         </w:rPr>
       </w:pPr>
-      <w:bookmarkStart w:id="8" w:name="_Toc202629163"/>
+      <w:bookmarkStart w:id="9" w:name="_Toc203387753"/>
       <w:r>
         <w:rPr>
           <w:rFonts w:eastAsiaTheme="minorEastAsia"/>
         </w:rPr>
         <w:t>Exploratory Data Analysis</w:t>
       </w:r>
-      <w:bookmarkEnd w:id="8"/>
+      <w:bookmarkEnd w:id="9"/>
     </w:p>
     <w:p>
       <w:r>
@@ -7494,9 +6924,8 @@
         <w:keepNext/>
         <w:jc w:val="center"/>
       </w:pPr>
-      <w:bookmarkStart w:id="9" w:name="_Toc202387381"/>
-      <w:r>
-        <w:lastRenderedPageBreak/>
+      <w:bookmarkStart w:id="10" w:name="_Toc203387769"/>
+      <w:r>
         <w:t xml:space="preserve">Table </w:t>
       </w:r>
       <w:fldSimple w:instr=" SEQ Table \* ARABIC ">
@@ -7510,7 +6939,7 @@
       <w:r>
         <w:t>: Schema for Finalized Data</w:t>
       </w:r>
-      <w:bookmarkEnd w:id="9"/>
+      <w:bookmarkEnd w:id="10"/>
     </w:p>
     <w:tbl>
       <w:tblPr>
@@ -9048,14 +8477,14 @@
       <w:pPr>
         <w:pStyle w:val="Heading2"/>
       </w:pPr>
-      <w:bookmarkStart w:id="10" w:name="_Toc202629164"/>
+      <w:bookmarkStart w:id="11" w:name="_Toc203387754"/>
       <w:r>
         <w:t>Land Use</w:t>
       </w:r>
       <w:r>
         <w:t xml:space="preserve"> Group</w:t>
       </w:r>
-      <w:bookmarkEnd w:id="10"/>
+      <w:bookmarkEnd w:id="11"/>
     </w:p>
     <w:p>
       <w:proofErr w:type="gramStart"/>
@@ -9134,7 +8563,7 @@
         <w:keepNext/>
         <w:jc w:val="center"/>
       </w:pPr>
-      <w:bookmarkStart w:id="11" w:name="_Toc202387382"/>
+      <w:bookmarkStart w:id="12" w:name="_Toc203387770"/>
       <w:r>
         <w:t xml:space="preserve">Table </w:t>
       </w:r>
@@ -9149,7 +8578,7 @@
       <w:r>
         <w:t>: Land Use Breakdown for Raw Data</w:t>
       </w:r>
-      <w:bookmarkEnd w:id="11"/>
+      <w:bookmarkEnd w:id="12"/>
     </w:p>
     <w:tbl>
       <w:tblPr>
@@ -9990,12 +9419,11 @@
       <w:pPr>
         <w:pStyle w:val="Heading2"/>
       </w:pPr>
-      <w:bookmarkStart w:id="12" w:name="_Toc202629165"/>
-      <w:r>
-        <w:lastRenderedPageBreak/>
+      <w:bookmarkStart w:id="13" w:name="_Toc203387755"/>
+      <w:r>
         <w:t>Time Frame</w:t>
       </w:r>
-      <w:bookmarkEnd w:id="12"/>
+      <w:bookmarkEnd w:id="13"/>
     </w:p>
     <w:p>
       <w:r>
@@ -10044,7 +9472,7 @@
         <w:keepNext/>
         <w:jc w:val="center"/>
       </w:pPr>
-      <w:bookmarkStart w:id="13" w:name="_Toc202387375"/>
+      <w:bookmarkStart w:id="14" w:name="_Toc203387765"/>
       <w:r>
         <w:t xml:space="preserve">Figure </w:t>
       </w:r>
@@ -10053,13 +9481,13 @@
           <w:rPr>
             <w:noProof/>
           </w:rPr>
-          <w:t>1</w:t>
+          <w:t>2</w:t>
         </w:r>
       </w:fldSimple>
       <w:r>
         <w:t>: Sales Distribution for Raw Data</w:t>
       </w:r>
-      <w:bookmarkEnd w:id="13"/>
+      <w:bookmarkEnd w:id="14"/>
     </w:p>
     <w:p>
       <w:pPr>
@@ -10251,7 +9679,7 @@
                     </pic:cNvPicPr>
                   </pic:nvPicPr>
                   <pic:blipFill>
-                    <a:blip r:embed="rId13">
+                    <a:blip r:embed="rId14">
                       <a:extLst>
                         <a:ext uri="{28A0092B-C50C-407E-A947-70E740481C1C}">
                           <a14:useLocalDpi xmlns:a14="http://schemas.microsoft.com/office/drawing/2010/main" val="0"/>
@@ -10283,11 +9711,11 @@
       <w:pPr>
         <w:pStyle w:val="Heading2"/>
       </w:pPr>
-      <w:bookmarkStart w:id="14" w:name="_Toc202629166"/>
+      <w:bookmarkStart w:id="15" w:name="_Toc203387756"/>
       <w:r>
         <w:t>Outliers</w:t>
       </w:r>
-      <w:bookmarkEnd w:id="14"/>
+      <w:bookmarkEnd w:id="15"/>
     </w:p>
     <w:p>
       <w:r>
@@ -10372,7 +9800,16 @@
         <w:t xml:space="preserve"> are easier to isolate because they require fewer random splits to be separated from the rest of the data.</w:t>
       </w:r>
       <w:r>
-        <w:t xml:space="preserve"> The scoring for an Isolation Forest can be described as below.</w:t>
+        <w:t xml:space="preserve"> </w:t>
+      </w:r>
+    </w:p>
+    <w:p/>
+    <w:p>
+      <w:r>
+        <w:t>The scoring for an Isolation Forest can be described as below</w:t>
+      </w:r>
+      <w:r>
+        <w:t>:</w:t>
       </w:r>
     </w:p>
     <w:p/>
@@ -10388,6 +9825,7 @@
             <w:rPr>
               <w:rFonts w:ascii="Cambria Math" w:hAnsi="Cambria Math"/>
             </w:rPr>
+            <w:lastRenderedPageBreak/>
             <m:t>s</m:t>
           </m:r>
           <m:d>
@@ -10612,7 +10050,6 @@
           <w:rPr>
             <w:rFonts w:ascii="Cambria Math" w:eastAsiaTheme="minorEastAsia" w:hAnsi="Cambria Math"/>
           </w:rPr>
-          <w:lastRenderedPageBreak/>
           <m:t>s</m:t>
         </m:r>
         <m:d>
@@ -10930,7 +10367,7 @@
         <w:keepNext/>
         <w:jc w:val="center"/>
       </w:pPr>
-      <w:bookmarkStart w:id="15" w:name="_Toc202387376"/>
+      <w:bookmarkStart w:id="16" w:name="_Toc203387766"/>
       <w:r>
         <w:t xml:space="preserve">Figure </w:t>
       </w:r>
@@ -10939,13 +10376,13 @@
           <w:rPr>
             <w:noProof/>
           </w:rPr>
-          <w:t>2</w:t>
+          <w:t>3</w:t>
         </w:r>
       </w:fldSimple>
       <w:r>
         <w:t>: Outlier Removal</w:t>
       </w:r>
-      <w:bookmarkEnd w:id="15"/>
+      <w:bookmarkEnd w:id="16"/>
     </w:p>
     <w:p>
       <w:pPr>
@@ -10956,9 +10393,9 @@
           <w:noProof/>
         </w:rPr>
         <w:drawing>
-          <wp:inline distT="0" distB="0" distL="0" distR="0" wp14:anchorId="0D2CA992" wp14:editId="10E1E42E">
-            <wp:extent cx="4223058" cy="5931263"/>
-            <wp:effectExtent l="0" t="0" r="6350" b="0"/>
+          <wp:inline distT="0" distB="0" distL="0" distR="0" wp14:anchorId="0D2CA992" wp14:editId="07711CB7">
+            <wp:extent cx="3838354" cy="5390948"/>
+            <wp:effectExtent l="0" t="0" r="0" b="0"/>
             <wp:docPr id="1168948013" name="Picture 7" descr="A screenshot of a graph&#10;&#10;AI-generated content may be incorrect.">
               <a:extLst xmlns:a="http://schemas.openxmlformats.org/drawingml/2006/main">
                 <a:ext uri="{FF2B5EF4-FFF2-40B4-BE49-F238E27FC236}">
@@ -10985,7 +10422,7 @@
                     </pic:cNvPicPr>
                   </pic:nvPicPr>
                   <pic:blipFill>
-                    <a:blip r:embed="rId14">
+                    <a:blip r:embed="rId15" cstate="print">
                       <a:extLst>
                         <a:ext uri="{28A0092B-C50C-407E-A947-70E740481C1C}">
                           <a14:useLocalDpi xmlns:a14="http://schemas.microsoft.com/office/drawing/2010/main" val="0"/>
@@ -10998,7 +10435,7 @@
                   <pic:spPr>
                     <a:xfrm>
                       <a:off x="0" y="0"/>
-                      <a:ext cx="4238341" cy="5952728"/>
+                      <a:ext cx="4021325" cy="5647929"/>
                     </a:xfrm>
                     <a:prstGeom prst="rect">
                       <a:avLst/>
@@ -11118,11 +10555,11 @@
           <w:rFonts w:eastAsiaTheme="minorHAnsi"/>
         </w:rPr>
       </w:pPr>
-      <w:bookmarkStart w:id="16" w:name="_Toc202629167"/>
+      <w:bookmarkStart w:id="17" w:name="_Toc203387757"/>
       <w:r>
         <w:t>Multicollinearity</w:t>
       </w:r>
-      <w:bookmarkEnd w:id="16"/>
+      <w:bookmarkEnd w:id="17"/>
     </w:p>
     <w:p>
       <w:r>
@@ -11199,7 +10636,7 @@
         <w:keepNext/>
         <w:jc w:val="center"/>
       </w:pPr>
-      <w:bookmarkStart w:id="17" w:name="_Toc202387377"/>
+      <w:bookmarkStart w:id="18" w:name="_Toc203387767"/>
       <w:r>
         <w:t xml:space="preserve">Figure </w:t>
       </w:r>
@@ -11208,13 +10645,13 @@
           <w:rPr>
             <w:noProof/>
           </w:rPr>
-          <w:t>3</w:t>
+          <w:t>4</w:t>
         </w:r>
       </w:fldSimple>
       <w:r>
         <w:t>: Correlation Plot</w:t>
       </w:r>
-      <w:bookmarkEnd w:id="17"/>
+      <w:bookmarkEnd w:id="18"/>
     </w:p>
     <w:p>
       <w:pPr>
@@ -11254,7 +10691,7 @@
                     </pic:cNvPicPr>
                   </pic:nvPicPr>
                   <pic:blipFill>
-                    <a:blip r:embed="rId15">
+                    <a:blip r:embed="rId16">
                       <a:extLst>
                         <a:ext uri="{28A0092B-C50C-407E-A947-70E740481C1C}">
                           <a14:useLocalDpi xmlns:a14="http://schemas.microsoft.com/office/drawing/2010/main" val="0"/>
@@ -11323,7 +10760,7 @@
         <w:keepNext/>
         <w:jc w:val="center"/>
       </w:pPr>
-      <w:bookmarkStart w:id="18" w:name="_Toc202387383"/>
+      <w:bookmarkStart w:id="19" w:name="_Toc203387771"/>
       <w:r>
         <w:lastRenderedPageBreak/>
         <w:t xml:space="preserve">Table </w:t>
@@ -11345,7 +10782,7 @@
       <w:r>
         <w:t xml:space="preserve"> Results</w:t>
       </w:r>
-      <w:bookmarkEnd w:id="18"/>
+      <w:bookmarkEnd w:id="19"/>
     </w:p>
     <w:tbl>
       <w:tblPr>
@@ -12109,11 +11546,11 @@
       <w:pPr>
         <w:pStyle w:val="Heading2"/>
       </w:pPr>
-      <w:bookmarkStart w:id="19" w:name="_Toc202629168"/>
+      <w:bookmarkStart w:id="20" w:name="_Toc203387758"/>
       <w:r>
         <w:t>Transformation</w:t>
       </w:r>
-      <w:bookmarkEnd w:id="19"/>
+      <w:bookmarkEnd w:id="20"/>
     </w:p>
     <w:p>
       <w:r>
@@ -12428,7 +11865,7 @@
         <w:keepNext/>
         <w:jc w:val="center"/>
       </w:pPr>
-      <w:bookmarkStart w:id="20" w:name="_Toc202387378"/>
+      <w:bookmarkStart w:id="21" w:name="_Toc203387768"/>
       <w:r>
         <w:lastRenderedPageBreak/>
         <w:t xml:space="preserve">Figure </w:t>
@@ -12438,13 +11875,13 @@
           <w:rPr>
             <w:noProof/>
           </w:rPr>
-          <w:t>4</w:t>
+          <w:t>5</w:t>
         </w:r>
       </w:fldSimple>
       <w:r>
         <w:t>: Box-Cox Transformation</w:t>
       </w:r>
-      <w:bookmarkEnd w:id="20"/>
+      <w:bookmarkEnd w:id="21"/>
     </w:p>
     <w:p>
       <w:pPr>
@@ -12470,7 +11907,7 @@
                     <pic:cNvPicPr/>
                   </pic:nvPicPr>
                   <pic:blipFill>
-                    <a:blip r:embed="rId16">
+                    <a:blip r:embed="rId17">
                       <a:extLst>
                         <a:ext uri="{28A0092B-C50C-407E-A947-70E740481C1C}">
                           <a14:useLocalDpi xmlns:a14="http://schemas.microsoft.com/office/drawing/2010/main" val="0"/>
@@ -12504,24 +11941,24 @@
           <w:rFonts w:eastAsia="Times New Roman"/>
         </w:rPr>
       </w:pPr>
-      <w:bookmarkStart w:id="21" w:name="_Toc202629169"/>
+      <w:bookmarkStart w:id="22" w:name="_Toc203387759"/>
       <w:r>
         <w:rPr>
           <w:rFonts w:eastAsia="Times New Roman"/>
         </w:rPr>
         <w:t>Analysis</w:t>
       </w:r>
-      <w:bookmarkEnd w:id="21"/>
+      <w:bookmarkEnd w:id="22"/>
     </w:p>
     <w:p>
       <w:pPr>
         <w:pStyle w:val="Heading2"/>
       </w:pPr>
-      <w:bookmarkStart w:id="22" w:name="_Toc202629170"/>
+      <w:bookmarkStart w:id="23" w:name="_Toc203387760"/>
       <w:r>
         <w:t>Training</w:t>
       </w:r>
-      <w:bookmarkEnd w:id="22"/>
+      <w:bookmarkEnd w:id="23"/>
     </w:p>
     <w:p>
       <w:r>
@@ -12587,7 +12024,7 @@
         <w:keepNext/>
         <w:jc w:val="center"/>
       </w:pPr>
-      <w:bookmarkStart w:id="23" w:name="_Toc202387384"/>
+      <w:bookmarkStart w:id="24" w:name="_Toc203387772"/>
       <w:r>
         <w:lastRenderedPageBreak/>
         <w:t xml:space="preserve">Table </w:t>
@@ -12603,7 +12040,7 @@
       <w:r>
         <w:t>: Parameter Grid</w:t>
       </w:r>
-      <w:bookmarkEnd w:id="23"/>
+      <w:bookmarkEnd w:id="24"/>
     </w:p>
     <w:tbl>
       <w:tblPr>
@@ -13589,11 +13026,11 @@
       <w:pPr>
         <w:pStyle w:val="Heading2"/>
       </w:pPr>
-      <w:bookmarkStart w:id="24" w:name="_Toc202629171"/>
+      <w:bookmarkStart w:id="25" w:name="_Toc203387761"/>
       <w:r>
         <w:t>Results</w:t>
       </w:r>
-      <w:bookmarkEnd w:id="24"/>
+      <w:bookmarkEnd w:id="25"/>
     </w:p>
     <w:p>
       <w:r>
@@ -13645,10 +13082,7 @@
         <w:t xml:space="preserve"> </w:t>
       </w:r>
       <w:r>
-        <w:t>The transformed RMSE reflects how well the model learned from a normalized distribution while the original scale RMSE reflects the error in real monetary terms for practical interpretation.</w:t>
-      </w:r>
-      <w:r>
-        <w:t xml:space="preserve"> </w:t>
+        <w:t xml:space="preserve">The transformed RMSE reflects how well the model learned from a normalized distribution while the original scale RMSE reflects the error in real monetary terms for practical interpretation. </w:t>
       </w:r>
       <w:r>
         <w:t xml:space="preserve">Reporting RMSE on both the transformed and original scale provides a more complete picture of model performance and provides both statistically validity and stakeholder relevance. </w:t>
@@ -13664,7 +13098,7 @@
         <w:keepNext/>
         <w:jc w:val="center"/>
       </w:pPr>
-      <w:bookmarkStart w:id="25" w:name="_Toc202387385"/>
+      <w:bookmarkStart w:id="26" w:name="_Toc203387773"/>
       <w:r>
         <w:t xml:space="preserve">Table </w:t>
       </w:r>
@@ -13685,7 +13119,7 @@
       <w:r>
         <w:t xml:space="preserve"> Results</w:t>
       </w:r>
-      <w:bookmarkEnd w:id="25"/>
+      <w:bookmarkEnd w:id="26"/>
     </w:p>
     <w:tbl>
       <w:tblPr>
@@ -14378,12 +13812,12 @@
       <w:pPr>
         <w:pStyle w:val="Heading1"/>
       </w:pPr>
-      <w:bookmarkStart w:id="26" w:name="_Toc202629172"/>
+      <w:bookmarkStart w:id="27" w:name="_Toc203387762"/>
       <w:r>
         <w:lastRenderedPageBreak/>
         <w:t>Conclusion</w:t>
       </w:r>
-      <w:bookmarkEnd w:id="26"/>
+      <w:bookmarkEnd w:id="27"/>
     </w:p>
     <w:p>
       <w:r>
@@ -14393,7 +13827,19 @@
         <w:t>project</w:t>
       </w:r>
       <w:r>
-        <w:t xml:space="preserve"> aimed to develop an accurate model to predict property sale values in Hillsborough County, Florida, with the goal of supporting post-disaster damage assessments. This analysis involved a complete pipeline from extracting and cleaning property appraiser and historical sales data to </w:t>
+        <w:t xml:space="preserve"> aimed to develop an accurate model to predict </w:t>
+      </w:r>
+      <w:r>
+        <w:t xml:space="preserve">single-family and multi-family </w:t>
+      </w:r>
+      <w:r>
+        <w:t>property sale values in Hillsborough County, Florida</w:t>
+      </w:r>
+      <w:r>
+        <w:t xml:space="preserve"> from 2014-2024</w:t>
+      </w:r>
+      <w:r>
+        <w:t xml:space="preserve">, with the goal of supporting post-disaster damage assessments. This analysis involved a complete pipeline from extracting and cleaning property appraiser and historical sales data to </w:t>
       </w:r>
       <w:r>
         <w:t xml:space="preserve">feature </w:t>
@@ -14426,19 +13872,43 @@
         <w:t>which</w:t>
       </w:r>
       <w:r>
-        <w:t xml:space="preserve"> can result in data entry errors as well as missing values represented by</w:t>
-      </w:r>
-      <w:r>
-        <w:t xml:space="preserve"> placeholder</w:t>
-      </w:r>
-      <w:r>
-        <w:t xml:space="preserve"> sentinel values.</w:t>
+        <w:t xml:space="preserve"> can result in data entry errors as well as missing </w:t>
+      </w:r>
+      <w:r>
+        <w:t>data points</w:t>
+      </w:r>
+      <w:r>
+        <w:t xml:space="preserve"> represented by</w:t>
       </w:r>
       <w:r>
         <w:t xml:space="preserve"> </w:t>
       </w:r>
       <w:r>
-        <w:t xml:space="preserve">In this study, outlier detection was addressed using </w:t>
+        <w:t>sentinel values</w:t>
+      </w:r>
+      <w:r>
+        <w:t xml:space="preserve"> as placeholders and extreme low values </w:t>
+      </w:r>
+      <w:r>
+        <w:t>during</w:t>
+      </w:r>
+      <w:r>
+        <w:t xml:space="preserve"> changes in property ownership within the same family</w:t>
+      </w:r>
+      <w:r>
+        <w:t>.</w:t>
+      </w:r>
+      <w:r>
+        <w:t xml:space="preserve"> </w:t>
+      </w:r>
+      <w:r>
+        <w:t xml:space="preserve">In this study, outlier detection was </w:t>
+      </w:r>
+      <w:r>
+        <w:t>accomplished</w:t>
+      </w:r>
+      <w:r>
+        <w:t xml:space="preserve"> using </w:t>
       </w:r>
       <w:r>
         <w:t xml:space="preserve">a </w:t>
@@ -14453,7 +13923,13 @@
         <w:t>$</w:t>
       </w:r>
       <w:r>
-        <w:t xml:space="preserve">50,000 and </w:t>
+        <w:t>50,000 and</w:t>
+      </w:r>
+      <w:r>
+        <w:t xml:space="preserve"> an</w:t>
+      </w:r>
+      <w:r>
+        <w:t xml:space="preserve"> </w:t>
       </w:r>
       <w:r>
         <w:t xml:space="preserve">Isolation Forest, which helped identify and remove anomalous </w:t>
@@ -14462,7 +13938,13 @@
         <w:t xml:space="preserve">placeholder </w:t>
       </w:r>
       <w:r>
-        <w:t>records based on multivariate patterns. By cleaning the data of such inconsistencies, the models were better able to generalize and produce meaningful results.</w:t>
+        <w:t xml:space="preserve">records </w:t>
+      </w:r>
+      <w:r>
+        <w:t>by recursively isolating and splitting the data</w:t>
+      </w:r>
+      <w:r>
+        <w:t>. By cleaning the data of such inconsistencies, the models were better able to generalize and produce meaningful results.</w:t>
       </w:r>
     </w:p>
     <w:p/>
@@ -14539,7 +14021,13 @@
         <w:t xml:space="preserve"> </w:t>
       </w:r>
       <w:r>
-        <w:t xml:space="preserve">outperformed others in terms of RMSE when evaluated on the holdout testing subset. While simpler models such as </w:t>
+        <w:t xml:space="preserve">outperformed others in terms of RMSE when evaluated on the holdout testing subset. While </w:t>
+      </w:r>
+      <w:r>
+        <w:t>simple baseline</w:t>
+      </w:r>
+      <w:r>
+        <w:t xml:space="preserve"> models such as </w:t>
       </w:r>
       <w:r>
         <w:t>Linear Regression</w:t>
@@ -14551,7 +14039,13 @@
         <w:t>nterpretability</w:t>
       </w:r>
       <w:r>
-        <w:t>, boosting and bagging models better captured the complex and non-linear relationships in the data.</w:t>
+        <w:t xml:space="preserve">, boosting and bagging models better captured the complex and non-linear relationships </w:t>
+      </w:r>
+      <w:r>
+        <w:t xml:space="preserve">shown </w:t>
+      </w:r>
+      <w:r>
+        <w:t>in the data.</w:t>
       </w:r>
     </w:p>
     <w:p/>
@@ -14590,7 +14084,10 @@
         <w:t xml:space="preserve"> </w:t>
       </w:r>
       <w:r>
-        <w:t>or renovation status.</w:t>
+        <w:t>or renovation status</w:t>
+      </w:r>
+      <w:r>
+        <w:t>, and properties of similar size and amenities can vary significantly in value.</w:t>
       </w:r>
     </w:p>
     <w:p>
@@ -14857,7 +14354,7 @@
     <w:p>
       <w:pPr>
         <w:sectPr>
-          <w:footerReference w:type="default" r:id="rId17"/>
+          <w:footerReference w:type="default" r:id="rId18"/>
           <w:pgSz w:w="12240" w:h="15840"/>
           <w:pgMar w:top="1440" w:right="1440" w:bottom="1440" w:left="1440" w:header="720" w:footer="720" w:gutter="0"/>
           <w:pgNumType w:start="1"/>
@@ -14876,7 +14373,7 @@
         <w:ind w:left="432"/>
         <w:jc w:val="center"/>
         <w:sectPr>
-          <w:footerReference w:type="default" r:id="rId18"/>
+          <w:footerReference w:type="default" r:id="rId19"/>
           <w:pgSz w:w="12240" w:h="15840"/>
           <w:pgMar w:top="1440" w:right="1440" w:bottom="1440" w:left="1440" w:header="720" w:footer="720" w:gutter="0"/>
           <w:cols w:space="720"/>
@@ -14884,9 +14381,9 @@
           <w:docGrid w:linePitch="360"/>
         </w:sectPr>
       </w:pPr>
-      <w:bookmarkStart w:id="27" w:name="_Appendix_A:_Analytical"/>
-      <w:bookmarkStart w:id="28" w:name="_Toc202629173"/>
-      <w:bookmarkEnd w:id="27"/>
+      <w:bookmarkStart w:id="28" w:name="_Appendix_A:_Analytical"/>
+      <w:bookmarkStart w:id="29" w:name="_Toc203387763"/>
+      <w:bookmarkEnd w:id="28"/>
       <w:r>
         <w:lastRenderedPageBreak/>
         <w:t>Appendix A</w:t>
@@ -14900,7 +14397,7 @@
       <w:r>
         <w:t>Analytical Flowchart</w:t>
       </w:r>
-      <w:bookmarkEnd w:id="28"/>
+      <w:bookmarkEnd w:id="29"/>
     </w:p>
     <w:p>
       <w:r>
@@ -14924,7 +14421,7 @@
                     <pic:cNvPicPr/>
                   </pic:nvPicPr>
                   <pic:blipFill>
-                    <a:blip r:embed="rId19">
+                    <a:blip r:embed="rId20">
                       <a:extLst>
                         <a:ext uri="{28A0092B-C50C-407E-A947-70E740481C1C}">
                           <a14:useLocalDpi xmlns:a14="http://schemas.microsoft.com/office/drawing/2010/main" val="0"/>
@@ -14955,7 +14452,7 @@
       </w:r>
     </w:p>
     <w:sectPr>
-      <w:footerReference w:type="default" r:id="rId20"/>
+      <w:footerReference w:type="default" r:id="rId21"/>
       <w:pgSz w:w="15840" w:h="12240" w:orient="landscape"/>
       <w:pgMar w:top="720" w:right="720" w:bottom="720" w:left="720" w:header="720" w:footer="720" w:gutter="0"/>
       <w:cols w:space="720"/>
@@ -17522,7 +17019,6 @@
   <w:style w:type="character" w:default="1" w:styleId="DefaultParagraphFont">
     <w:name w:val="Default Paragraph Font"/>
     <w:uiPriority w:val="1"/>
-    <w:semiHidden/>
     <w:unhideWhenUsed/>
   </w:style>
   <w:style w:type="table" w:default="1" w:styleId="TableNormal">

</xml_diff>